<commit_message>
Rivede le check list come verbale di presa in carico
- Separa le parti presenti in 'Concedente (L.E.N.A. - Università di Pavia)'
  e 'Concessionario (ITEL S.r.l.)' con tabelle dedicate in prima pagina
- Aggiunge premessa formale di valore verbale
- Sposta la raccolta delle firme a fine documento, dopo la verifica
- Inserisce sezione 'Note e relazioni' (area compilabile) prima delle firme
- Tabella firme con colonna 'Parte' (Concedente/Concessionario), data e firma
- Mantiene font (Bodoni MT), stili e impaginazione A4 uniformi nei 4 documenti
</commit_message>
<xml_diff>
--- a/Check_List_PAVIA_LENA/Check_List_PAVIA_LENA_2026_06_09_EDILE.docx
+++ b/Check_List_PAVIA_LENA/Check_List_PAVIA_LENA_2026_06_09_EDILE.docx
@@ -73,8 +73,28 @@
     </w:p>
     <w:p>
       <w:pPr>
-        <w:rPr>
-          <w:rFonts w:ascii="Bodoni MT" w:hAnsi="Bodoni MT"/>
+        <w:jc w:val="both"/>
+        <w:rPr>
+          <w:rFonts w:ascii="Bodoni MT" w:hAnsi="Bodoni MT"/>
+          <w:sz w:val="22"/>
+          <w:szCs w:val="22"/>
+        </w:rPr>
+      </w:pPr>
+      <w:r>
+        <w:rPr>
+          <w:rFonts w:ascii="Bodoni MT" w:hAnsi="Bodoni MT"/>
+          <w:sz w:val="22"/>
+          <w:szCs w:val="22"/>
+        </w:rPr>
+        <w:t xml:space="preserve">Il presente verbale documenta le attività di verifica documentale e dello stato dei luoghi e degli impianti effettuate ai fini della presa in carico da parte del Concessionario. Le parti di seguito indicate danno atto della propria presenza alle operazioni di verifica. Le note, le osservazioni e le eventuali relazioni sono riportate nell’apposita sezione e il documento è sottoscritto dalle parti al termine della verifica.</w:t>
+      </w:r>
+    </w:p>
+    <w:p>
+      <w:pPr>
+        <w:rPr>
+          <w:rFonts w:ascii="Bodoni MT" w:hAnsi="Bodoni MT"/>
+          <w:sz w:val="12"/>
+          <w:szCs w:val="12"/>
         </w:rPr>
       </w:pPr>
     </w:p>
@@ -97,13 +117,16 @@
           <w:sz w:val="24"/>
           <w:szCs w:val="24"/>
         </w:rPr>
-        <w:t xml:space="preserve">PERSONE PRESENTI</w:t>
+        <w:t xml:space="preserve">PARTI PRESENTI</w:t>
       </w:r>
     </w:p>
     <w:p>
       <w:pPr>
-        <w:rPr>
-          <w:rFonts w:ascii="Bodoni MT" w:hAnsi="Bodoni MT"/>
+        <w:spacing w:before="80"/>
+        <w:rPr>
+          <w:rFonts w:ascii="Bodoni MT" w:hAnsi="Bodoni MT"/>
+          <w:b/>
+          <w:bCs/>
           <w:sz w:val="22"/>
           <w:szCs w:val="22"/>
         </w:rPr>
@@ -111,10 +134,12 @@
       <w:r>
         <w:rPr>
           <w:rFonts w:ascii="Bodoni MT" w:hAnsi="Bodoni MT"/>
+          <w:b/>
+          <w:bCs/>
           <w:sz w:val="22"/>
           <w:szCs w:val="22"/>
         </w:rPr>
-        <w:t xml:space="preserve">Elenco delle persone presenti al sopralluogo / presa in carico:</w:t>
+        <w:t xml:space="preserve">Concedente — L.E.N.A., Università degli Studi di Pavia</w:t>
       </w:r>
     </w:p>
     <w:tbl>
@@ -125,15 +150,17 @@
         <w:tblLook w:val="04A0" w:firstRow="1" w:lastRow="0" w:firstColumn="1" w:lastColumn="0" w:noHBand="0" w:noVBand="1"/>
       </w:tblPr>
       <w:tblGrid>
-        <w:gridCol w:w="2700"/>
-        <w:gridCol w:w="2300"/>
-        <w:gridCol w:w="2200"/>
-        <w:gridCol w:w="2434"/>
+        <w:gridCol w:w="3400"/>
+        <w:gridCol w:w="3000"/>
+        <w:gridCol w:w="3234"/>
       </w:tblGrid>
       <w:tr>
-        <w:tc>
-          <w:tcPr>
-            <w:tcW w:w="2700" w:type="dxa"/>
+        <w:trPr>
+          <w:tblHeader/>
+        </w:trPr>
+        <w:tc>
+          <w:tcPr>
+            <w:tcW w:w="3400" w:type="dxa"/>
             <w:shd w:val="clear" w:color="auto" w:fill="D9D9D9"/>
             <w:vAlign w:val="center"/>
           </w:tcPr>
@@ -157,7 +184,7 @@
         </w:tc>
         <w:tc>
           <w:tcPr>
-            <w:tcW w:w="2300" w:type="dxa"/>
+            <w:tcW w:w="3000" w:type="dxa"/>
             <w:shd w:val="clear" w:color="auto" w:fill="D9D9D9"/>
             <w:vAlign w:val="center"/>
           </w:tcPr>
@@ -181,31 +208,7 @@
         </w:tc>
         <w:tc>
           <w:tcPr>
-            <w:tcW w:w="2200" w:type="dxa"/>
-            <w:shd w:val="clear" w:color="auto" w:fill="D9D9D9"/>
-            <w:vAlign w:val="center"/>
-          </w:tcPr>
-          <w:p>
-            <w:pPr>
-              <w:rPr>
-                <w:rFonts w:ascii="Bodoni MT" w:hAnsi="Bodoni MT"/>
-                <w:b/>
-                <w:bCs/>
-              </w:rPr>
-            </w:pPr>
-            <w:r>
-              <w:rPr>
-                <w:rFonts w:ascii="Bodoni MT" w:hAnsi="Bodoni MT"/>
-                <w:b/>
-                <w:bCs/>
-              </w:rPr>
-              <w:t xml:space="preserve">Azienda / Ente</w:t>
-            </w:r>
-          </w:p>
-        </w:tc>
-        <w:tc>
-          <w:tcPr>
-            <w:tcW w:w="2434" w:type="dxa"/>
+            <w:tcW w:w="3234" w:type="dxa"/>
             <w:shd w:val="clear" w:color="auto" w:fill="D9D9D9"/>
             <w:vAlign w:val="center"/>
           </w:tcPr>
@@ -234,46 +237,33 @@
         </w:trPr>
         <w:tc>
           <w:tcPr>
-            <w:tcW w:w="2700" w:type="dxa"/>
-            <w:vAlign w:val="center"/>
-          </w:tcPr>
-          <w:p>
-            <w:pPr>
-              <w:rPr>
-                <w:rFonts w:ascii="Bodoni MT" w:hAnsi="Bodoni MT"/>
-              </w:rPr>
-            </w:pPr>
-          </w:p>
-        </w:tc>
-        <w:tc>
-          <w:tcPr>
-            <w:tcW w:w="2300" w:type="dxa"/>
-            <w:vAlign w:val="center"/>
-          </w:tcPr>
-          <w:p>
-            <w:pPr>
-              <w:rPr>
-                <w:rFonts w:ascii="Bodoni MT" w:hAnsi="Bodoni MT"/>
-              </w:rPr>
-            </w:pPr>
-          </w:p>
-        </w:tc>
-        <w:tc>
-          <w:tcPr>
-            <w:tcW w:w="2200" w:type="dxa"/>
-            <w:vAlign w:val="center"/>
-          </w:tcPr>
-          <w:p>
-            <w:pPr>
-              <w:rPr>
-                <w:rFonts w:ascii="Bodoni MT" w:hAnsi="Bodoni MT"/>
-              </w:rPr>
-            </w:pPr>
-          </w:p>
-        </w:tc>
-        <w:tc>
-          <w:tcPr>
-            <w:tcW w:w="2434" w:type="dxa"/>
+            <w:tcW w:w="3400" w:type="dxa"/>
+            <w:vAlign w:val="center"/>
+          </w:tcPr>
+          <w:p>
+            <w:pPr>
+              <w:rPr>
+                <w:rFonts w:ascii="Bodoni MT" w:hAnsi="Bodoni MT"/>
+              </w:rPr>
+            </w:pPr>
+          </w:p>
+        </w:tc>
+        <w:tc>
+          <w:tcPr>
+            <w:tcW w:w="3000" w:type="dxa"/>
+            <w:vAlign w:val="center"/>
+          </w:tcPr>
+          <w:p>
+            <w:pPr>
+              <w:rPr>
+                <w:rFonts w:ascii="Bodoni MT" w:hAnsi="Bodoni MT"/>
+              </w:rPr>
+            </w:pPr>
+          </w:p>
+        </w:tc>
+        <w:tc>
+          <w:tcPr>
+            <w:tcW w:w="3234" w:type="dxa"/>
             <w:vAlign w:val="center"/>
           </w:tcPr>
           <w:p>
@@ -291,46 +281,33 @@
         </w:trPr>
         <w:tc>
           <w:tcPr>
-            <w:tcW w:w="2700" w:type="dxa"/>
-            <w:vAlign w:val="center"/>
-          </w:tcPr>
-          <w:p>
-            <w:pPr>
-              <w:rPr>
-                <w:rFonts w:ascii="Bodoni MT" w:hAnsi="Bodoni MT"/>
-              </w:rPr>
-            </w:pPr>
-          </w:p>
-        </w:tc>
-        <w:tc>
-          <w:tcPr>
-            <w:tcW w:w="2300" w:type="dxa"/>
-            <w:vAlign w:val="center"/>
-          </w:tcPr>
-          <w:p>
-            <w:pPr>
-              <w:rPr>
-                <w:rFonts w:ascii="Bodoni MT" w:hAnsi="Bodoni MT"/>
-              </w:rPr>
-            </w:pPr>
-          </w:p>
-        </w:tc>
-        <w:tc>
-          <w:tcPr>
-            <w:tcW w:w="2200" w:type="dxa"/>
-            <w:vAlign w:val="center"/>
-          </w:tcPr>
-          <w:p>
-            <w:pPr>
-              <w:rPr>
-                <w:rFonts w:ascii="Bodoni MT" w:hAnsi="Bodoni MT"/>
-              </w:rPr>
-            </w:pPr>
-          </w:p>
-        </w:tc>
-        <w:tc>
-          <w:tcPr>
-            <w:tcW w:w="2434" w:type="dxa"/>
+            <w:tcW w:w="3400" w:type="dxa"/>
+            <w:vAlign w:val="center"/>
+          </w:tcPr>
+          <w:p>
+            <w:pPr>
+              <w:rPr>
+                <w:rFonts w:ascii="Bodoni MT" w:hAnsi="Bodoni MT"/>
+              </w:rPr>
+            </w:pPr>
+          </w:p>
+        </w:tc>
+        <w:tc>
+          <w:tcPr>
+            <w:tcW w:w="3000" w:type="dxa"/>
+            <w:vAlign w:val="center"/>
+          </w:tcPr>
+          <w:p>
+            <w:pPr>
+              <w:rPr>
+                <w:rFonts w:ascii="Bodoni MT" w:hAnsi="Bodoni MT"/>
+              </w:rPr>
+            </w:pPr>
+          </w:p>
+        </w:tc>
+        <w:tc>
+          <w:tcPr>
+            <w:tcW w:w="3234" w:type="dxa"/>
             <w:vAlign w:val="center"/>
           </w:tcPr>
           <w:p>
@@ -348,46 +325,33 @@
         </w:trPr>
         <w:tc>
           <w:tcPr>
-            <w:tcW w:w="2700" w:type="dxa"/>
-            <w:vAlign w:val="center"/>
-          </w:tcPr>
-          <w:p>
-            <w:pPr>
-              <w:rPr>
-                <w:rFonts w:ascii="Bodoni MT" w:hAnsi="Bodoni MT"/>
-              </w:rPr>
-            </w:pPr>
-          </w:p>
-        </w:tc>
-        <w:tc>
-          <w:tcPr>
-            <w:tcW w:w="2300" w:type="dxa"/>
-            <w:vAlign w:val="center"/>
-          </w:tcPr>
-          <w:p>
-            <w:pPr>
-              <w:rPr>
-                <w:rFonts w:ascii="Bodoni MT" w:hAnsi="Bodoni MT"/>
-              </w:rPr>
-            </w:pPr>
-          </w:p>
-        </w:tc>
-        <w:tc>
-          <w:tcPr>
-            <w:tcW w:w="2200" w:type="dxa"/>
-            <w:vAlign w:val="center"/>
-          </w:tcPr>
-          <w:p>
-            <w:pPr>
-              <w:rPr>
-                <w:rFonts w:ascii="Bodoni MT" w:hAnsi="Bodoni MT"/>
-              </w:rPr>
-            </w:pPr>
-          </w:p>
-        </w:tc>
-        <w:tc>
-          <w:tcPr>
-            <w:tcW w:w="2434" w:type="dxa"/>
+            <w:tcW w:w="3400" w:type="dxa"/>
+            <w:vAlign w:val="center"/>
+          </w:tcPr>
+          <w:p>
+            <w:pPr>
+              <w:rPr>
+                <w:rFonts w:ascii="Bodoni MT" w:hAnsi="Bodoni MT"/>
+              </w:rPr>
+            </w:pPr>
+          </w:p>
+        </w:tc>
+        <w:tc>
+          <w:tcPr>
+            <w:tcW w:w="3000" w:type="dxa"/>
+            <w:vAlign w:val="center"/>
+          </w:tcPr>
+          <w:p>
+            <w:pPr>
+              <w:rPr>
+                <w:rFonts w:ascii="Bodoni MT" w:hAnsi="Bodoni MT"/>
+              </w:rPr>
+            </w:pPr>
+          </w:p>
+        </w:tc>
+        <w:tc>
+          <w:tcPr>
+            <w:tcW w:w="3234" w:type="dxa"/>
             <w:vAlign w:val="center"/>
           </w:tcPr>
           <w:p>
@@ -405,46 +369,33 @@
         </w:trPr>
         <w:tc>
           <w:tcPr>
-            <w:tcW w:w="2700" w:type="dxa"/>
-            <w:vAlign w:val="center"/>
-          </w:tcPr>
-          <w:p>
-            <w:pPr>
-              <w:rPr>
-                <w:rFonts w:ascii="Bodoni MT" w:hAnsi="Bodoni MT"/>
-              </w:rPr>
-            </w:pPr>
-          </w:p>
-        </w:tc>
-        <w:tc>
-          <w:tcPr>
-            <w:tcW w:w="2300" w:type="dxa"/>
-            <w:vAlign w:val="center"/>
-          </w:tcPr>
-          <w:p>
-            <w:pPr>
-              <w:rPr>
-                <w:rFonts w:ascii="Bodoni MT" w:hAnsi="Bodoni MT"/>
-              </w:rPr>
-            </w:pPr>
-          </w:p>
-        </w:tc>
-        <w:tc>
-          <w:tcPr>
-            <w:tcW w:w="2200" w:type="dxa"/>
-            <w:vAlign w:val="center"/>
-          </w:tcPr>
-          <w:p>
-            <w:pPr>
-              <w:rPr>
-                <w:rFonts w:ascii="Bodoni MT" w:hAnsi="Bodoni MT"/>
-              </w:rPr>
-            </w:pPr>
-          </w:p>
-        </w:tc>
-        <w:tc>
-          <w:tcPr>
-            <w:tcW w:w="2434" w:type="dxa"/>
+            <w:tcW w:w="3400" w:type="dxa"/>
+            <w:vAlign w:val="center"/>
+          </w:tcPr>
+          <w:p>
+            <w:pPr>
+              <w:rPr>
+                <w:rFonts w:ascii="Bodoni MT" w:hAnsi="Bodoni MT"/>
+              </w:rPr>
+            </w:pPr>
+          </w:p>
+        </w:tc>
+        <w:tc>
+          <w:tcPr>
+            <w:tcW w:w="3000" w:type="dxa"/>
+            <w:vAlign w:val="center"/>
+          </w:tcPr>
+          <w:p>
+            <w:pPr>
+              <w:rPr>
+                <w:rFonts w:ascii="Bodoni MT" w:hAnsi="Bodoni MT"/>
+              </w:rPr>
+            </w:pPr>
+          </w:p>
+        </w:tc>
+        <w:tc>
+          <w:tcPr>
+            <w:tcW w:w="3234" w:type="dxa"/>
             <w:vAlign w:val="center"/>
           </w:tcPr>
           <w:p>
@@ -462,217 +413,33 @@
         </w:trPr>
         <w:tc>
           <w:tcPr>
-            <w:tcW w:w="2700" w:type="dxa"/>
-            <w:vAlign w:val="center"/>
-          </w:tcPr>
-          <w:p>
-            <w:pPr>
-              <w:rPr>
-                <w:rFonts w:ascii="Bodoni MT" w:hAnsi="Bodoni MT"/>
-              </w:rPr>
-            </w:pPr>
-          </w:p>
-        </w:tc>
-        <w:tc>
-          <w:tcPr>
-            <w:tcW w:w="2300" w:type="dxa"/>
-            <w:vAlign w:val="center"/>
-          </w:tcPr>
-          <w:p>
-            <w:pPr>
-              <w:rPr>
-                <w:rFonts w:ascii="Bodoni MT" w:hAnsi="Bodoni MT"/>
-              </w:rPr>
-            </w:pPr>
-          </w:p>
-        </w:tc>
-        <w:tc>
-          <w:tcPr>
-            <w:tcW w:w="2200" w:type="dxa"/>
-            <w:vAlign w:val="center"/>
-          </w:tcPr>
-          <w:p>
-            <w:pPr>
-              <w:rPr>
-                <w:rFonts w:ascii="Bodoni MT" w:hAnsi="Bodoni MT"/>
-              </w:rPr>
-            </w:pPr>
-          </w:p>
-        </w:tc>
-        <w:tc>
-          <w:tcPr>
-            <w:tcW w:w="2434" w:type="dxa"/>
-            <w:vAlign w:val="center"/>
-          </w:tcPr>
-          <w:p>
-            <w:pPr>
-              <w:rPr>
-                <w:rFonts w:ascii="Bodoni MT" w:hAnsi="Bodoni MT"/>
-              </w:rPr>
-            </w:pPr>
-          </w:p>
-        </w:tc>
-      </w:tr>
-      <w:tr>
-        <w:trPr>
-          <w:trHeight w:val="454" w:hRule="atLeast"/>
-        </w:trPr>
-        <w:tc>
-          <w:tcPr>
-            <w:tcW w:w="2700" w:type="dxa"/>
-            <w:vAlign w:val="center"/>
-          </w:tcPr>
-          <w:p>
-            <w:pPr>
-              <w:rPr>
-                <w:rFonts w:ascii="Bodoni MT" w:hAnsi="Bodoni MT"/>
-              </w:rPr>
-            </w:pPr>
-          </w:p>
-        </w:tc>
-        <w:tc>
-          <w:tcPr>
-            <w:tcW w:w="2300" w:type="dxa"/>
-            <w:vAlign w:val="center"/>
-          </w:tcPr>
-          <w:p>
-            <w:pPr>
-              <w:rPr>
-                <w:rFonts w:ascii="Bodoni MT" w:hAnsi="Bodoni MT"/>
-              </w:rPr>
-            </w:pPr>
-          </w:p>
-        </w:tc>
-        <w:tc>
-          <w:tcPr>
-            <w:tcW w:w="2200" w:type="dxa"/>
-            <w:vAlign w:val="center"/>
-          </w:tcPr>
-          <w:p>
-            <w:pPr>
-              <w:rPr>
-                <w:rFonts w:ascii="Bodoni MT" w:hAnsi="Bodoni MT"/>
-              </w:rPr>
-            </w:pPr>
-          </w:p>
-        </w:tc>
-        <w:tc>
-          <w:tcPr>
-            <w:tcW w:w="2434" w:type="dxa"/>
-            <w:vAlign w:val="center"/>
-          </w:tcPr>
-          <w:p>
-            <w:pPr>
-              <w:rPr>
-                <w:rFonts w:ascii="Bodoni MT" w:hAnsi="Bodoni MT"/>
-              </w:rPr>
-            </w:pPr>
-          </w:p>
-        </w:tc>
-      </w:tr>
-      <w:tr>
-        <w:trPr>
-          <w:trHeight w:val="454" w:hRule="atLeast"/>
-        </w:trPr>
-        <w:tc>
-          <w:tcPr>
-            <w:tcW w:w="2700" w:type="dxa"/>
-            <w:vAlign w:val="center"/>
-          </w:tcPr>
-          <w:p>
-            <w:pPr>
-              <w:rPr>
-                <w:rFonts w:ascii="Bodoni MT" w:hAnsi="Bodoni MT"/>
-              </w:rPr>
-            </w:pPr>
-          </w:p>
-        </w:tc>
-        <w:tc>
-          <w:tcPr>
-            <w:tcW w:w="2300" w:type="dxa"/>
-            <w:vAlign w:val="center"/>
-          </w:tcPr>
-          <w:p>
-            <w:pPr>
-              <w:rPr>
-                <w:rFonts w:ascii="Bodoni MT" w:hAnsi="Bodoni MT"/>
-              </w:rPr>
-            </w:pPr>
-          </w:p>
-        </w:tc>
-        <w:tc>
-          <w:tcPr>
-            <w:tcW w:w="2200" w:type="dxa"/>
-            <w:vAlign w:val="center"/>
-          </w:tcPr>
-          <w:p>
-            <w:pPr>
-              <w:rPr>
-                <w:rFonts w:ascii="Bodoni MT" w:hAnsi="Bodoni MT"/>
-              </w:rPr>
-            </w:pPr>
-          </w:p>
-        </w:tc>
-        <w:tc>
-          <w:tcPr>
-            <w:tcW w:w="2434" w:type="dxa"/>
-            <w:vAlign w:val="center"/>
-          </w:tcPr>
-          <w:p>
-            <w:pPr>
-              <w:rPr>
-                <w:rFonts w:ascii="Bodoni MT" w:hAnsi="Bodoni MT"/>
-              </w:rPr>
-            </w:pPr>
-          </w:p>
-        </w:tc>
-      </w:tr>
-      <w:tr>
-        <w:trPr>
-          <w:trHeight w:val="454" w:hRule="atLeast"/>
-        </w:trPr>
-        <w:tc>
-          <w:tcPr>
-            <w:tcW w:w="2700" w:type="dxa"/>
-            <w:vAlign w:val="center"/>
-          </w:tcPr>
-          <w:p>
-            <w:pPr>
-              <w:rPr>
-                <w:rFonts w:ascii="Bodoni MT" w:hAnsi="Bodoni MT"/>
-              </w:rPr>
-            </w:pPr>
-          </w:p>
-        </w:tc>
-        <w:tc>
-          <w:tcPr>
-            <w:tcW w:w="2300" w:type="dxa"/>
-            <w:vAlign w:val="center"/>
-          </w:tcPr>
-          <w:p>
-            <w:pPr>
-              <w:rPr>
-                <w:rFonts w:ascii="Bodoni MT" w:hAnsi="Bodoni MT"/>
-              </w:rPr>
-            </w:pPr>
-          </w:p>
-        </w:tc>
-        <w:tc>
-          <w:tcPr>
-            <w:tcW w:w="2200" w:type="dxa"/>
-            <w:vAlign w:val="center"/>
-          </w:tcPr>
-          <w:p>
-            <w:pPr>
-              <w:rPr>
-                <w:rFonts w:ascii="Bodoni MT" w:hAnsi="Bodoni MT"/>
-              </w:rPr>
-            </w:pPr>
-          </w:p>
-        </w:tc>
-        <w:tc>
-          <w:tcPr>
-            <w:tcW w:w="2434" w:type="dxa"/>
+            <w:tcW w:w="3400" w:type="dxa"/>
+            <w:vAlign w:val="center"/>
+          </w:tcPr>
+          <w:p>
+            <w:pPr>
+              <w:rPr>
+                <w:rFonts w:ascii="Bodoni MT" w:hAnsi="Bodoni MT"/>
+              </w:rPr>
+            </w:pPr>
+          </w:p>
+        </w:tc>
+        <w:tc>
+          <w:tcPr>
+            <w:tcW w:w="3000" w:type="dxa"/>
+            <w:vAlign w:val="center"/>
+          </w:tcPr>
+          <w:p>
+            <w:pPr>
+              <w:rPr>
+                <w:rFonts w:ascii="Bodoni MT" w:hAnsi="Bodoni MT"/>
+              </w:rPr>
+            </w:pPr>
+          </w:p>
+        </w:tc>
+        <w:tc>
+          <w:tcPr>
+            <w:tcW w:w="3234" w:type="dxa"/>
             <w:vAlign w:val="center"/>
           </w:tcPr>
           <w:p>
@@ -687,37 +454,11 @@
     </w:tbl>
     <w:p>
       <w:pPr>
-        <w:rPr>
-          <w:rFonts w:ascii="Bodoni MT" w:hAnsi="Bodoni MT"/>
-        </w:rPr>
-      </w:pPr>
-    </w:p>
-    <w:p>
-      <w:pPr>
-        <w:pStyle w:val="Titolo1"/>
-        <w:rPr>
-          <w:rFonts w:ascii="Bodoni MT" w:hAnsi="Bodoni MT"/>
-          <w:i/>
-          <w:iCs/>
-          <w:sz w:val="24"/>
-          <w:szCs w:val="24"/>
-        </w:rPr>
-      </w:pPr>
-      <w:r>
-        <w:rPr>
-          <w:rFonts w:ascii="Bodoni MT" w:hAnsi="Bodoni MT"/>
-          <w:i/>
-          <w:iCs/>
-          <w:sz w:val="24"/>
-          <w:szCs w:val="24"/>
-        </w:rPr>
-        <w:t xml:space="preserve">PRESENZE, DATA E FIRMA</w:t>
-      </w:r>
-    </w:p>
-    <w:p>
-      <w:pPr>
-        <w:rPr>
-          <w:rFonts w:ascii="Bodoni MT" w:hAnsi="Bodoni MT"/>
+        <w:spacing w:before="160"/>
+        <w:rPr>
+          <w:rFonts w:ascii="Bodoni MT" w:hAnsi="Bodoni MT"/>
+          <w:b/>
+          <w:bCs/>
           <w:sz w:val="22"/>
           <w:szCs w:val="22"/>
         </w:rPr>
@@ -725,10 +466,12 @@
       <w:r>
         <w:rPr>
           <w:rFonts w:ascii="Bodoni MT" w:hAnsi="Bodoni MT"/>
+          <w:b/>
+          <w:bCs/>
           <w:sz w:val="22"/>
           <w:szCs w:val="22"/>
         </w:rPr>
-        <w:t xml:space="preserve">Le persone sopra indicate confermano la propria presenza apponendo data e firma:</w:t>
+        <w:t xml:space="preserve">Concessionario — ITEL S.r.l.</w:t>
       </w:r>
     </w:p>
     <w:tbl>
@@ -739,15 +482,17 @@
         <w:tblLook w:val="04A0" w:firstRow="1" w:lastRow="0" w:firstColumn="1" w:lastColumn="0" w:noHBand="0" w:noVBand="1"/>
       </w:tblPr>
       <w:tblGrid>
-        <w:gridCol w:w="3100"/>
-        <w:gridCol w:w="2534"/>
-        <w:gridCol w:w="1500"/>
-        <w:gridCol w:w="2500"/>
+        <w:gridCol w:w="3400"/>
+        <w:gridCol w:w="3000"/>
+        <w:gridCol w:w="3234"/>
       </w:tblGrid>
       <w:tr>
-        <w:tc>
-          <w:tcPr>
-            <w:tcW w:w="3100" w:type="dxa"/>
+        <w:trPr>
+          <w:tblHeader/>
+        </w:trPr>
+        <w:tc>
+          <w:tcPr>
+            <w:tcW w:w="3400" w:type="dxa"/>
             <w:shd w:val="clear" w:color="auto" w:fill="D9D9D9"/>
             <w:vAlign w:val="center"/>
           </w:tcPr>
@@ -771,7 +516,7 @@
         </w:tc>
         <w:tc>
           <w:tcPr>
-            <w:tcW w:w="2534" w:type="dxa"/>
+            <w:tcW w:w="3000" w:type="dxa"/>
             <w:shd w:val="clear" w:color="auto" w:fill="D9D9D9"/>
             <w:vAlign w:val="center"/>
           </w:tcPr>
@@ -789,13 +534,13 @@
                 <w:b/>
                 <w:bCs/>
               </w:rPr>
-              <w:t xml:space="preserve">Azienda / Ente</w:t>
-            </w:r>
-          </w:p>
-        </w:tc>
-        <w:tc>
-          <w:tcPr>
-            <w:tcW w:w="1500" w:type="dxa"/>
+              <w:t xml:space="preserve">Ruolo / Funzione</w:t>
+            </w:r>
+          </w:p>
+        </w:tc>
+        <w:tc>
+          <w:tcPr>
+            <w:tcW w:w="3234" w:type="dxa"/>
             <w:shd w:val="clear" w:color="auto" w:fill="D9D9D9"/>
             <w:vAlign w:val="center"/>
           </w:tcPr>
@@ -813,81 +558,44 @@
                 <w:b/>
                 <w:bCs/>
               </w:rPr>
-              <w:t xml:space="preserve">Data</w:t>
-            </w:r>
-          </w:p>
-        </w:tc>
-        <w:tc>
-          <w:tcPr>
-            <w:tcW w:w="2500" w:type="dxa"/>
-            <w:shd w:val="clear" w:color="auto" w:fill="D9D9D9"/>
-            <w:vAlign w:val="center"/>
-          </w:tcPr>
-          <w:p>
-            <w:pPr>
-              <w:rPr>
-                <w:rFonts w:ascii="Bodoni MT" w:hAnsi="Bodoni MT"/>
-                <w:b/>
-                <w:bCs/>
-              </w:rPr>
-            </w:pPr>
-            <w:r>
-              <w:rPr>
-                <w:rFonts w:ascii="Bodoni MT" w:hAnsi="Bodoni MT"/>
-                <w:b/>
-                <w:bCs/>
-              </w:rPr>
-              <w:t xml:space="preserve">Firma</w:t>
+              <w:t xml:space="preserve">Recapito (tel. / e-mail)</w:t>
             </w:r>
           </w:p>
         </w:tc>
       </w:tr>
       <w:tr>
         <w:trPr>
-          <w:trHeight w:val="624" w:hRule="atLeast"/>
+          <w:trHeight w:val="454" w:hRule="atLeast"/>
         </w:trPr>
         <w:tc>
           <w:tcPr>
-            <w:tcW w:w="3100" w:type="dxa"/>
-            <w:vAlign w:val="center"/>
-          </w:tcPr>
-          <w:p>
-            <w:pPr>
-              <w:rPr>
-                <w:rFonts w:ascii="Bodoni MT" w:hAnsi="Bodoni MT"/>
-              </w:rPr>
-            </w:pPr>
-          </w:p>
-        </w:tc>
-        <w:tc>
-          <w:tcPr>
-            <w:tcW w:w="2534" w:type="dxa"/>
-            <w:vAlign w:val="center"/>
-          </w:tcPr>
-          <w:p>
-            <w:pPr>
-              <w:rPr>
-                <w:rFonts w:ascii="Bodoni MT" w:hAnsi="Bodoni MT"/>
-              </w:rPr>
-            </w:pPr>
-          </w:p>
-        </w:tc>
-        <w:tc>
-          <w:tcPr>
-            <w:tcW w:w="1500" w:type="dxa"/>
-            <w:vAlign w:val="center"/>
-          </w:tcPr>
-          <w:p>
-            <w:pPr>
-              <w:rPr>
-                <w:rFonts w:ascii="Bodoni MT" w:hAnsi="Bodoni MT"/>
-              </w:rPr>
-            </w:pPr>
-          </w:p>
-        </w:tc>
-        <w:tc>
-          <w:tcPr>
-            <w:tcW w:w="2500" w:type="dxa"/>
+            <w:tcW w:w="3400" w:type="dxa"/>
+            <w:vAlign w:val="center"/>
+          </w:tcPr>
+          <w:p>
+            <w:pPr>
+              <w:rPr>
+                <w:rFonts w:ascii="Bodoni MT" w:hAnsi="Bodoni MT"/>
+              </w:rPr>
+            </w:pPr>
+          </w:p>
+        </w:tc>
+        <w:tc>
+          <w:tcPr>
+            <w:tcW w:w="3000" w:type="dxa"/>
+            <w:vAlign w:val="center"/>
+          </w:tcPr>
+          <w:p>
+            <w:pPr>
+              <w:rPr>
+                <w:rFonts w:ascii="Bodoni MT" w:hAnsi="Bodoni MT"/>
+              </w:rPr>
+            </w:pPr>
+          </w:p>
+        </w:tc>
+        <w:tc>
+          <w:tcPr>
+            <w:tcW w:w="3234" w:type="dxa"/>
             <w:vAlign w:val="center"/>
           </w:tcPr>
           <w:p>
@@ -901,50 +609,37 @@
       </w:tr>
       <w:tr>
         <w:trPr>
-          <w:trHeight w:val="624" w:hRule="atLeast"/>
+          <w:trHeight w:val="454" w:hRule="atLeast"/>
         </w:trPr>
         <w:tc>
           <w:tcPr>
-            <w:tcW w:w="3100" w:type="dxa"/>
-            <w:vAlign w:val="center"/>
-          </w:tcPr>
-          <w:p>
-            <w:pPr>
-              <w:rPr>
-                <w:rFonts w:ascii="Bodoni MT" w:hAnsi="Bodoni MT"/>
-              </w:rPr>
-            </w:pPr>
-          </w:p>
-        </w:tc>
-        <w:tc>
-          <w:tcPr>
-            <w:tcW w:w="2534" w:type="dxa"/>
-            <w:vAlign w:val="center"/>
-          </w:tcPr>
-          <w:p>
-            <w:pPr>
-              <w:rPr>
-                <w:rFonts w:ascii="Bodoni MT" w:hAnsi="Bodoni MT"/>
-              </w:rPr>
-            </w:pPr>
-          </w:p>
-        </w:tc>
-        <w:tc>
-          <w:tcPr>
-            <w:tcW w:w="1500" w:type="dxa"/>
-            <w:vAlign w:val="center"/>
-          </w:tcPr>
-          <w:p>
-            <w:pPr>
-              <w:rPr>
-                <w:rFonts w:ascii="Bodoni MT" w:hAnsi="Bodoni MT"/>
-              </w:rPr>
-            </w:pPr>
-          </w:p>
-        </w:tc>
-        <w:tc>
-          <w:tcPr>
-            <w:tcW w:w="2500" w:type="dxa"/>
+            <w:tcW w:w="3400" w:type="dxa"/>
+            <w:vAlign w:val="center"/>
+          </w:tcPr>
+          <w:p>
+            <w:pPr>
+              <w:rPr>
+                <w:rFonts w:ascii="Bodoni MT" w:hAnsi="Bodoni MT"/>
+              </w:rPr>
+            </w:pPr>
+          </w:p>
+        </w:tc>
+        <w:tc>
+          <w:tcPr>
+            <w:tcW w:w="3000" w:type="dxa"/>
+            <w:vAlign w:val="center"/>
+          </w:tcPr>
+          <w:p>
+            <w:pPr>
+              <w:rPr>
+                <w:rFonts w:ascii="Bodoni MT" w:hAnsi="Bodoni MT"/>
+              </w:rPr>
+            </w:pPr>
+          </w:p>
+        </w:tc>
+        <w:tc>
+          <w:tcPr>
+            <w:tcW w:w="3234" w:type="dxa"/>
             <w:vAlign w:val="center"/>
           </w:tcPr>
           <w:p>
@@ -958,50 +653,37 @@
       </w:tr>
       <w:tr>
         <w:trPr>
-          <w:trHeight w:val="624" w:hRule="atLeast"/>
+          <w:trHeight w:val="454" w:hRule="atLeast"/>
         </w:trPr>
         <w:tc>
           <w:tcPr>
-            <w:tcW w:w="3100" w:type="dxa"/>
-            <w:vAlign w:val="center"/>
-          </w:tcPr>
-          <w:p>
-            <w:pPr>
-              <w:rPr>
-                <w:rFonts w:ascii="Bodoni MT" w:hAnsi="Bodoni MT"/>
-              </w:rPr>
-            </w:pPr>
-          </w:p>
-        </w:tc>
-        <w:tc>
-          <w:tcPr>
-            <w:tcW w:w="2534" w:type="dxa"/>
-            <w:vAlign w:val="center"/>
-          </w:tcPr>
-          <w:p>
-            <w:pPr>
-              <w:rPr>
-                <w:rFonts w:ascii="Bodoni MT" w:hAnsi="Bodoni MT"/>
-              </w:rPr>
-            </w:pPr>
-          </w:p>
-        </w:tc>
-        <w:tc>
-          <w:tcPr>
-            <w:tcW w:w="1500" w:type="dxa"/>
-            <w:vAlign w:val="center"/>
-          </w:tcPr>
-          <w:p>
-            <w:pPr>
-              <w:rPr>
-                <w:rFonts w:ascii="Bodoni MT" w:hAnsi="Bodoni MT"/>
-              </w:rPr>
-            </w:pPr>
-          </w:p>
-        </w:tc>
-        <w:tc>
-          <w:tcPr>
-            <w:tcW w:w="2500" w:type="dxa"/>
+            <w:tcW w:w="3400" w:type="dxa"/>
+            <w:vAlign w:val="center"/>
+          </w:tcPr>
+          <w:p>
+            <w:pPr>
+              <w:rPr>
+                <w:rFonts w:ascii="Bodoni MT" w:hAnsi="Bodoni MT"/>
+              </w:rPr>
+            </w:pPr>
+          </w:p>
+        </w:tc>
+        <w:tc>
+          <w:tcPr>
+            <w:tcW w:w="3000" w:type="dxa"/>
+            <w:vAlign w:val="center"/>
+          </w:tcPr>
+          <w:p>
+            <w:pPr>
+              <w:rPr>
+                <w:rFonts w:ascii="Bodoni MT" w:hAnsi="Bodoni MT"/>
+              </w:rPr>
+            </w:pPr>
+          </w:p>
+        </w:tc>
+        <w:tc>
+          <w:tcPr>
+            <w:tcW w:w="3234" w:type="dxa"/>
             <w:vAlign w:val="center"/>
           </w:tcPr>
           <w:p>
@@ -1015,50 +697,37 @@
       </w:tr>
       <w:tr>
         <w:trPr>
-          <w:trHeight w:val="624" w:hRule="atLeast"/>
+          <w:trHeight w:val="454" w:hRule="atLeast"/>
         </w:trPr>
         <w:tc>
           <w:tcPr>
-            <w:tcW w:w="3100" w:type="dxa"/>
-            <w:vAlign w:val="center"/>
-          </w:tcPr>
-          <w:p>
-            <w:pPr>
-              <w:rPr>
-                <w:rFonts w:ascii="Bodoni MT" w:hAnsi="Bodoni MT"/>
-              </w:rPr>
-            </w:pPr>
-          </w:p>
-        </w:tc>
-        <w:tc>
-          <w:tcPr>
-            <w:tcW w:w="2534" w:type="dxa"/>
-            <w:vAlign w:val="center"/>
-          </w:tcPr>
-          <w:p>
-            <w:pPr>
-              <w:rPr>
-                <w:rFonts w:ascii="Bodoni MT" w:hAnsi="Bodoni MT"/>
-              </w:rPr>
-            </w:pPr>
-          </w:p>
-        </w:tc>
-        <w:tc>
-          <w:tcPr>
-            <w:tcW w:w="1500" w:type="dxa"/>
-            <w:vAlign w:val="center"/>
-          </w:tcPr>
-          <w:p>
-            <w:pPr>
-              <w:rPr>
-                <w:rFonts w:ascii="Bodoni MT" w:hAnsi="Bodoni MT"/>
-              </w:rPr>
-            </w:pPr>
-          </w:p>
-        </w:tc>
-        <w:tc>
-          <w:tcPr>
-            <w:tcW w:w="2500" w:type="dxa"/>
+            <w:tcW w:w="3400" w:type="dxa"/>
+            <w:vAlign w:val="center"/>
+          </w:tcPr>
+          <w:p>
+            <w:pPr>
+              <w:rPr>
+                <w:rFonts w:ascii="Bodoni MT" w:hAnsi="Bodoni MT"/>
+              </w:rPr>
+            </w:pPr>
+          </w:p>
+        </w:tc>
+        <w:tc>
+          <w:tcPr>
+            <w:tcW w:w="3000" w:type="dxa"/>
+            <w:vAlign w:val="center"/>
+          </w:tcPr>
+          <w:p>
+            <w:pPr>
+              <w:rPr>
+                <w:rFonts w:ascii="Bodoni MT" w:hAnsi="Bodoni MT"/>
+              </w:rPr>
+            </w:pPr>
+          </w:p>
+        </w:tc>
+        <w:tc>
+          <w:tcPr>
+            <w:tcW w:w="3234" w:type="dxa"/>
             <w:vAlign w:val="center"/>
           </w:tcPr>
           <w:p>
@@ -1072,221 +741,37 @@
       </w:tr>
       <w:tr>
         <w:trPr>
-          <w:trHeight w:val="624" w:hRule="atLeast"/>
+          <w:trHeight w:val="454" w:hRule="atLeast"/>
         </w:trPr>
         <w:tc>
           <w:tcPr>
-            <w:tcW w:w="3100" w:type="dxa"/>
-            <w:vAlign w:val="center"/>
-          </w:tcPr>
-          <w:p>
-            <w:pPr>
-              <w:rPr>
-                <w:rFonts w:ascii="Bodoni MT" w:hAnsi="Bodoni MT"/>
-              </w:rPr>
-            </w:pPr>
-          </w:p>
-        </w:tc>
-        <w:tc>
-          <w:tcPr>
-            <w:tcW w:w="2534" w:type="dxa"/>
-            <w:vAlign w:val="center"/>
-          </w:tcPr>
-          <w:p>
-            <w:pPr>
-              <w:rPr>
-                <w:rFonts w:ascii="Bodoni MT" w:hAnsi="Bodoni MT"/>
-              </w:rPr>
-            </w:pPr>
-          </w:p>
-        </w:tc>
-        <w:tc>
-          <w:tcPr>
-            <w:tcW w:w="1500" w:type="dxa"/>
-            <w:vAlign w:val="center"/>
-          </w:tcPr>
-          <w:p>
-            <w:pPr>
-              <w:rPr>
-                <w:rFonts w:ascii="Bodoni MT" w:hAnsi="Bodoni MT"/>
-              </w:rPr>
-            </w:pPr>
-          </w:p>
-        </w:tc>
-        <w:tc>
-          <w:tcPr>
-            <w:tcW w:w="2500" w:type="dxa"/>
-            <w:vAlign w:val="center"/>
-          </w:tcPr>
-          <w:p>
-            <w:pPr>
-              <w:rPr>
-                <w:rFonts w:ascii="Bodoni MT" w:hAnsi="Bodoni MT"/>
-              </w:rPr>
-            </w:pPr>
-          </w:p>
-        </w:tc>
-      </w:tr>
-      <w:tr>
-        <w:trPr>
-          <w:trHeight w:val="624" w:hRule="atLeast"/>
-        </w:trPr>
-        <w:tc>
-          <w:tcPr>
-            <w:tcW w:w="3100" w:type="dxa"/>
-            <w:vAlign w:val="center"/>
-          </w:tcPr>
-          <w:p>
-            <w:pPr>
-              <w:rPr>
-                <w:rFonts w:ascii="Bodoni MT" w:hAnsi="Bodoni MT"/>
-              </w:rPr>
-            </w:pPr>
-          </w:p>
-        </w:tc>
-        <w:tc>
-          <w:tcPr>
-            <w:tcW w:w="2534" w:type="dxa"/>
-            <w:vAlign w:val="center"/>
-          </w:tcPr>
-          <w:p>
-            <w:pPr>
-              <w:rPr>
-                <w:rFonts w:ascii="Bodoni MT" w:hAnsi="Bodoni MT"/>
-              </w:rPr>
-            </w:pPr>
-          </w:p>
-        </w:tc>
-        <w:tc>
-          <w:tcPr>
-            <w:tcW w:w="1500" w:type="dxa"/>
-            <w:vAlign w:val="center"/>
-          </w:tcPr>
-          <w:p>
-            <w:pPr>
-              <w:rPr>
-                <w:rFonts w:ascii="Bodoni MT" w:hAnsi="Bodoni MT"/>
-              </w:rPr>
-            </w:pPr>
-          </w:p>
-        </w:tc>
-        <w:tc>
-          <w:tcPr>
-            <w:tcW w:w="2500" w:type="dxa"/>
-            <w:vAlign w:val="center"/>
-          </w:tcPr>
-          <w:p>
-            <w:pPr>
-              <w:rPr>
-                <w:rFonts w:ascii="Bodoni MT" w:hAnsi="Bodoni MT"/>
-              </w:rPr>
-            </w:pPr>
-          </w:p>
-        </w:tc>
-      </w:tr>
-      <w:tr>
-        <w:trPr>
-          <w:trHeight w:val="624" w:hRule="atLeast"/>
-        </w:trPr>
-        <w:tc>
-          <w:tcPr>
-            <w:tcW w:w="3100" w:type="dxa"/>
-            <w:vAlign w:val="center"/>
-          </w:tcPr>
-          <w:p>
-            <w:pPr>
-              <w:rPr>
-                <w:rFonts w:ascii="Bodoni MT" w:hAnsi="Bodoni MT"/>
-              </w:rPr>
-            </w:pPr>
-          </w:p>
-        </w:tc>
-        <w:tc>
-          <w:tcPr>
-            <w:tcW w:w="2534" w:type="dxa"/>
-            <w:vAlign w:val="center"/>
-          </w:tcPr>
-          <w:p>
-            <w:pPr>
-              <w:rPr>
-                <w:rFonts w:ascii="Bodoni MT" w:hAnsi="Bodoni MT"/>
-              </w:rPr>
-            </w:pPr>
-          </w:p>
-        </w:tc>
-        <w:tc>
-          <w:tcPr>
-            <w:tcW w:w="1500" w:type="dxa"/>
-            <w:vAlign w:val="center"/>
-          </w:tcPr>
-          <w:p>
-            <w:pPr>
-              <w:rPr>
-                <w:rFonts w:ascii="Bodoni MT" w:hAnsi="Bodoni MT"/>
-              </w:rPr>
-            </w:pPr>
-          </w:p>
-        </w:tc>
-        <w:tc>
-          <w:tcPr>
-            <w:tcW w:w="2500" w:type="dxa"/>
-            <w:vAlign w:val="center"/>
-          </w:tcPr>
-          <w:p>
-            <w:pPr>
-              <w:rPr>
-                <w:rFonts w:ascii="Bodoni MT" w:hAnsi="Bodoni MT"/>
-              </w:rPr>
-            </w:pPr>
-          </w:p>
-        </w:tc>
-      </w:tr>
-      <w:tr>
-        <w:trPr>
-          <w:trHeight w:val="624" w:hRule="atLeast"/>
-        </w:trPr>
-        <w:tc>
-          <w:tcPr>
-            <w:tcW w:w="3100" w:type="dxa"/>
-            <w:vAlign w:val="center"/>
-          </w:tcPr>
-          <w:p>
-            <w:pPr>
-              <w:rPr>
-                <w:rFonts w:ascii="Bodoni MT" w:hAnsi="Bodoni MT"/>
-              </w:rPr>
-            </w:pPr>
-          </w:p>
-        </w:tc>
-        <w:tc>
-          <w:tcPr>
-            <w:tcW w:w="2534" w:type="dxa"/>
-            <w:vAlign w:val="center"/>
-          </w:tcPr>
-          <w:p>
-            <w:pPr>
-              <w:rPr>
-                <w:rFonts w:ascii="Bodoni MT" w:hAnsi="Bodoni MT"/>
-              </w:rPr>
-            </w:pPr>
-          </w:p>
-        </w:tc>
-        <w:tc>
-          <w:tcPr>
-            <w:tcW w:w="1500" w:type="dxa"/>
-            <w:vAlign w:val="center"/>
-          </w:tcPr>
-          <w:p>
-            <w:pPr>
-              <w:rPr>
-                <w:rFonts w:ascii="Bodoni MT" w:hAnsi="Bodoni MT"/>
-              </w:rPr>
-            </w:pPr>
-          </w:p>
-        </w:tc>
-        <w:tc>
-          <w:tcPr>
-            <w:tcW w:w="2500" w:type="dxa"/>
+            <w:tcW w:w="3400" w:type="dxa"/>
+            <w:vAlign w:val="center"/>
+          </w:tcPr>
+          <w:p>
+            <w:pPr>
+              <w:rPr>
+                <w:rFonts w:ascii="Bodoni MT" w:hAnsi="Bodoni MT"/>
+              </w:rPr>
+            </w:pPr>
+          </w:p>
+        </w:tc>
+        <w:tc>
+          <w:tcPr>
+            <w:tcW w:w="3000" w:type="dxa"/>
+            <w:vAlign w:val="center"/>
+          </w:tcPr>
+          <w:p>
+            <w:pPr>
+              <w:rPr>
+                <w:rFonts w:ascii="Bodoni MT" w:hAnsi="Bodoni MT"/>
+              </w:rPr>
+            </w:pPr>
+          </w:p>
+        </w:tc>
+        <w:tc>
+          <w:tcPr>
+            <w:tcW w:w="3234" w:type="dxa"/>
             <w:vAlign w:val="center"/>
           </w:tcPr>
           <w:p>
@@ -3034,6 +2519,838 @@
         </w:rPr>
       </w:pPr>
     </w:p>
+    <w:p>
+      <w:r>
+        <w:br w:type="page"/>
+      </w:r>
+    </w:p>
+    <w:p>
+      <w:pPr>
+        <w:pStyle w:val="Titolo1"/>
+        <w:rPr>
+          <w:rFonts w:ascii="Bodoni MT" w:hAnsi="Bodoni MT"/>
+          <w:i/>
+          <w:iCs/>
+          <w:sz w:val="24"/>
+          <w:szCs w:val="24"/>
+        </w:rPr>
+      </w:pPr>
+      <w:r>
+        <w:rPr>
+          <w:rFonts w:ascii="Bodoni MT" w:hAnsi="Bodoni MT"/>
+          <w:i/>
+          <w:iCs/>
+          <w:sz w:val="24"/>
+          <w:szCs w:val="24"/>
+        </w:rPr>
+        <w:t xml:space="preserve">NOTE E RELAZIONI</w:t>
+      </w:r>
+    </w:p>
+    <w:p>
+      <w:pPr>
+        <w:rPr>
+          <w:rFonts w:ascii="Bodoni MT" w:hAnsi="Bodoni MT"/>
+          <w:i/>
+          <w:iCs/>
+          <w:sz w:val="22"/>
+          <w:szCs w:val="22"/>
+        </w:rPr>
+      </w:pPr>
+      <w:r>
+        <w:rPr>
+          <w:rFonts w:ascii="Bodoni MT" w:hAnsi="Bodoni MT"/>
+          <w:i/>
+          <w:iCs/>
+          <w:sz w:val="22"/>
+          <w:szCs w:val="22"/>
+        </w:rPr>
+        <w:t xml:space="preserve">Note, osservazioni ed eventuali relazioni redatte a seguito della verifica e prima della sottoscrizione:</w:t>
+      </w:r>
+    </w:p>
+    <w:tbl>
+      <w:tblPr>
+        <w:tblStyle w:val="Grigliatabella"/>
+        <w:tblW w:w="9634" w:type="dxa"/>
+        <w:tblLayout w:type="fixed"/>
+        <w:tblLook w:val="04A0" w:firstRow="0" w:lastRow="0" w:firstColumn="0" w:lastColumn="0" w:noHBand="0" w:noVBand="1"/>
+      </w:tblPr>
+      <w:tblGrid>
+        <w:gridCol w:w="9634"/>
+      </w:tblGrid>
+      <w:tr>
+        <w:trPr>
+          <w:trHeight w:val="3600" w:hRule="atLeast"/>
+        </w:trPr>
+        <w:tc>
+          <w:tcPr>
+            <w:tcW w:w="9634" w:type="dxa"/>
+            <w:vAlign w:val="center"/>
+          </w:tcPr>
+          <w:p>
+            <w:pPr>
+              <w:rPr>
+                <w:rFonts w:ascii="Bodoni MT" w:hAnsi="Bodoni MT"/>
+              </w:rPr>
+            </w:pPr>
+          </w:p>
+        </w:tc>
+      </w:tr>
+    </w:tbl>
+    <w:p>
+      <w:pPr>
+        <w:pStyle w:val="Titolo1"/>
+        <w:rPr>
+          <w:rFonts w:ascii="Bodoni MT" w:hAnsi="Bodoni MT"/>
+          <w:i/>
+          <w:iCs/>
+          <w:sz w:val="24"/>
+          <w:szCs w:val="24"/>
+        </w:rPr>
+      </w:pPr>
+      <w:r>
+        <w:rPr>
+          <w:rFonts w:ascii="Bodoni MT" w:hAnsi="Bodoni MT"/>
+          <w:i/>
+          <w:iCs/>
+          <w:sz w:val="24"/>
+          <w:szCs w:val="24"/>
+        </w:rPr>
+        <w:t xml:space="preserve">VERBALE DI PRESENZA, DATA E FIRMA</w:t>
+      </w:r>
+    </w:p>
+    <w:p>
+      <w:pPr>
+        <w:rPr>
+          <w:rFonts w:ascii="Bodoni MT" w:hAnsi="Bodoni MT"/>
+          <w:sz w:val="22"/>
+          <w:szCs w:val="22"/>
+        </w:rPr>
+      </w:pPr>
+      <w:r>
+        <w:rPr>
+          <w:rFonts w:ascii="Bodoni MT" w:hAnsi="Bodoni MT"/>
+          <w:sz w:val="22"/>
+          <w:szCs w:val="22"/>
+        </w:rPr>
+        <w:t xml:space="preserve">Le parti, lette le risultanze della verifica e le note di cui sopra, sottoscrivono il presente documento.</w:t>
+      </w:r>
+    </w:p>
+    <w:p>
+      <w:pPr>
+        <w:spacing w:before="80"/>
+        <w:rPr>
+          <w:rFonts w:ascii="Bodoni MT" w:hAnsi="Bodoni MT"/>
+          <w:i/>
+          <w:iCs/>
+          <w:sz w:val="22"/>
+          <w:szCs w:val="22"/>
+        </w:rPr>
+      </w:pPr>
+      <w:r>
+        <w:rPr>
+          <w:rFonts w:ascii="Bodoni MT" w:hAnsi="Bodoni MT"/>
+          <w:i/>
+          <w:iCs/>
+          <w:sz w:val="22"/>
+          <w:szCs w:val="22"/>
+        </w:rPr>
+        <w:t xml:space="preserve">Letto, confermato e sottoscritto.</w:t>
+      </w:r>
+    </w:p>
+    <w:p>
+      <w:pPr>
+        <w:rPr>
+          <w:rFonts w:ascii="Bodoni MT" w:hAnsi="Bodoni MT"/>
+          <w:sz w:val="12"/>
+          <w:szCs w:val="12"/>
+        </w:rPr>
+      </w:pPr>
+    </w:p>
+    <w:tbl>
+      <w:tblPr>
+        <w:tblStyle w:val="Grigliatabella"/>
+        <w:tblW w:w="9634" w:type="dxa"/>
+        <w:tblLayout w:type="fixed"/>
+        <w:tblLook w:val="04A0" w:firstRow="1" w:lastRow="0" w:firstColumn="1" w:lastColumn="0" w:noHBand="0" w:noVBand="1"/>
+      </w:tblPr>
+      <w:tblGrid>
+        <w:gridCol w:w="3000"/>
+        <w:gridCol w:w="3134"/>
+        <w:gridCol w:w="1300"/>
+        <w:gridCol w:w="2200"/>
+      </w:tblGrid>
+      <w:tr>
+        <w:trPr>
+          <w:tblHeader/>
+        </w:trPr>
+        <w:tc>
+          <w:tcPr>
+            <w:tcW w:w="3000" w:type="dxa"/>
+            <w:shd w:val="clear" w:color="auto" w:fill="D9D9D9"/>
+            <w:vAlign w:val="center"/>
+          </w:tcPr>
+          <w:p>
+            <w:pPr>
+              <w:rPr>
+                <w:rFonts w:ascii="Bodoni MT" w:hAnsi="Bodoni MT"/>
+                <w:b/>
+                <w:bCs/>
+              </w:rPr>
+            </w:pPr>
+            <w:r>
+              <w:rPr>
+                <w:rFonts w:ascii="Bodoni MT" w:hAnsi="Bodoni MT"/>
+                <w:b/>
+                <w:bCs/>
+              </w:rPr>
+              <w:t xml:space="preserve">Nome e Cognome</w:t>
+            </w:r>
+          </w:p>
+        </w:tc>
+        <w:tc>
+          <w:tcPr>
+            <w:tcW w:w="3134" w:type="dxa"/>
+            <w:shd w:val="clear" w:color="auto" w:fill="D9D9D9"/>
+            <w:vAlign w:val="center"/>
+          </w:tcPr>
+          <w:p>
+            <w:pPr>
+              <w:rPr>
+                <w:rFonts w:ascii="Bodoni MT" w:hAnsi="Bodoni MT"/>
+                <w:b/>
+                <w:bCs/>
+              </w:rPr>
+            </w:pPr>
+            <w:r>
+              <w:rPr>
+                <w:rFonts w:ascii="Bodoni MT" w:hAnsi="Bodoni MT"/>
+                <w:b/>
+                <w:bCs/>
+              </w:rPr>
+              <w:t xml:space="preserve">Parte (Concedente / Concessionario)</w:t>
+            </w:r>
+          </w:p>
+        </w:tc>
+        <w:tc>
+          <w:tcPr>
+            <w:tcW w:w="1300" w:type="dxa"/>
+            <w:shd w:val="clear" w:color="auto" w:fill="D9D9D9"/>
+            <w:vAlign w:val="center"/>
+          </w:tcPr>
+          <w:p>
+            <w:pPr>
+              <w:rPr>
+                <w:rFonts w:ascii="Bodoni MT" w:hAnsi="Bodoni MT"/>
+                <w:b/>
+                <w:bCs/>
+              </w:rPr>
+            </w:pPr>
+            <w:r>
+              <w:rPr>
+                <w:rFonts w:ascii="Bodoni MT" w:hAnsi="Bodoni MT"/>
+                <w:b/>
+                <w:bCs/>
+              </w:rPr>
+              <w:t xml:space="preserve">Data</w:t>
+            </w:r>
+          </w:p>
+        </w:tc>
+        <w:tc>
+          <w:tcPr>
+            <w:tcW w:w="2200" w:type="dxa"/>
+            <w:shd w:val="clear" w:color="auto" w:fill="D9D9D9"/>
+            <w:vAlign w:val="center"/>
+          </w:tcPr>
+          <w:p>
+            <w:pPr>
+              <w:rPr>
+                <w:rFonts w:ascii="Bodoni MT" w:hAnsi="Bodoni MT"/>
+                <w:b/>
+                <w:bCs/>
+              </w:rPr>
+            </w:pPr>
+            <w:r>
+              <w:rPr>
+                <w:rFonts w:ascii="Bodoni MT" w:hAnsi="Bodoni MT"/>
+                <w:b/>
+                <w:bCs/>
+              </w:rPr>
+              <w:t xml:space="preserve">Firma</w:t>
+            </w:r>
+          </w:p>
+        </w:tc>
+      </w:tr>
+      <w:tr>
+        <w:trPr>
+          <w:trHeight w:val="624" w:hRule="atLeast"/>
+        </w:trPr>
+        <w:tc>
+          <w:tcPr>
+            <w:tcW w:w="3000" w:type="dxa"/>
+            <w:vAlign w:val="center"/>
+          </w:tcPr>
+          <w:p>
+            <w:pPr>
+              <w:rPr>
+                <w:rFonts w:ascii="Bodoni MT" w:hAnsi="Bodoni MT"/>
+              </w:rPr>
+            </w:pPr>
+          </w:p>
+        </w:tc>
+        <w:tc>
+          <w:tcPr>
+            <w:tcW w:w="3134" w:type="dxa"/>
+            <w:vAlign w:val="center"/>
+          </w:tcPr>
+          <w:p>
+            <w:pPr>
+              <w:rPr>
+                <w:rFonts w:ascii="Bodoni MT" w:hAnsi="Bodoni MT"/>
+              </w:rPr>
+            </w:pPr>
+          </w:p>
+        </w:tc>
+        <w:tc>
+          <w:tcPr>
+            <w:tcW w:w="1300" w:type="dxa"/>
+            <w:vAlign w:val="center"/>
+          </w:tcPr>
+          <w:p>
+            <w:pPr>
+              <w:rPr>
+                <w:rFonts w:ascii="Bodoni MT" w:hAnsi="Bodoni MT"/>
+              </w:rPr>
+            </w:pPr>
+          </w:p>
+        </w:tc>
+        <w:tc>
+          <w:tcPr>
+            <w:tcW w:w="2200" w:type="dxa"/>
+            <w:vAlign w:val="center"/>
+          </w:tcPr>
+          <w:p>
+            <w:pPr>
+              <w:rPr>
+                <w:rFonts w:ascii="Bodoni MT" w:hAnsi="Bodoni MT"/>
+              </w:rPr>
+            </w:pPr>
+          </w:p>
+        </w:tc>
+      </w:tr>
+      <w:tr>
+        <w:trPr>
+          <w:trHeight w:val="624" w:hRule="atLeast"/>
+        </w:trPr>
+        <w:tc>
+          <w:tcPr>
+            <w:tcW w:w="3000" w:type="dxa"/>
+            <w:vAlign w:val="center"/>
+          </w:tcPr>
+          <w:p>
+            <w:pPr>
+              <w:rPr>
+                <w:rFonts w:ascii="Bodoni MT" w:hAnsi="Bodoni MT"/>
+              </w:rPr>
+            </w:pPr>
+          </w:p>
+        </w:tc>
+        <w:tc>
+          <w:tcPr>
+            <w:tcW w:w="3134" w:type="dxa"/>
+            <w:vAlign w:val="center"/>
+          </w:tcPr>
+          <w:p>
+            <w:pPr>
+              <w:rPr>
+                <w:rFonts w:ascii="Bodoni MT" w:hAnsi="Bodoni MT"/>
+              </w:rPr>
+            </w:pPr>
+          </w:p>
+        </w:tc>
+        <w:tc>
+          <w:tcPr>
+            <w:tcW w:w="1300" w:type="dxa"/>
+            <w:vAlign w:val="center"/>
+          </w:tcPr>
+          <w:p>
+            <w:pPr>
+              <w:rPr>
+                <w:rFonts w:ascii="Bodoni MT" w:hAnsi="Bodoni MT"/>
+              </w:rPr>
+            </w:pPr>
+          </w:p>
+        </w:tc>
+        <w:tc>
+          <w:tcPr>
+            <w:tcW w:w="2200" w:type="dxa"/>
+            <w:vAlign w:val="center"/>
+          </w:tcPr>
+          <w:p>
+            <w:pPr>
+              <w:rPr>
+                <w:rFonts w:ascii="Bodoni MT" w:hAnsi="Bodoni MT"/>
+              </w:rPr>
+            </w:pPr>
+          </w:p>
+        </w:tc>
+      </w:tr>
+      <w:tr>
+        <w:trPr>
+          <w:trHeight w:val="624" w:hRule="atLeast"/>
+        </w:trPr>
+        <w:tc>
+          <w:tcPr>
+            <w:tcW w:w="3000" w:type="dxa"/>
+            <w:vAlign w:val="center"/>
+          </w:tcPr>
+          <w:p>
+            <w:pPr>
+              <w:rPr>
+                <w:rFonts w:ascii="Bodoni MT" w:hAnsi="Bodoni MT"/>
+              </w:rPr>
+            </w:pPr>
+          </w:p>
+        </w:tc>
+        <w:tc>
+          <w:tcPr>
+            <w:tcW w:w="3134" w:type="dxa"/>
+            <w:vAlign w:val="center"/>
+          </w:tcPr>
+          <w:p>
+            <w:pPr>
+              <w:rPr>
+                <w:rFonts w:ascii="Bodoni MT" w:hAnsi="Bodoni MT"/>
+              </w:rPr>
+            </w:pPr>
+          </w:p>
+        </w:tc>
+        <w:tc>
+          <w:tcPr>
+            <w:tcW w:w="1300" w:type="dxa"/>
+            <w:vAlign w:val="center"/>
+          </w:tcPr>
+          <w:p>
+            <w:pPr>
+              <w:rPr>
+                <w:rFonts w:ascii="Bodoni MT" w:hAnsi="Bodoni MT"/>
+              </w:rPr>
+            </w:pPr>
+          </w:p>
+        </w:tc>
+        <w:tc>
+          <w:tcPr>
+            <w:tcW w:w="2200" w:type="dxa"/>
+            <w:vAlign w:val="center"/>
+          </w:tcPr>
+          <w:p>
+            <w:pPr>
+              <w:rPr>
+                <w:rFonts w:ascii="Bodoni MT" w:hAnsi="Bodoni MT"/>
+              </w:rPr>
+            </w:pPr>
+          </w:p>
+        </w:tc>
+      </w:tr>
+      <w:tr>
+        <w:trPr>
+          <w:trHeight w:val="624" w:hRule="atLeast"/>
+        </w:trPr>
+        <w:tc>
+          <w:tcPr>
+            <w:tcW w:w="3000" w:type="dxa"/>
+            <w:vAlign w:val="center"/>
+          </w:tcPr>
+          <w:p>
+            <w:pPr>
+              <w:rPr>
+                <w:rFonts w:ascii="Bodoni MT" w:hAnsi="Bodoni MT"/>
+              </w:rPr>
+            </w:pPr>
+          </w:p>
+        </w:tc>
+        <w:tc>
+          <w:tcPr>
+            <w:tcW w:w="3134" w:type="dxa"/>
+            <w:vAlign w:val="center"/>
+          </w:tcPr>
+          <w:p>
+            <w:pPr>
+              <w:rPr>
+                <w:rFonts w:ascii="Bodoni MT" w:hAnsi="Bodoni MT"/>
+              </w:rPr>
+            </w:pPr>
+          </w:p>
+        </w:tc>
+        <w:tc>
+          <w:tcPr>
+            <w:tcW w:w="1300" w:type="dxa"/>
+            <w:vAlign w:val="center"/>
+          </w:tcPr>
+          <w:p>
+            <w:pPr>
+              <w:rPr>
+                <w:rFonts w:ascii="Bodoni MT" w:hAnsi="Bodoni MT"/>
+              </w:rPr>
+            </w:pPr>
+          </w:p>
+        </w:tc>
+        <w:tc>
+          <w:tcPr>
+            <w:tcW w:w="2200" w:type="dxa"/>
+            <w:vAlign w:val="center"/>
+          </w:tcPr>
+          <w:p>
+            <w:pPr>
+              <w:rPr>
+                <w:rFonts w:ascii="Bodoni MT" w:hAnsi="Bodoni MT"/>
+              </w:rPr>
+            </w:pPr>
+          </w:p>
+        </w:tc>
+      </w:tr>
+      <w:tr>
+        <w:trPr>
+          <w:trHeight w:val="624" w:hRule="atLeast"/>
+        </w:trPr>
+        <w:tc>
+          <w:tcPr>
+            <w:tcW w:w="3000" w:type="dxa"/>
+            <w:vAlign w:val="center"/>
+          </w:tcPr>
+          <w:p>
+            <w:pPr>
+              <w:rPr>
+                <w:rFonts w:ascii="Bodoni MT" w:hAnsi="Bodoni MT"/>
+              </w:rPr>
+            </w:pPr>
+          </w:p>
+        </w:tc>
+        <w:tc>
+          <w:tcPr>
+            <w:tcW w:w="3134" w:type="dxa"/>
+            <w:vAlign w:val="center"/>
+          </w:tcPr>
+          <w:p>
+            <w:pPr>
+              <w:rPr>
+                <w:rFonts w:ascii="Bodoni MT" w:hAnsi="Bodoni MT"/>
+              </w:rPr>
+            </w:pPr>
+          </w:p>
+        </w:tc>
+        <w:tc>
+          <w:tcPr>
+            <w:tcW w:w="1300" w:type="dxa"/>
+            <w:vAlign w:val="center"/>
+          </w:tcPr>
+          <w:p>
+            <w:pPr>
+              <w:rPr>
+                <w:rFonts w:ascii="Bodoni MT" w:hAnsi="Bodoni MT"/>
+              </w:rPr>
+            </w:pPr>
+          </w:p>
+        </w:tc>
+        <w:tc>
+          <w:tcPr>
+            <w:tcW w:w="2200" w:type="dxa"/>
+            <w:vAlign w:val="center"/>
+          </w:tcPr>
+          <w:p>
+            <w:pPr>
+              <w:rPr>
+                <w:rFonts w:ascii="Bodoni MT" w:hAnsi="Bodoni MT"/>
+              </w:rPr>
+            </w:pPr>
+          </w:p>
+        </w:tc>
+      </w:tr>
+      <w:tr>
+        <w:trPr>
+          <w:trHeight w:val="624" w:hRule="atLeast"/>
+        </w:trPr>
+        <w:tc>
+          <w:tcPr>
+            <w:tcW w:w="3000" w:type="dxa"/>
+            <w:vAlign w:val="center"/>
+          </w:tcPr>
+          <w:p>
+            <w:pPr>
+              <w:rPr>
+                <w:rFonts w:ascii="Bodoni MT" w:hAnsi="Bodoni MT"/>
+              </w:rPr>
+            </w:pPr>
+          </w:p>
+        </w:tc>
+        <w:tc>
+          <w:tcPr>
+            <w:tcW w:w="3134" w:type="dxa"/>
+            <w:vAlign w:val="center"/>
+          </w:tcPr>
+          <w:p>
+            <w:pPr>
+              <w:rPr>
+                <w:rFonts w:ascii="Bodoni MT" w:hAnsi="Bodoni MT"/>
+              </w:rPr>
+            </w:pPr>
+          </w:p>
+        </w:tc>
+        <w:tc>
+          <w:tcPr>
+            <w:tcW w:w="1300" w:type="dxa"/>
+            <w:vAlign w:val="center"/>
+          </w:tcPr>
+          <w:p>
+            <w:pPr>
+              <w:rPr>
+                <w:rFonts w:ascii="Bodoni MT" w:hAnsi="Bodoni MT"/>
+              </w:rPr>
+            </w:pPr>
+          </w:p>
+        </w:tc>
+        <w:tc>
+          <w:tcPr>
+            <w:tcW w:w="2200" w:type="dxa"/>
+            <w:vAlign w:val="center"/>
+          </w:tcPr>
+          <w:p>
+            <w:pPr>
+              <w:rPr>
+                <w:rFonts w:ascii="Bodoni MT" w:hAnsi="Bodoni MT"/>
+              </w:rPr>
+            </w:pPr>
+          </w:p>
+        </w:tc>
+      </w:tr>
+      <w:tr>
+        <w:trPr>
+          <w:trHeight w:val="624" w:hRule="atLeast"/>
+        </w:trPr>
+        <w:tc>
+          <w:tcPr>
+            <w:tcW w:w="3000" w:type="dxa"/>
+            <w:vAlign w:val="center"/>
+          </w:tcPr>
+          <w:p>
+            <w:pPr>
+              <w:rPr>
+                <w:rFonts w:ascii="Bodoni MT" w:hAnsi="Bodoni MT"/>
+              </w:rPr>
+            </w:pPr>
+          </w:p>
+        </w:tc>
+        <w:tc>
+          <w:tcPr>
+            <w:tcW w:w="3134" w:type="dxa"/>
+            <w:vAlign w:val="center"/>
+          </w:tcPr>
+          <w:p>
+            <w:pPr>
+              <w:rPr>
+                <w:rFonts w:ascii="Bodoni MT" w:hAnsi="Bodoni MT"/>
+              </w:rPr>
+            </w:pPr>
+          </w:p>
+        </w:tc>
+        <w:tc>
+          <w:tcPr>
+            <w:tcW w:w="1300" w:type="dxa"/>
+            <w:vAlign w:val="center"/>
+          </w:tcPr>
+          <w:p>
+            <w:pPr>
+              <w:rPr>
+                <w:rFonts w:ascii="Bodoni MT" w:hAnsi="Bodoni MT"/>
+              </w:rPr>
+            </w:pPr>
+          </w:p>
+        </w:tc>
+        <w:tc>
+          <w:tcPr>
+            <w:tcW w:w="2200" w:type="dxa"/>
+            <w:vAlign w:val="center"/>
+          </w:tcPr>
+          <w:p>
+            <w:pPr>
+              <w:rPr>
+                <w:rFonts w:ascii="Bodoni MT" w:hAnsi="Bodoni MT"/>
+              </w:rPr>
+            </w:pPr>
+          </w:p>
+        </w:tc>
+      </w:tr>
+      <w:tr>
+        <w:trPr>
+          <w:trHeight w:val="624" w:hRule="atLeast"/>
+        </w:trPr>
+        <w:tc>
+          <w:tcPr>
+            <w:tcW w:w="3000" w:type="dxa"/>
+            <w:vAlign w:val="center"/>
+          </w:tcPr>
+          <w:p>
+            <w:pPr>
+              <w:rPr>
+                <w:rFonts w:ascii="Bodoni MT" w:hAnsi="Bodoni MT"/>
+              </w:rPr>
+            </w:pPr>
+          </w:p>
+        </w:tc>
+        <w:tc>
+          <w:tcPr>
+            <w:tcW w:w="3134" w:type="dxa"/>
+            <w:vAlign w:val="center"/>
+          </w:tcPr>
+          <w:p>
+            <w:pPr>
+              <w:rPr>
+                <w:rFonts w:ascii="Bodoni MT" w:hAnsi="Bodoni MT"/>
+              </w:rPr>
+            </w:pPr>
+          </w:p>
+        </w:tc>
+        <w:tc>
+          <w:tcPr>
+            <w:tcW w:w="1300" w:type="dxa"/>
+            <w:vAlign w:val="center"/>
+          </w:tcPr>
+          <w:p>
+            <w:pPr>
+              <w:rPr>
+                <w:rFonts w:ascii="Bodoni MT" w:hAnsi="Bodoni MT"/>
+              </w:rPr>
+            </w:pPr>
+          </w:p>
+        </w:tc>
+        <w:tc>
+          <w:tcPr>
+            <w:tcW w:w="2200" w:type="dxa"/>
+            <w:vAlign w:val="center"/>
+          </w:tcPr>
+          <w:p>
+            <w:pPr>
+              <w:rPr>
+                <w:rFonts w:ascii="Bodoni MT" w:hAnsi="Bodoni MT"/>
+              </w:rPr>
+            </w:pPr>
+          </w:p>
+        </w:tc>
+      </w:tr>
+      <w:tr>
+        <w:trPr>
+          <w:trHeight w:val="624" w:hRule="atLeast"/>
+        </w:trPr>
+        <w:tc>
+          <w:tcPr>
+            <w:tcW w:w="3000" w:type="dxa"/>
+            <w:vAlign w:val="center"/>
+          </w:tcPr>
+          <w:p>
+            <w:pPr>
+              <w:rPr>
+                <w:rFonts w:ascii="Bodoni MT" w:hAnsi="Bodoni MT"/>
+              </w:rPr>
+            </w:pPr>
+          </w:p>
+        </w:tc>
+        <w:tc>
+          <w:tcPr>
+            <w:tcW w:w="3134" w:type="dxa"/>
+            <w:vAlign w:val="center"/>
+          </w:tcPr>
+          <w:p>
+            <w:pPr>
+              <w:rPr>
+                <w:rFonts w:ascii="Bodoni MT" w:hAnsi="Bodoni MT"/>
+              </w:rPr>
+            </w:pPr>
+          </w:p>
+        </w:tc>
+        <w:tc>
+          <w:tcPr>
+            <w:tcW w:w="1300" w:type="dxa"/>
+            <w:vAlign w:val="center"/>
+          </w:tcPr>
+          <w:p>
+            <w:pPr>
+              <w:rPr>
+                <w:rFonts w:ascii="Bodoni MT" w:hAnsi="Bodoni MT"/>
+              </w:rPr>
+            </w:pPr>
+          </w:p>
+        </w:tc>
+        <w:tc>
+          <w:tcPr>
+            <w:tcW w:w="2200" w:type="dxa"/>
+            <w:vAlign w:val="center"/>
+          </w:tcPr>
+          <w:p>
+            <w:pPr>
+              <w:rPr>
+                <w:rFonts w:ascii="Bodoni MT" w:hAnsi="Bodoni MT"/>
+              </w:rPr>
+            </w:pPr>
+          </w:p>
+        </w:tc>
+      </w:tr>
+      <w:tr>
+        <w:trPr>
+          <w:trHeight w:val="624" w:hRule="atLeast"/>
+        </w:trPr>
+        <w:tc>
+          <w:tcPr>
+            <w:tcW w:w="3000" w:type="dxa"/>
+            <w:vAlign w:val="center"/>
+          </w:tcPr>
+          <w:p>
+            <w:pPr>
+              <w:rPr>
+                <w:rFonts w:ascii="Bodoni MT" w:hAnsi="Bodoni MT"/>
+              </w:rPr>
+            </w:pPr>
+          </w:p>
+        </w:tc>
+        <w:tc>
+          <w:tcPr>
+            <w:tcW w:w="3134" w:type="dxa"/>
+            <w:vAlign w:val="center"/>
+          </w:tcPr>
+          <w:p>
+            <w:pPr>
+              <w:rPr>
+                <w:rFonts w:ascii="Bodoni MT" w:hAnsi="Bodoni MT"/>
+              </w:rPr>
+            </w:pPr>
+          </w:p>
+        </w:tc>
+        <w:tc>
+          <w:tcPr>
+            <w:tcW w:w="1300" w:type="dxa"/>
+            <w:vAlign w:val="center"/>
+          </w:tcPr>
+          <w:p>
+            <w:pPr>
+              <w:rPr>
+                <w:rFonts w:ascii="Bodoni MT" w:hAnsi="Bodoni MT"/>
+              </w:rPr>
+            </w:pPr>
+          </w:p>
+        </w:tc>
+        <w:tc>
+          <w:tcPr>
+            <w:tcW w:w="2200" w:type="dxa"/>
+            <w:vAlign w:val="center"/>
+          </w:tcPr>
+          <w:p>
+            <w:pPr>
+              <w:rPr>
+                <w:rFonts w:ascii="Bodoni MT" w:hAnsi="Bodoni MT"/>
+              </w:rPr>
+            </w:pPr>
+          </w:p>
+        </w:tc>
+      </w:tr>
+    </w:tbl>
     <w:sectPr>
       <w:footerReference w:type="default" r:id="rId7"/>
       <w:pgSz w:w="11906" w:h="16838"/>

</xml_diff>

<commit_message>
Affina impaginazione e contenuti delle check list
- Riferimenti parti: rimosso il telefono, lasciata solo l'E-mail
- SCOPO riscritto in forma sintetica e puntuale per ciascun documento
  (verifica e controllo degli impianti/opere specifici), con rinvio degli
  eventuali addendum alla sezione Note e relazioni
- Sezione Note e relazioni con righe rigate per la scrittura a mano
- Impaginazione: intestazioni unite alle tabelle (keepNext), righe non
  divisibili tra pagine (cantSplit), riga di intestazione ripetuta,
  spaziature uniformi
</commit_message>
<xml_diff>
--- a/Check_List_PAVIA_LENA/Check_List_PAVIA_LENA_2026_06_09_EDILE.docx
+++ b/Check_List_PAVIA_LENA/Check_List_PAVIA_LENA_2026_06_09_EDILE.docx
@@ -74,6 +74,7 @@
     <w:p>
       <w:pPr>
         <w:jc w:val="both"/>
+        <w:spacing w:after="120"/>
         <w:rPr>
           <w:rFonts w:ascii="Bodoni MT" w:hAnsi="Bodoni MT"/>
           <w:sz w:val="22"/>
@@ -86,21 +87,13 @@
           <w:sz w:val="22"/>
           <w:szCs w:val="22"/>
         </w:rPr>
-        <w:t xml:space="preserve">Il presente verbale documenta le attività di verifica documentale e dello stato dei luoghi e degli impianti effettuate ai fini della presa in carico da parte del Concessionario. Le parti di seguito indicate danno atto della propria presenza alle operazioni di verifica. Le note, le osservazioni e le eventuali relazioni sono riportate nell’apposita sezione e il documento è sottoscritto dalle parti al termine della verifica.</w:t>
+        <w:t xml:space="preserve">Il presente verbale documenta le attività di verifica e controllo dello stato dei luoghi e degli impianti, effettuate ai fini della presa in carico da parte del Concessionario. Le parti di seguito indicate danno atto della propria presenza alle operazioni di verifica. Le note, le osservazioni e le eventuali relazioni sono riportate nell’apposita sezione e il documento è sottoscritto dalle parti al termine della verifica.</w:t>
       </w:r>
     </w:p>
     <w:p>
       <w:pPr>
-        <w:rPr>
-          <w:rFonts w:ascii="Bodoni MT" w:hAnsi="Bodoni MT"/>
-          <w:sz w:val="12"/>
-          <w:szCs w:val="12"/>
-        </w:rPr>
-      </w:pPr>
-    </w:p>
-    <w:p>
-      <w:pPr>
         <w:pStyle w:val="Titolo1"/>
+        <w:keepNext/>
         <w:rPr>
           <w:rFonts w:ascii="Bodoni MT" w:hAnsi="Bodoni MT"/>
           <w:i/>
@@ -122,7 +115,8 @@
     </w:p>
     <w:p>
       <w:pPr>
-        <w:spacing w:before="80"/>
+        <w:keepNext/>
+        <w:spacing w:before="120"/>
         <w:rPr>
           <w:rFonts w:ascii="Bodoni MT" w:hAnsi="Bodoni MT"/>
           <w:b/>
@@ -139,7 +133,7 @@
           <w:sz w:val="22"/>
           <w:szCs w:val="22"/>
         </w:rPr>
-        <w:t xml:space="preserve">Concedente — L.E.N.A., Università degli Studi di Pavia</w:t>
+        <w:t xml:space="preserve">Concedente — L.E.N.A., Università degli Studi di Pavia</w:t>
       </w:r>
     </w:p>
     <w:tbl>
@@ -150,17 +144,18 @@
         <w:tblLook w:val="04A0" w:firstRow="1" w:lastRow="0" w:firstColumn="1" w:lastColumn="0" w:noHBand="0" w:noVBand="1"/>
       </w:tblPr>
       <w:tblGrid>
-        <w:gridCol w:w="3400"/>
-        <w:gridCol w:w="3000"/>
-        <w:gridCol w:w="3234"/>
+        <w:gridCol w:w="3300"/>
+        <w:gridCol w:w="2900"/>
+        <w:gridCol w:w="3434"/>
       </w:tblGrid>
       <w:tr>
         <w:trPr>
           <w:tblHeader/>
+          <w:cantSplit/>
         </w:trPr>
         <w:tc>
           <w:tcPr>
-            <w:tcW w:w="3400" w:type="dxa"/>
+            <w:tcW w:w="3300" w:type="dxa"/>
             <w:shd w:val="clear" w:color="auto" w:fill="D9D9D9"/>
             <w:vAlign w:val="center"/>
           </w:tcPr>
@@ -184,7 +179,7 @@
         </w:tc>
         <w:tc>
           <w:tcPr>
-            <w:tcW w:w="3000" w:type="dxa"/>
+            <w:tcW w:w="2900" w:type="dxa"/>
             <w:shd w:val="clear" w:color="auto" w:fill="D9D9D9"/>
             <w:vAlign w:val="center"/>
           </w:tcPr>
@@ -208,7 +203,7 @@
         </w:tc>
         <w:tc>
           <w:tcPr>
-            <w:tcW w:w="3234" w:type="dxa"/>
+            <w:tcW w:w="3434" w:type="dxa"/>
             <w:shd w:val="clear" w:color="auto" w:fill="D9D9D9"/>
             <w:vAlign w:val="center"/>
           </w:tcPr>
@@ -226,7 +221,7 @@
                 <w:b/>
                 <w:bCs/>
               </w:rPr>
-              <w:t xml:space="preserve">Recapito (tel. / e-mail)</w:t>
+              <w:t xml:space="preserve">E-mail</w:t>
             </w:r>
           </w:p>
         </w:tc>
@@ -234,36 +229,37 @@
       <w:tr>
         <w:trPr>
           <w:trHeight w:val="454" w:hRule="atLeast"/>
+          <w:cantSplit/>
         </w:trPr>
         <w:tc>
           <w:tcPr>
-            <w:tcW w:w="3400" w:type="dxa"/>
-            <w:vAlign w:val="center"/>
-          </w:tcPr>
-          <w:p>
-            <w:pPr>
-              <w:rPr>
-                <w:rFonts w:ascii="Bodoni MT" w:hAnsi="Bodoni MT"/>
-              </w:rPr>
-            </w:pPr>
-          </w:p>
-        </w:tc>
-        <w:tc>
-          <w:tcPr>
-            <w:tcW w:w="3000" w:type="dxa"/>
-            <w:vAlign w:val="center"/>
-          </w:tcPr>
-          <w:p>
-            <w:pPr>
-              <w:rPr>
-                <w:rFonts w:ascii="Bodoni MT" w:hAnsi="Bodoni MT"/>
-              </w:rPr>
-            </w:pPr>
-          </w:p>
-        </w:tc>
-        <w:tc>
-          <w:tcPr>
-            <w:tcW w:w="3234" w:type="dxa"/>
+            <w:tcW w:w="3300" w:type="dxa"/>
+            <w:vAlign w:val="center"/>
+          </w:tcPr>
+          <w:p>
+            <w:pPr>
+              <w:rPr>
+                <w:rFonts w:ascii="Bodoni MT" w:hAnsi="Bodoni MT"/>
+              </w:rPr>
+            </w:pPr>
+          </w:p>
+        </w:tc>
+        <w:tc>
+          <w:tcPr>
+            <w:tcW w:w="2900" w:type="dxa"/>
+            <w:vAlign w:val="center"/>
+          </w:tcPr>
+          <w:p>
+            <w:pPr>
+              <w:rPr>
+                <w:rFonts w:ascii="Bodoni MT" w:hAnsi="Bodoni MT"/>
+              </w:rPr>
+            </w:pPr>
+          </w:p>
+        </w:tc>
+        <w:tc>
+          <w:tcPr>
+            <w:tcW w:w="3434" w:type="dxa"/>
             <w:vAlign w:val="center"/>
           </w:tcPr>
           <w:p>
@@ -278,36 +274,37 @@
       <w:tr>
         <w:trPr>
           <w:trHeight w:val="454" w:hRule="atLeast"/>
+          <w:cantSplit/>
         </w:trPr>
         <w:tc>
           <w:tcPr>
-            <w:tcW w:w="3400" w:type="dxa"/>
-            <w:vAlign w:val="center"/>
-          </w:tcPr>
-          <w:p>
-            <w:pPr>
-              <w:rPr>
-                <w:rFonts w:ascii="Bodoni MT" w:hAnsi="Bodoni MT"/>
-              </w:rPr>
-            </w:pPr>
-          </w:p>
-        </w:tc>
-        <w:tc>
-          <w:tcPr>
-            <w:tcW w:w="3000" w:type="dxa"/>
-            <w:vAlign w:val="center"/>
-          </w:tcPr>
-          <w:p>
-            <w:pPr>
-              <w:rPr>
-                <w:rFonts w:ascii="Bodoni MT" w:hAnsi="Bodoni MT"/>
-              </w:rPr>
-            </w:pPr>
-          </w:p>
-        </w:tc>
-        <w:tc>
-          <w:tcPr>
-            <w:tcW w:w="3234" w:type="dxa"/>
+            <w:tcW w:w="3300" w:type="dxa"/>
+            <w:vAlign w:val="center"/>
+          </w:tcPr>
+          <w:p>
+            <w:pPr>
+              <w:rPr>
+                <w:rFonts w:ascii="Bodoni MT" w:hAnsi="Bodoni MT"/>
+              </w:rPr>
+            </w:pPr>
+          </w:p>
+        </w:tc>
+        <w:tc>
+          <w:tcPr>
+            <w:tcW w:w="2900" w:type="dxa"/>
+            <w:vAlign w:val="center"/>
+          </w:tcPr>
+          <w:p>
+            <w:pPr>
+              <w:rPr>
+                <w:rFonts w:ascii="Bodoni MT" w:hAnsi="Bodoni MT"/>
+              </w:rPr>
+            </w:pPr>
+          </w:p>
+        </w:tc>
+        <w:tc>
+          <w:tcPr>
+            <w:tcW w:w="3434" w:type="dxa"/>
             <w:vAlign w:val="center"/>
           </w:tcPr>
           <w:p>
@@ -322,36 +319,37 @@
       <w:tr>
         <w:trPr>
           <w:trHeight w:val="454" w:hRule="atLeast"/>
+          <w:cantSplit/>
         </w:trPr>
         <w:tc>
           <w:tcPr>
-            <w:tcW w:w="3400" w:type="dxa"/>
-            <w:vAlign w:val="center"/>
-          </w:tcPr>
-          <w:p>
-            <w:pPr>
-              <w:rPr>
-                <w:rFonts w:ascii="Bodoni MT" w:hAnsi="Bodoni MT"/>
-              </w:rPr>
-            </w:pPr>
-          </w:p>
-        </w:tc>
-        <w:tc>
-          <w:tcPr>
-            <w:tcW w:w="3000" w:type="dxa"/>
-            <w:vAlign w:val="center"/>
-          </w:tcPr>
-          <w:p>
-            <w:pPr>
-              <w:rPr>
-                <w:rFonts w:ascii="Bodoni MT" w:hAnsi="Bodoni MT"/>
-              </w:rPr>
-            </w:pPr>
-          </w:p>
-        </w:tc>
-        <w:tc>
-          <w:tcPr>
-            <w:tcW w:w="3234" w:type="dxa"/>
+            <w:tcW w:w="3300" w:type="dxa"/>
+            <w:vAlign w:val="center"/>
+          </w:tcPr>
+          <w:p>
+            <w:pPr>
+              <w:rPr>
+                <w:rFonts w:ascii="Bodoni MT" w:hAnsi="Bodoni MT"/>
+              </w:rPr>
+            </w:pPr>
+          </w:p>
+        </w:tc>
+        <w:tc>
+          <w:tcPr>
+            <w:tcW w:w="2900" w:type="dxa"/>
+            <w:vAlign w:val="center"/>
+          </w:tcPr>
+          <w:p>
+            <w:pPr>
+              <w:rPr>
+                <w:rFonts w:ascii="Bodoni MT" w:hAnsi="Bodoni MT"/>
+              </w:rPr>
+            </w:pPr>
+          </w:p>
+        </w:tc>
+        <w:tc>
+          <w:tcPr>
+            <w:tcW w:w="3434" w:type="dxa"/>
             <w:vAlign w:val="center"/>
           </w:tcPr>
           <w:p>
@@ -366,36 +364,37 @@
       <w:tr>
         <w:trPr>
           <w:trHeight w:val="454" w:hRule="atLeast"/>
+          <w:cantSplit/>
         </w:trPr>
         <w:tc>
           <w:tcPr>
-            <w:tcW w:w="3400" w:type="dxa"/>
-            <w:vAlign w:val="center"/>
-          </w:tcPr>
-          <w:p>
-            <w:pPr>
-              <w:rPr>
-                <w:rFonts w:ascii="Bodoni MT" w:hAnsi="Bodoni MT"/>
-              </w:rPr>
-            </w:pPr>
-          </w:p>
-        </w:tc>
-        <w:tc>
-          <w:tcPr>
-            <w:tcW w:w="3000" w:type="dxa"/>
-            <w:vAlign w:val="center"/>
-          </w:tcPr>
-          <w:p>
-            <w:pPr>
-              <w:rPr>
-                <w:rFonts w:ascii="Bodoni MT" w:hAnsi="Bodoni MT"/>
-              </w:rPr>
-            </w:pPr>
-          </w:p>
-        </w:tc>
-        <w:tc>
-          <w:tcPr>
-            <w:tcW w:w="3234" w:type="dxa"/>
+            <w:tcW w:w="3300" w:type="dxa"/>
+            <w:vAlign w:val="center"/>
+          </w:tcPr>
+          <w:p>
+            <w:pPr>
+              <w:rPr>
+                <w:rFonts w:ascii="Bodoni MT" w:hAnsi="Bodoni MT"/>
+              </w:rPr>
+            </w:pPr>
+          </w:p>
+        </w:tc>
+        <w:tc>
+          <w:tcPr>
+            <w:tcW w:w="2900" w:type="dxa"/>
+            <w:vAlign w:val="center"/>
+          </w:tcPr>
+          <w:p>
+            <w:pPr>
+              <w:rPr>
+                <w:rFonts w:ascii="Bodoni MT" w:hAnsi="Bodoni MT"/>
+              </w:rPr>
+            </w:pPr>
+          </w:p>
+        </w:tc>
+        <w:tc>
+          <w:tcPr>
+            <w:tcW w:w="3434" w:type="dxa"/>
             <w:vAlign w:val="center"/>
           </w:tcPr>
           <w:p>
@@ -410,36 +409,37 @@
       <w:tr>
         <w:trPr>
           <w:trHeight w:val="454" w:hRule="atLeast"/>
+          <w:cantSplit/>
         </w:trPr>
         <w:tc>
           <w:tcPr>
-            <w:tcW w:w="3400" w:type="dxa"/>
-            <w:vAlign w:val="center"/>
-          </w:tcPr>
-          <w:p>
-            <w:pPr>
-              <w:rPr>
-                <w:rFonts w:ascii="Bodoni MT" w:hAnsi="Bodoni MT"/>
-              </w:rPr>
-            </w:pPr>
-          </w:p>
-        </w:tc>
-        <w:tc>
-          <w:tcPr>
-            <w:tcW w:w="3000" w:type="dxa"/>
-            <w:vAlign w:val="center"/>
-          </w:tcPr>
-          <w:p>
-            <w:pPr>
-              <w:rPr>
-                <w:rFonts w:ascii="Bodoni MT" w:hAnsi="Bodoni MT"/>
-              </w:rPr>
-            </w:pPr>
-          </w:p>
-        </w:tc>
-        <w:tc>
-          <w:tcPr>
-            <w:tcW w:w="3234" w:type="dxa"/>
+            <w:tcW w:w="3300" w:type="dxa"/>
+            <w:vAlign w:val="center"/>
+          </w:tcPr>
+          <w:p>
+            <w:pPr>
+              <w:rPr>
+                <w:rFonts w:ascii="Bodoni MT" w:hAnsi="Bodoni MT"/>
+              </w:rPr>
+            </w:pPr>
+          </w:p>
+        </w:tc>
+        <w:tc>
+          <w:tcPr>
+            <w:tcW w:w="2900" w:type="dxa"/>
+            <w:vAlign w:val="center"/>
+          </w:tcPr>
+          <w:p>
+            <w:pPr>
+              <w:rPr>
+                <w:rFonts w:ascii="Bodoni MT" w:hAnsi="Bodoni MT"/>
+              </w:rPr>
+            </w:pPr>
+          </w:p>
+        </w:tc>
+        <w:tc>
+          <w:tcPr>
+            <w:tcW w:w="3434" w:type="dxa"/>
             <w:vAlign w:val="center"/>
           </w:tcPr>
           <w:p>
@@ -454,7 +454,8 @@
     </w:tbl>
     <w:p>
       <w:pPr>
-        <w:spacing w:before="160"/>
+        <w:keepNext/>
+        <w:spacing w:before="200"/>
         <w:rPr>
           <w:rFonts w:ascii="Bodoni MT" w:hAnsi="Bodoni MT"/>
           <w:b/>
@@ -482,17 +483,18 @@
         <w:tblLook w:val="04A0" w:firstRow="1" w:lastRow="0" w:firstColumn="1" w:lastColumn="0" w:noHBand="0" w:noVBand="1"/>
       </w:tblPr>
       <w:tblGrid>
-        <w:gridCol w:w="3400"/>
-        <w:gridCol w:w="3000"/>
-        <w:gridCol w:w="3234"/>
+        <w:gridCol w:w="3300"/>
+        <w:gridCol w:w="2900"/>
+        <w:gridCol w:w="3434"/>
       </w:tblGrid>
       <w:tr>
         <w:trPr>
           <w:tblHeader/>
+          <w:cantSplit/>
         </w:trPr>
         <w:tc>
           <w:tcPr>
-            <w:tcW w:w="3400" w:type="dxa"/>
+            <w:tcW w:w="3300" w:type="dxa"/>
             <w:shd w:val="clear" w:color="auto" w:fill="D9D9D9"/>
             <w:vAlign w:val="center"/>
           </w:tcPr>
@@ -516,7 +518,7 @@
         </w:tc>
         <w:tc>
           <w:tcPr>
-            <w:tcW w:w="3000" w:type="dxa"/>
+            <w:tcW w:w="2900" w:type="dxa"/>
             <w:shd w:val="clear" w:color="auto" w:fill="D9D9D9"/>
             <w:vAlign w:val="center"/>
           </w:tcPr>
@@ -540,7 +542,7 @@
         </w:tc>
         <w:tc>
           <w:tcPr>
-            <w:tcW w:w="3234" w:type="dxa"/>
+            <w:tcW w:w="3434" w:type="dxa"/>
             <w:shd w:val="clear" w:color="auto" w:fill="D9D9D9"/>
             <w:vAlign w:val="center"/>
           </w:tcPr>
@@ -558,7 +560,7 @@
                 <w:b/>
                 <w:bCs/>
               </w:rPr>
-              <w:t xml:space="preserve">Recapito (tel. / e-mail)</w:t>
+              <w:t xml:space="preserve">E-mail</w:t>
             </w:r>
           </w:p>
         </w:tc>
@@ -566,36 +568,37 @@
       <w:tr>
         <w:trPr>
           <w:trHeight w:val="454" w:hRule="atLeast"/>
+          <w:cantSplit/>
         </w:trPr>
         <w:tc>
           <w:tcPr>
-            <w:tcW w:w="3400" w:type="dxa"/>
-            <w:vAlign w:val="center"/>
-          </w:tcPr>
-          <w:p>
-            <w:pPr>
-              <w:rPr>
-                <w:rFonts w:ascii="Bodoni MT" w:hAnsi="Bodoni MT"/>
-              </w:rPr>
-            </w:pPr>
-          </w:p>
-        </w:tc>
-        <w:tc>
-          <w:tcPr>
-            <w:tcW w:w="3000" w:type="dxa"/>
-            <w:vAlign w:val="center"/>
-          </w:tcPr>
-          <w:p>
-            <w:pPr>
-              <w:rPr>
-                <w:rFonts w:ascii="Bodoni MT" w:hAnsi="Bodoni MT"/>
-              </w:rPr>
-            </w:pPr>
-          </w:p>
-        </w:tc>
-        <w:tc>
-          <w:tcPr>
-            <w:tcW w:w="3234" w:type="dxa"/>
+            <w:tcW w:w="3300" w:type="dxa"/>
+            <w:vAlign w:val="center"/>
+          </w:tcPr>
+          <w:p>
+            <w:pPr>
+              <w:rPr>
+                <w:rFonts w:ascii="Bodoni MT" w:hAnsi="Bodoni MT"/>
+              </w:rPr>
+            </w:pPr>
+          </w:p>
+        </w:tc>
+        <w:tc>
+          <w:tcPr>
+            <w:tcW w:w="2900" w:type="dxa"/>
+            <w:vAlign w:val="center"/>
+          </w:tcPr>
+          <w:p>
+            <w:pPr>
+              <w:rPr>
+                <w:rFonts w:ascii="Bodoni MT" w:hAnsi="Bodoni MT"/>
+              </w:rPr>
+            </w:pPr>
+          </w:p>
+        </w:tc>
+        <w:tc>
+          <w:tcPr>
+            <w:tcW w:w="3434" w:type="dxa"/>
             <w:vAlign w:val="center"/>
           </w:tcPr>
           <w:p>
@@ -610,36 +613,37 @@
       <w:tr>
         <w:trPr>
           <w:trHeight w:val="454" w:hRule="atLeast"/>
+          <w:cantSplit/>
         </w:trPr>
         <w:tc>
           <w:tcPr>
-            <w:tcW w:w="3400" w:type="dxa"/>
-            <w:vAlign w:val="center"/>
-          </w:tcPr>
-          <w:p>
-            <w:pPr>
-              <w:rPr>
-                <w:rFonts w:ascii="Bodoni MT" w:hAnsi="Bodoni MT"/>
-              </w:rPr>
-            </w:pPr>
-          </w:p>
-        </w:tc>
-        <w:tc>
-          <w:tcPr>
-            <w:tcW w:w="3000" w:type="dxa"/>
-            <w:vAlign w:val="center"/>
-          </w:tcPr>
-          <w:p>
-            <w:pPr>
-              <w:rPr>
-                <w:rFonts w:ascii="Bodoni MT" w:hAnsi="Bodoni MT"/>
-              </w:rPr>
-            </w:pPr>
-          </w:p>
-        </w:tc>
-        <w:tc>
-          <w:tcPr>
-            <w:tcW w:w="3234" w:type="dxa"/>
+            <w:tcW w:w="3300" w:type="dxa"/>
+            <w:vAlign w:val="center"/>
+          </w:tcPr>
+          <w:p>
+            <w:pPr>
+              <w:rPr>
+                <w:rFonts w:ascii="Bodoni MT" w:hAnsi="Bodoni MT"/>
+              </w:rPr>
+            </w:pPr>
+          </w:p>
+        </w:tc>
+        <w:tc>
+          <w:tcPr>
+            <w:tcW w:w="2900" w:type="dxa"/>
+            <w:vAlign w:val="center"/>
+          </w:tcPr>
+          <w:p>
+            <w:pPr>
+              <w:rPr>
+                <w:rFonts w:ascii="Bodoni MT" w:hAnsi="Bodoni MT"/>
+              </w:rPr>
+            </w:pPr>
+          </w:p>
+        </w:tc>
+        <w:tc>
+          <w:tcPr>
+            <w:tcW w:w="3434" w:type="dxa"/>
             <w:vAlign w:val="center"/>
           </w:tcPr>
           <w:p>
@@ -654,36 +658,37 @@
       <w:tr>
         <w:trPr>
           <w:trHeight w:val="454" w:hRule="atLeast"/>
+          <w:cantSplit/>
         </w:trPr>
         <w:tc>
           <w:tcPr>
-            <w:tcW w:w="3400" w:type="dxa"/>
-            <w:vAlign w:val="center"/>
-          </w:tcPr>
-          <w:p>
-            <w:pPr>
-              <w:rPr>
-                <w:rFonts w:ascii="Bodoni MT" w:hAnsi="Bodoni MT"/>
-              </w:rPr>
-            </w:pPr>
-          </w:p>
-        </w:tc>
-        <w:tc>
-          <w:tcPr>
-            <w:tcW w:w="3000" w:type="dxa"/>
-            <w:vAlign w:val="center"/>
-          </w:tcPr>
-          <w:p>
-            <w:pPr>
-              <w:rPr>
-                <w:rFonts w:ascii="Bodoni MT" w:hAnsi="Bodoni MT"/>
-              </w:rPr>
-            </w:pPr>
-          </w:p>
-        </w:tc>
-        <w:tc>
-          <w:tcPr>
-            <w:tcW w:w="3234" w:type="dxa"/>
+            <w:tcW w:w="3300" w:type="dxa"/>
+            <w:vAlign w:val="center"/>
+          </w:tcPr>
+          <w:p>
+            <w:pPr>
+              <w:rPr>
+                <w:rFonts w:ascii="Bodoni MT" w:hAnsi="Bodoni MT"/>
+              </w:rPr>
+            </w:pPr>
+          </w:p>
+        </w:tc>
+        <w:tc>
+          <w:tcPr>
+            <w:tcW w:w="2900" w:type="dxa"/>
+            <w:vAlign w:val="center"/>
+          </w:tcPr>
+          <w:p>
+            <w:pPr>
+              <w:rPr>
+                <w:rFonts w:ascii="Bodoni MT" w:hAnsi="Bodoni MT"/>
+              </w:rPr>
+            </w:pPr>
+          </w:p>
+        </w:tc>
+        <w:tc>
+          <w:tcPr>
+            <w:tcW w:w="3434" w:type="dxa"/>
             <w:vAlign w:val="center"/>
           </w:tcPr>
           <w:p>
@@ -698,36 +703,37 @@
       <w:tr>
         <w:trPr>
           <w:trHeight w:val="454" w:hRule="atLeast"/>
+          <w:cantSplit/>
         </w:trPr>
         <w:tc>
           <w:tcPr>
-            <w:tcW w:w="3400" w:type="dxa"/>
-            <w:vAlign w:val="center"/>
-          </w:tcPr>
-          <w:p>
-            <w:pPr>
-              <w:rPr>
-                <w:rFonts w:ascii="Bodoni MT" w:hAnsi="Bodoni MT"/>
-              </w:rPr>
-            </w:pPr>
-          </w:p>
-        </w:tc>
-        <w:tc>
-          <w:tcPr>
-            <w:tcW w:w="3000" w:type="dxa"/>
-            <w:vAlign w:val="center"/>
-          </w:tcPr>
-          <w:p>
-            <w:pPr>
-              <w:rPr>
-                <w:rFonts w:ascii="Bodoni MT" w:hAnsi="Bodoni MT"/>
-              </w:rPr>
-            </w:pPr>
-          </w:p>
-        </w:tc>
-        <w:tc>
-          <w:tcPr>
-            <w:tcW w:w="3234" w:type="dxa"/>
+            <w:tcW w:w="3300" w:type="dxa"/>
+            <w:vAlign w:val="center"/>
+          </w:tcPr>
+          <w:p>
+            <w:pPr>
+              <w:rPr>
+                <w:rFonts w:ascii="Bodoni MT" w:hAnsi="Bodoni MT"/>
+              </w:rPr>
+            </w:pPr>
+          </w:p>
+        </w:tc>
+        <w:tc>
+          <w:tcPr>
+            <w:tcW w:w="2900" w:type="dxa"/>
+            <w:vAlign w:val="center"/>
+          </w:tcPr>
+          <w:p>
+            <w:pPr>
+              <w:rPr>
+                <w:rFonts w:ascii="Bodoni MT" w:hAnsi="Bodoni MT"/>
+              </w:rPr>
+            </w:pPr>
+          </w:p>
+        </w:tc>
+        <w:tc>
+          <w:tcPr>
+            <w:tcW w:w="3434" w:type="dxa"/>
             <w:vAlign w:val="center"/>
           </w:tcPr>
           <w:p>
@@ -742,36 +748,37 @@
       <w:tr>
         <w:trPr>
           <w:trHeight w:val="454" w:hRule="atLeast"/>
+          <w:cantSplit/>
         </w:trPr>
         <w:tc>
           <w:tcPr>
-            <w:tcW w:w="3400" w:type="dxa"/>
-            <w:vAlign w:val="center"/>
-          </w:tcPr>
-          <w:p>
-            <w:pPr>
-              <w:rPr>
-                <w:rFonts w:ascii="Bodoni MT" w:hAnsi="Bodoni MT"/>
-              </w:rPr>
-            </w:pPr>
-          </w:p>
-        </w:tc>
-        <w:tc>
-          <w:tcPr>
-            <w:tcW w:w="3000" w:type="dxa"/>
-            <w:vAlign w:val="center"/>
-          </w:tcPr>
-          <w:p>
-            <w:pPr>
-              <w:rPr>
-                <w:rFonts w:ascii="Bodoni MT" w:hAnsi="Bodoni MT"/>
-              </w:rPr>
-            </w:pPr>
-          </w:p>
-        </w:tc>
-        <w:tc>
-          <w:tcPr>
-            <w:tcW w:w="3234" w:type="dxa"/>
+            <w:tcW w:w="3300" w:type="dxa"/>
+            <w:vAlign w:val="center"/>
+          </w:tcPr>
+          <w:p>
+            <w:pPr>
+              <w:rPr>
+                <w:rFonts w:ascii="Bodoni MT" w:hAnsi="Bodoni MT"/>
+              </w:rPr>
+            </w:pPr>
+          </w:p>
+        </w:tc>
+        <w:tc>
+          <w:tcPr>
+            <w:tcW w:w="2900" w:type="dxa"/>
+            <w:vAlign w:val="center"/>
+          </w:tcPr>
+          <w:p>
+            <w:pPr>
+              <w:rPr>
+                <w:rFonts w:ascii="Bodoni MT" w:hAnsi="Bodoni MT"/>
+              </w:rPr>
+            </w:pPr>
+          </w:p>
+        </w:tc>
+        <w:tc>
+          <w:tcPr>
+            <w:tcW w:w="3434" w:type="dxa"/>
             <w:vAlign w:val="center"/>
           </w:tcPr>
           <w:p>
@@ -820,88 +827,13 @@
           <w:iCs/>
         </w:rPr>
       </w:pPr>
-      <w:r>
-        <w:rPr>
-          <w:rFonts w:ascii="Bodoni MT" w:hAnsi="Bodoni MT"/>
-        </w:rPr>
-        <w:tab/>
-        <w:t>Scopo del presente documento</w:t>
-      </w:r>
-      <w:r>
-        <w:rPr>
-          <w:rFonts w:ascii="Bodoni MT" w:hAnsi="Bodoni MT"/>
-        </w:rPr>
-        <w:t xml:space="preserve"> è elencare una lista </w:t>
-      </w:r>
-      <w:r>
-        <w:rPr>
-          <w:rFonts w:ascii="Bodoni MT" w:hAnsi="Bodoni MT"/>
-        </w:rPr>
-        <w:t xml:space="preserve">non esaustiva </w:t>
-      </w:r>
-      <w:r>
-        <w:rPr>
-          <w:rFonts w:ascii="Bodoni MT" w:hAnsi="Bodoni MT"/>
-        </w:rPr>
-        <w:t xml:space="preserve">di documenti e di controlli da effettuare </w:t>
-      </w:r>
-      <w:r>
-        <w:rPr>
-          <w:rFonts w:ascii="Bodoni MT" w:hAnsi="Bodoni MT"/>
-        </w:rPr>
-        <w:t>sulla parte EDILE</w:t>
-      </w:r>
-      <w:r>
-        <w:rPr>
-          <w:rFonts w:ascii="Bodoni MT" w:hAnsi="Bodoni MT"/>
-        </w:rPr>
-        <w:t xml:space="preserve"> </w:t>
-      </w:r>
-      <w:r>
-        <w:rPr>
-          <w:rFonts w:ascii="Bodoni MT" w:hAnsi="Bodoni MT"/>
-        </w:rPr>
-        <w:t>che ospita</w:t>
-      </w:r>
-      <w:r>
-        <w:rPr>
-          <w:rFonts w:ascii="Bodoni MT" w:hAnsi="Bodoni MT"/>
-        </w:rPr>
-        <w:t xml:space="preserve"> </w:t>
-      </w:r>
-      <w:r>
-        <w:rPr>
-          <w:rFonts w:ascii="Bodoni MT" w:hAnsi="Bodoni MT"/>
-        </w:rPr>
-        <w:t>i</w:t>
-      </w:r>
-      <w:r>
-        <w:rPr>
-          <w:rFonts w:ascii="Bodoni MT" w:hAnsi="Bodoni MT"/>
-        </w:rPr>
-        <w:t xml:space="preserve">l ciclotrone </w:t>
-      </w:r>
       <w:proofErr w:type="spellStart"/>
-      <w:r>
-        <w:rPr>
-          <w:rFonts w:ascii="Bodoni MT" w:hAnsi="Bodoni MT"/>
-        </w:rPr>
-        <w:t>Cyclone</w:t>
-      </w:r>
       <w:proofErr w:type="spellEnd"/>
       <w:r>
         <w:rPr>
           <w:rFonts w:ascii="Bodoni MT" w:hAnsi="Bodoni MT"/>
         </w:rPr>
-        <w:t xml:space="preserve"> 18/9 del L.E.N.A di Pavia prima della sua presa in carico da parte di ITEL</w:t>
-      </w:r>
-      <w:r>
-        <w:rPr>
-          <w:rFonts w:ascii="Bodoni MT" w:hAnsi="Bodoni MT"/>
-          <w:i/>
-          <w:iCs/>
-        </w:rPr>
-        <w:t>.</w:t>
+        <w:t xml:space="preserve">Verifica e controllo delle opere edili e strutturali dei locali che ospitano il ciclotrone Cyclone 18/9 del L.E.N.A. di Pavia, ai fini della presa in carico da parte di ITEL. Eventuali addendum e specifiche di dettaglio saranno riportati nella sezione «Note e relazioni».</w:t>
       </w:r>
     </w:p>
     <w:p>
@@ -2527,6 +2459,7 @@
     <w:p>
       <w:pPr>
         <w:pStyle w:val="Titolo1"/>
+        <w:keepNext/>
         <w:rPr>
           <w:rFonts w:ascii="Bodoni MT" w:hAnsi="Bodoni MT"/>
           <w:i/>
@@ -2548,6 +2481,7 @@
     </w:p>
     <w:p>
       <w:pPr>
+        <w:spacing w:after="160"/>
         <w:rPr>
           <w:rFonts w:ascii="Bodoni MT" w:hAnsi="Bodoni MT"/>
           <w:i/>
@@ -2567,38 +2501,164 @@
         <w:t xml:space="preserve">Note, osservazioni ed eventuali relazioni redatte a seguito della verifica e prima della sottoscrizione:</w:t>
       </w:r>
     </w:p>
-    <w:tbl>
-      <w:tblPr>
-        <w:tblStyle w:val="Grigliatabella"/>
-        <w:tblW w:w="9634" w:type="dxa"/>
-        <w:tblLayout w:type="fixed"/>
-        <w:tblLook w:val="04A0" w:firstRow="0" w:lastRow="0" w:firstColumn="0" w:lastColumn="0" w:noHBand="0" w:noVBand="1"/>
-      </w:tblPr>
-      <w:tblGrid>
-        <w:gridCol w:w="9634"/>
-      </w:tblGrid>
-      <w:tr>
-        <w:trPr>
-          <w:trHeight w:val="3600" w:hRule="atLeast"/>
-        </w:trPr>
-        <w:tc>
-          <w:tcPr>
-            <w:tcW w:w="9634" w:type="dxa"/>
-            <w:vAlign w:val="center"/>
-          </w:tcPr>
-          <w:p>
-            <w:pPr>
-              <w:rPr>
-                <w:rFonts w:ascii="Bodoni MT" w:hAnsi="Bodoni MT"/>
-              </w:rPr>
-            </w:pPr>
-          </w:p>
-        </w:tc>
-      </w:tr>
-    </w:tbl>
     <w:p>
       <w:pPr>
+        <w:spacing w:before="300" w:after="0" w:line="240" w:lineRule="auto"/>
+        <w:pBdr>
+          <w:bottom w:val="single" w:sz="6" w:space="1" w:color="808080"/>
+        </w:pBdr>
+        <w:rPr>
+          <w:rFonts w:ascii="Bodoni MT" w:hAnsi="Bodoni MT"/>
+        </w:rPr>
+      </w:pPr>
+    </w:p>
+    <w:p>
+      <w:pPr>
+        <w:spacing w:before="300" w:after="0" w:line="240" w:lineRule="auto"/>
+        <w:pBdr>
+          <w:bottom w:val="single" w:sz="6" w:space="1" w:color="808080"/>
+        </w:pBdr>
+        <w:rPr>
+          <w:rFonts w:ascii="Bodoni MT" w:hAnsi="Bodoni MT"/>
+        </w:rPr>
+      </w:pPr>
+    </w:p>
+    <w:p>
+      <w:pPr>
+        <w:spacing w:before="300" w:after="0" w:line="240" w:lineRule="auto"/>
+        <w:pBdr>
+          <w:bottom w:val="single" w:sz="6" w:space="1" w:color="808080"/>
+        </w:pBdr>
+        <w:rPr>
+          <w:rFonts w:ascii="Bodoni MT" w:hAnsi="Bodoni MT"/>
+        </w:rPr>
+      </w:pPr>
+    </w:p>
+    <w:p>
+      <w:pPr>
+        <w:spacing w:before="300" w:after="0" w:line="240" w:lineRule="auto"/>
+        <w:pBdr>
+          <w:bottom w:val="single" w:sz="6" w:space="1" w:color="808080"/>
+        </w:pBdr>
+        <w:rPr>
+          <w:rFonts w:ascii="Bodoni MT" w:hAnsi="Bodoni MT"/>
+        </w:rPr>
+      </w:pPr>
+    </w:p>
+    <w:p>
+      <w:pPr>
+        <w:spacing w:before="300" w:after="0" w:line="240" w:lineRule="auto"/>
+        <w:pBdr>
+          <w:bottom w:val="single" w:sz="6" w:space="1" w:color="808080"/>
+        </w:pBdr>
+        <w:rPr>
+          <w:rFonts w:ascii="Bodoni MT" w:hAnsi="Bodoni MT"/>
+        </w:rPr>
+      </w:pPr>
+    </w:p>
+    <w:p>
+      <w:pPr>
+        <w:spacing w:before="300" w:after="0" w:line="240" w:lineRule="auto"/>
+        <w:pBdr>
+          <w:bottom w:val="single" w:sz="6" w:space="1" w:color="808080"/>
+        </w:pBdr>
+        <w:rPr>
+          <w:rFonts w:ascii="Bodoni MT" w:hAnsi="Bodoni MT"/>
+        </w:rPr>
+      </w:pPr>
+    </w:p>
+    <w:p>
+      <w:pPr>
+        <w:spacing w:before="300" w:after="0" w:line="240" w:lineRule="auto"/>
+        <w:pBdr>
+          <w:bottom w:val="single" w:sz="6" w:space="1" w:color="808080"/>
+        </w:pBdr>
+        <w:rPr>
+          <w:rFonts w:ascii="Bodoni MT" w:hAnsi="Bodoni MT"/>
+        </w:rPr>
+      </w:pPr>
+    </w:p>
+    <w:p>
+      <w:pPr>
+        <w:spacing w:before="300" w:after="0" w:line="240" w:lineRule="auto"/>
+        <w:pBdr>
+          <w:bottom w:val="single" w:sz="6" w:space="1" w:color="808080"/>
+        </w:pBdr>
+        <w:rPr>
+          <w:rFonts w:ascii="Bodoni MT" w:hAnsi="Bodoni MT"/>
+        </w:rPr>
+      </w:pPr>
+    </w:p>
+    <w:p>
+      <w:pPr>
+        <w:spacing w:before="300" w:after="0" w:line="240" w:lineRule="auto"/>
+        <w:pBdr>
+          <w:bottom w:val="single" w:sz="6" w:space="1" w:color="808080"/>
+        </w:pBdr>
+        <w:rPr>
+          <w:rFonts w:ascii="Bodoni MT" w:hAnsi="Bodoni MT"/>
+        </w:rPr>
+      </w:pPr>
+    </w:p>
+    <w:p>
+      <w:pPr>
+        <w:spacing w:before="300" w:after="0" w:line="240" w:lineRule="auto"/>
+        <w:pBdr>
+          <w:bottom w:val="single" w:sz="6" w:space="1" w:color="808080"/>
+        </w:pBdr>
+        <w:rPr>
+          <w:rFonts w:ascii="Bodoni MT" w:hAnsi="Bodoni MT"/>
+        </w:rPr>
+      </w:pPr>
+    </w:p>
+    <w:p>
+      <w:pPr>
+        <w:spacing w:before="300" w:after="0" w:line="240" w:lineRule="auto"/>
+        <w:pBdr>
+          <w:bottom w:val="single" w:sz="6" w:space="1" w:color="808080"/>
+        </w:pBdr>
+        <w:rPr>
+          <w:rFonts w:ascii="Bodoni MT" w:hAnsi="Bodoni MT"/>
+        </w:rPr>
+      </w:pPr>
+    </w:p>
+    <w:p>
+      <w:pPr>
+        <w:spacing w:before="300" w:after="0" w:line="240" w:lineRule="auto"/>
+        <w:pBdr>
+          <w:bottom w:val="single" w:sz="6" w:space="1" w:color="808080"/>
+        </w:pBdr>
+        <w:rPr>
+          <w:rFonts w:ascii="Bodoni MT" w:hAnsi="Bodoni MT"/>
+        </w:rPr>
+      </w:pPr>
+    </w:p>
+    <w:p>
+      <w:pPr>
+        <w:spacing w:before="300" w:after="0" w:line="240" w:lineRule="auto"/>
+        <w:pBdr>
+          <w:bottom w:val="single" w:sz="6" w:space="1" w:color="808080"/>
+        </w:pBdr>
+        <w:rPr>
+          <w:rFonts w:ascii="Bodoni MT" w:hAnsi="Bodoni MT"/>
+        </w:rPr>
+      </w:pPr>
+    </w:p>
+    <w:p>
+      <w:pPr>
+        <w:spacing w:before="300" w:after="0" w:line="240" w:lineRule="auto"/>
+        <w:pBdr>
+          <w:bottom w:val="single" w:sz="6" w:space="1" w:color="808080"/>
+        </w:pBdr>
+        <w:rPr>
+          <w:rFonts w:ascii="Bodoni MT" w:hAnsi="Bodoni MT"/>
+        </w:rPr>
+      </w:pPr>
+    </w:p>
+    <w:p>
+      <w:pPr>
         <w:pStyle w:val="Titolo1"/>
+        <w:keepNext/>
         <w:rPr>
           <w:rFonts w:ascii="Bodoni MT" w:hAnsi="Bodoni MT"/>
           <w:i/>
@@ -2637,7 +2697,7 @@
     </w:p>
     <w:p>
       <w:pPr>
-        <w:spacing w:before="80"/>
+        <w:spacing w:before="80" w:after="120"/>
         <w:rPr>
           <w:rFonts w:ascii="Bodoni MT" w:hAnsi="Bodoni MT"/>
           <w:i/>
@@ -2656,15 +2716,6 @@
         </w:rPr>
         <w:t xml:space="preserve">Letto, confermato e sottoscritto.</w:t>
       </w:r>
-    </w:p>
-    <w:p>
-      <w:pPr>
-        <w:rPr>
-          <w:rFonts w:ascii="Bodoni MT" w:hAnsi="Bodoni MT"/>
-          <w:sz w:val="12"/>
-          <w:szCs w:val="12"/>
-        </w:rPr>
-      </w:pPr>
     </w:p>
     <w:tbl>
       <w:tblPr>
@@ -2682,6 +2733,7 @@
       <w:tr>
         <w:trPr>
           <w:tblHeader/>
+          <w:cantSplit/>
         </w:trPr>
         <w:tc>
           <w:tcPr>
@@ -2783,6 +2835,7 @@
       <w:tr>
         <w:trPr>
           <w:trHeight w:val="624" w:hRule="atLeast"/>
+          <w:cantSplit/>
         </w:trPr>
         <w:tc>
           <w:tcPr>
@@ -2840,6 +2893,7 @@
       <w:tr>
         <w:trPr>
           <w:trHeight w:val="624" w:hRule="atLeast"/>
+          <w:cantSplit/>
         </w:trPr>
         <w:tc>
           <w:tcPr>
@@ -2897,6 +2951,7 @@
       <w:tr>
         <w:trPr>
           <w:trHeight w:val="624" w:hRule="atLeast"/>
+          <w:cantSplit/>
         </w:trPr>
         <w:tc>
           <w:tcPr>
@@ -2954,6 +3009,7 @@
       <w:tr>
         <w:trPr>
           <w:trHeight w:val="624" w:hRule="atLeast"/>
+          <w:cantSplit/>
         </w:trPr>
         <w:tc>
           <w:tcPr>
@@ -3011,6 +3067,7 @@
       <w:tr>
         <w:trPr>
           <w:trHeight w:val="624" w:hRule="atLeast"/>
+          <w:cantSplit/>
         </w:trPr>
         <w:tc>
           <w:tcPr>
@@ -3068,6 +3125,7 @@
       <w:tr>
         <w:trPr>
           <w:trHeight w:val="624" w:hRule="atLeast"/>
+          <w:cantSplit/>
         </w:trPr>
         <w:tc>
           <w:tcPr>
@@ -3125,6 +3183,7 @@
       <w:tr>
         <w:trPr>
           <w:trHeight w:val="624" w:hRule="atLeast"/>
+          <w:cantSplit/>
         </w:trPr>
         <w:tc>
           <w:tcPr>
@@ -3182,6 +3241,7 @@
       <w:tr>
         <w:trPr>
           <w:trHeight w:val="624" w:hRule="atLeast"/>
+          <w:cantSplit/>
         </w:trPr>
         <w:tc>
           <w:tcPr>
@@ -3239,6 +3299,7 @@
       <w:tr>
         <w:trPr>
           <w:trHeight w:val="624" w:hRule="atLeast"/>
+          <w:cantSplit/>
         </w:trPr>
         <w:tc>
           <w:tcPr>
@@ -3296,6 +3357,7 @@
       <w:tr>
         <w:trPr>
           <w:trHeight w:val="624" w:hRule="atLeast"/>
+          <w:cantSplit/>
         </w:trPr>
         <w:tc>
           <w:tcPr>

</xml_diff>

<commit_message>
Imposta font Arial 11 e rimuove il grassetto in tutti i documenti
Normalizza i quattro documenti: font Arial, dimensione 11 pt uniforme su
corpo, tabelle, intestazioni di sezione, piè di pagina e definizioni di
stile; rimosso ogni grassetto. Le intestazioni di tabella restano
distinguibili tramite lo sfondo grigio.
</commit_message>
<xml_diff>
--- a/Check_List_PAVIA_LENA/Check_List_PAVIA_LENA_2026_06_09_EDILE.docx
+++ b/Check_List_PAVIA_LENA/Check_List_PAVIA_LENA_2026_06_09_EDILE.docx
@@ -6,24 +6,24 @@
       <w:pPr>
         <w:jc w:val="center"/>
         <w:rPr>
-          <w:rFonts w:ascii="Bodoni MT" w:hAnsi="Bodoni MT"/>
-          <w:sz w:val="28"/>
-          <w:szCs w:val="28"/>
+          <w:rFonts w:ascii="Arial" w:hAnsi="Arial" w:cs="Arial"/>
+          <w:sz w:val="22"/>
+          <w:szCs w:val="22"/>
         </w:rPr>
       </w:pPr>
       <w:r>
         <w:rPr>
-          <w:rFonts w:ascii="Bodoni MT" w:hAnsi="Bodoni MT"/>
-          <w:sz w:val="28"/>
-          <w:szCs w:val="28"/>
+          <w:rFonts w:ascii="Arial" w:hAnsi="Arial" w:cs="Arial"/>
+          <w:sz w:val="22"/>
+          <w:szCs w:val="22"/>
         </w:rPr>
         <w:t xml:space="preserve">REQUISITI MINIMI DI PROGETTO </w:t>
       </w:r>
       <w:r>
         <w:rPr>
-          <w:rFonts w:ascii="Bodoni MT" w:hAnsi="Bodoni MT"/>
-          <w:sz w:val="28"/>
-          <w:szCs w:val="28"/>
+          <w:rFonts w:ascii="Arial" w:hAnsi="Arial" w:cs="Arial"/>
+          <w:sz w:val="22"/>
+          <w:szCs w:val="22"/>
         </w:rPr>
         <w:t>EDILE</w:t>
       </w:r>
@@ -33,40 +33,40 @@
         <w:pStyle w:val="Titolo1"/>
         <w:jc w:val="right"/>
         <w:rPr>
-          <w:rFonts w:ascii="Bodoni MT" w:hAnsi="Bodoni MT"/>
+          <w:rFonts w:ascii="Arial" w:hAnsi="Arial" w:cs="Arial"/>
           <w:i/>
           <w:iCs/>
-          <w:sz w:val="24"/>
-          <w:szCs w:val="24"/>
+          <w:sz w:val="22"/>
+          <w:szCs w:val="22"/>
         </w:rPr>
       </w:pPr>
       <w:r>
         <w:rPr>
-          <w:rFonts w:ascii="Bodoni MT" w:hAnsi="Bodoni MT"/>
+          <w:rFonts w:ascii="Arial" w:hAnsi="Arial" w:cs="Arial"/>
           <w:i/>
           <w:iCs/>
-          <w:sz w:val="24"/>
-          <w:szCs w:val="24"/>
+          <w:sz w:val="22"/>
+          <w:szCs w:val="22"/>
         </w:rPr>
         <w:t>Data 0</w:t>
       </w:r>
       <w:r>
         <w:rPr>
-          <w:rFonts w:ascii="Bodoni MT" w:hAnsi="Bodoni MT"/>
+          <w:rFonts w:ascii="Arial" w:hAnsi="Arial" w:cs="Arial"/>
           <w:i/>
           <w:iCs/>
-          <w:sz w:val="24"/>
-          <w:szCs w:val="24"/>
+          <w:sz w:val="22"/>
+          <w:szCs w:val="22"/>
         </w:rPr>
         <w:t>9</w:t>
       </w:r>
       <w:r>
         <w:rPr>
-          <w:rFonts w:ascii="Bodoni MT" w:hAnsi="Bodoni MT"/>
+          <w:rFonts w:ascii="Arial" w:hAnsi="Arial" w:cs="Arial"/>
           <w:i/>
           <w:iCs/>
-          <w:sz w:val="24"/>
-          <w:szCs w:val="24"/>
+          <w:sz w:val="22"/>
+          <w:szCs w:val="22"/>
         </w:rPr>
         <w:t>/06/2026</w:t>
       </w:r>
@@ -76,14 +76,14 @@
         <w:jc w:val="both"/>
         <w:spacing w:after="120"/>
         <w:rPr>
-          <w:rFonts w:ascii="Bodoni MT" w:hAnsi="Bodoni MT"/>
+          <w:rFonts w:ascii="Arial" w:hAnsi="Arial" w:cs="Arial"/>
           <w:sz w:val="22"/>
           <w:szCs w:val="22"/>
         </w:rPr>
       </w:pPr>
       <w:r>
         <w:rPr>
-          <w:rFonts w:ascii="Bodoni MT" w:hAnsi="Bodoni MT"/>
+          <w:rFonts w:ascii="Arial" w:hAnsi="Arial" w:cs="Arial"/>
           <w:sz w:val="22"/>
           <w:szCs w:val="22"/>
         </w:rPr>
@@ -95,20 +95,20 @@
         <w:pStyle w:val="Titolo1"/>
         <w:keepNext/>
         <w:rPr>
-          <w:rFonts w:ascii="Bodoni MT" w:hAnsi="Bodoni MT"/>
+          <w:rFonts w:ascii="Arial" w:hAnsi="Arial" w:cs="Arial"/>
           <w:i/>
           <w:iCs/>
-          <w:sz w:val="24"/>
-          <w:szCs w:val="24"/>
+          <w:sz w:val="22"/>
+          <w:szCs w:val="22"/>
         </w:rPr>
       </w:pPr>
       <w:r>
         <w:rPr>
-          <w:rFonts w:ascii="Bodoni MT" w:hAnsi="Bodoni MT"/>
+          <w:rFonts w:ascii="Arial" w:hAnsi="Arial" w:cs="Arial"/>
           <w:i/>
           <w:iCs/>
-          <w:sz w:val="24"/>
-          <w:szCs w:val="24"/>
+          <w:sz w:val="22"/>
+          <w:szCs w:val="22"/>
         </w:rPr>
         <w:t xml:space="preserve">PARTI PRESENTI</w:t>
       </w:r>
@@ -118,18 +118,14 @@
         <w:keepNext/>
         <w:spacing w:before="120"/>
         <w:rPr>
-          <w:rFonts w:ascii="Bodoni MT" w:hAnsi="Bodoni MT"/>
-          <w:b/>
-          <w:bCs/>
+          <w:rFonts w:ascii="Arial" w:hAnsi="Arial" w:cs="Arial"/>
           <w:sz w:val="22"/>
           <w:szCs w:val="22"/>
         </w:rPr>
       </w:pPr>
       <w:r>
         <w:rPr>
-          <w:rFonts w:ascii="Bodoni MT" w:hAnsi="Bodoni MT"/>
-          <w:b/>
-          <w:bCs/>
+          <w:rFonts w:ascii="Arial" w:hAnsi="Arial" w:cs="Arial"/>
           <w:sz w:val="22"/>
           <w:szCs w:val="22"/>
         </w:rPr>
@@ -162,16 +158,16 @@
           <w:p>
             <w:pPr>
               <w:rPr>
-                <w:rFonts w:ascii="Bodoni MT" w:hAnsi="Bodoni MT"/>
-                <w:b/>
-                <w:bCs/>
-              </w:rPr>
-            </w:pPr>
-            <w:r>
-              <w:rPr>
-                <w:rFonts w:ascii="Bodoni MT" w:hAnsi="Bodoni MT"/>
-                <w:b/>
-                <w:bCs/>
+                <w:rFonts w:ascii="Arial" w:hAnsi="Arial" w:cs="Arial"/>
+                <w:sz w:val="22"/>
+                <w:szCs w:val="22"/>
+              </w:rPr>
+            </w:pPr>
+            <w:r>
+              <w:rPr>
+                <w:rFonts w:ascii="Arial" w:hAnsi="Arial" w:cs="Arial"/>
+                <w:sz w:val="22"/>
+                <w:szCs w:val="22"/>
               </w:rPr>
               <w:t xml:space="preserve">Nome e Cognome</w:t>
             </w:r>
@@ -186,16 +182,16 @@
           <w:p>
             <w:pPr>
               <w:rPr>
-                <w:rFonts w:ascii="Bodoni MT" w:hAnsi="Bodoni MT"/>
-                <w:b/>
-                <w:bCs/>
-              </w:rPr>
-            </w:pPr>
-            <w:r>
-              <w:rPr>
-                <w:rFonts w:ascii="Bodoni MT" w:hAnsi="Bodoni MT"/>
-                <w:b/>
-                <w:bCs/>
+                <w:rFonts w:ascii="Arial" w:hAnsi="Arial" w:cs="Arial"/>
+                <w:sz w:val="22"/>
+                <w:szCs w:val="22"/>
+              </w:rPr>
+            </w:pPr>
+            <w:r>
+              <w:rPr>
+                <w:rFonts w:ascii="Arial" w:hAnsi="Arial" w:cs="Arial"/>
+                <w:sz w:val="22"/>
+                <w:szCs w:val="22"/>
               </w:rPr>
               <w:t xml:space="preserve">Ruolo / Funzione</w:t>
             </w:r>
@@ -210,16 +206,16 @@
           <w:p>
             <w:pPr>
               <w:rPr>
-                <w:rFonts w:ascii="Bodoni MT" w:hAnsi="Bodoni MT"/>
-                <w:b/>
-                <w:bCs/>
-              </w:rPr>
-            </w:pPr>
-            <w:r>
-              <w:rPr>
-                <w:rFonts w:ascii="Bodoni MT" w:hAnsi="Bodoni MT"/>
-                <w:b/>
-                <w:bCs/>
+                <w:rFonts w:ascii="Arial" w:hAnsi="Arial" w:cs="Arial"/>
+                <w:sz w:val="22"/>
+                <w:szCs w:val="22"/>
+              </w:rPr>
+            </w:pPr>
+            <w:r>
+              <w:rPr>
+                <w:rFonts w:ascii="Arial" w:hAnsi="Arial" w:cs="Arial"/>
+                <w:sz w:val="22"/>
+                <w:szCs w:val="22"/>
               </w:rPr>
               <w:t xml:space="preserve">E-mail</w:t>
             </w:r>
@@ -239,7 +235,9 @@
           <w:p>
             <w:pPr>
               <w:rPr>
-                <w:rFonts w:ascii="Bodoni MT" w:hAnsi="Bodoni MT"/>
+                <w:rFonts w:ascii="Arial" w:hAnsi="Arial" w:cs="Arial"/>
+                <w:sz w:val="22"/>
+                <w:szCs w:val="22"/>
               </w:rPr>
             </w:pPr>
           </w:p>
@@ -252,7 +250,9 @@
           <w:p>
             <w:pPr>
               <w:rPr>
-                <w:rFonts w:ascii="Bodoni MT" w:hAnsi="Bodoni MT"/>
+                <w:rFonts w:ascii="Arial" w:hAnsi="Arial" w:cs="Arial"/>
+                <w:sz w:val="22"/>
+                <w:szCs w:val="22"/>
               </w:rPr>
             </w:pPr>
           </w:p>
@@ -265,7 +265,9 @@
           <w:p>
             <w:pPr>
               <w:rPr>
-                <w:rFonts w:ascii="Bodoni MT" w:hAnsi="Bodoni MT"/>
+                <w:rFonts w:ascii="Arial" w:hAnsi="Arial" w:cs="Arial"/>
+                <w:sz w:val="22"/>
+                <w:szCs w:val="22"/>
               </w:rPr>
             </w:pPr>
           </w:p>
@@ -284,7 +286,9 @@
           <w:p>
             <w:pPr>
               <w:rPr>
-                <w:rFonts w:ascii="Bodoni MT" w:hAnsi="Bodoni MT"/>
+                <w:rFonts w:ascii="Arial" w:hAnsi="Arial" w:cs="Arial"/>
+                <w:sz w:val="22"/>
+                <w:szCs w:val="22"/>
               </w:rPr>
             </w:pPr>
           </w:p>
@@ -297,7 +301,9 @@
           <w:p>
             <w:pPr>
               <w:rPr>
-                <w:rFonts w:ascii="Bodoni MT" w:hAnsi="Bodoni MT"/>
+                <w:rFonts w:ascii="Arial" w:hAnsi="Arial" w:cs="Arial"/>
+                <w:sz w:val="22"/>
+                <w:szCs w:val="22"/>
               </w:rPr>
             </w:pPr>
           </w:p>
@@ -310,7 +316,9 @@
           <w:p>
             <w:pPr>
               <w:rPr>
-                <w:rFonts w:ascii="Bodoni MT" w:hAnsi="Bodoni MT"/>
+                <w:rFonts w:ascii="Arial" w:hAnsi="Arial" w:cs="Arial"/>
+                <w:sz w:val="22"/>
+                <w:szCs w:val="22"/>
               </w:rPr>
             </w:pPr>
           </w:p>
@@ -329,7 +337,9 @@
           <w:p>
             <w:pPr>
               <w:rPr>
-                <w:rFonts w:ascii="Bodoni MT" w:hAnsi="Bodoni MT"/>
+                <w:rFonts w:ascii="Arial" w:hAnsi="Arial" w:cs="Arial"/>
+                <w:sz w:val="22"/>
+                <w:szCs w:val="22"/>
               </w:rPr>
             </w:pPr>
           </w:p>
@@ -342,7 +352,9 @@
           <w:p>
             <w:pPr>
               <w:rPr>
-                <w:rFonts w:ascii="Bodoni MT" w:hAnsi="Bodoni MT"/>
+                <w:rFonts w:ascii="Arial" w:hAnsi="Arial" w:cs="Arial"/>
+                <w:sz w:val="22"/>
+                <w:szCs w:val="22"/>
               </w:rPr>
             </w:pPr>
           </w:p>
@@ -355,7 +367,9 @@
           <w:p>
             <w:pPr>
               <w:rPr>
-                <w:rFonts w:ascii="Bodoni MT" w:hAnsi="Bodoni MT"/>
+                <w:rFonts w:ascii="Arial" w:hAnsi="Arial" w:cs="Arial"/>
+                <w:sz w:val="22"/>
+                <w:szCs w:val="22"/>
               </w:rPr>
             </w:pPr>
           </w:p>
@@ -374,7 +388,9 @@
           <w:p>
             <w:pPr>
               <w:rPr>
-                <w:rFonts w:ascii="Bodoni MT" w:hAnsi="Bodoni MT"/>
+                <w:rFonts w:ascii="Arial" w:hAnsi="Arial" w:cs="Arial"/>
+                <w:sz w:val="22"/>
+                <w:szCs w:val="22"/>
               </w:rPr>
             </w:pPr>
           </w:p>
@@ -387,7 +403,9 @@
           <w:p>
             <w:pPr>
               <w:rPr>
-                <w:rFonts w:ascii="Bodoni MT" w:hAnsi="Bodoni MT"/>
+                <w:rFonts w:ascii="Arial" w:hAnsi="Arial" w:cs="Arial"/>
+                <w:sz w:val="22"/>
+                <w:szCs w:val="22"/>
               </w:rPr>
             </w:pPr>
           </w:p>
@@ -400,7 +418,9 @@
           <w:p>
             <w:pPr>
               <w:rPr>
-                <w:rFonts w:ascii="Bodoni MT" w:hAnsi="Bodoni MT"/>
+                <w:rFonts w:ascii="Arial" w:hAnsi="Arial" w:cs="Arial"/>
+                <w:sz w:val="22"/>
+                <w:szCs w:val="22"/>
               </w:rPr>
             </w:pPr>
           </w:p>
@@ -419,7 +439,9 @@
           <w:p>
             <w:pPr>
               <w:rPr>
-                <w:rFonts w:ascii="Bodoni MT" w:hAnsi="Bodoni MT"/>
+                <w:rFonts w:ascii="Arial" w:hAnsi="Arial" w:cs="Arial"/>
+                <w:sz w:val="22"/>
+                <w:szCs w:val="22"/>
               </w:rPr>
             </w:pPr>
           </w:p>
@@ -432,7 +454,9 @@
           <w:p>
             <w:pPr>
               <w:rPr>
-                <w:rFonts w:ascii="Bodoni MT" w:hAnsi="Bodoni MT"/>
+                <w:rFonts w:ascii="Arial" w:hAnsi="Arial" w:cs="Arial"/>
+                <w:sz w:val="22"/>
+                <w:szCs w:val="22"/>
               </w:rPr>
             </w:pPr>
           </w:p>
@@ -445,7 +469,9 @@
           <w:p>
             <w:pPr>
               <w:rPr>
-                <w:rFonts w:ascii="Bodoni MT" w:hAnsi="Bodoni MT"/>
+                <w:rFonts w:ascii="Arial" w:hAnsi="Arial" w:cs="Arial"/>
+                <w:sz w:val="22"/>
+                <w:szCs w:val="22"/>
               </w:rPr>
             </w:pPr>
           </w:p>
@@ -457,18 +483,14 @@
         <w:keepNext/>
         <w:spacing w:before="200"/>
         <w:rPr>
-          <w:rFonts w:ascii="Bodoni MT" w:hAnsi="Bodoni MT"/>
-          <w:b/>
-          <w:bCs/>
+          <w:rFonts w:ascii="Arial" w:hAnsi="Arial" w:cs="Arial"/>
           <w:sz w:val="22"/>
           <w:szCs w:val="22"/>
         </w:rPr>
       </w:pPr>
       <w:r>
         <w:rPr>
-          <w:rFonts w:ascii="Bodoni MT" w:hAnsi="Bodoni MT"/>
-          <w:b/>
-          <w:bCs/>
+          <w:rFonts w:ascii="Arial" w:hAnsi="Arial" w:cs="Arial"/>
           <w:sz w:val="22"/>
           <w:szCs w:val="22"/>
         </w:rPr>
@@ -501,16 +523,16 @@
           <w:p>
             <w:pPr>
               <w:rPr>
-                <w:rFonts w:ascii="Bodoni MT" w:hAnsi="Bodoni MT"/>
-                <w:b/>
-                <w:bCs/>
-              </w:rPr>
-            </w:pPr>
-            <w:r>
-              <w:rPr>
-                <w:rFonts w:ascii="Bodoni MT" w:hAnsi="Bodoni MT"/>
-                <w:b/>
-                <w:bCs/>
+                <w:rFonts w:ascii="Arial" w:hAnsi="Arial" w:cs="Arial"/>
+                <w:sz w:val="22"/>
+                <w:szCs w:val="22"/>
+              </w:rPr>
+            </w:pPr>
+            <w:r>
+              <w:rPr>
+                <w:rFonts w:ascii="Arial" w:hAnsi="Arial" w:cs="Arial"/>
+                <w:sz w:val="22"/>
+                <w:szCs w:val="22"/>
               </w:rPr>
               <w:t xml:space="preserve">Nome e Cognome</w:t>
             </w:r>
@@ -525,16 +547,16 @@
           <w:p>
             <w:pPr>
               <w:rPr>
-                <w:rFonts w:ascii="Bodoni MT" w:hAnsi="Bodoni MT"/>
-                <w:b/>
-                <w:bCs/>
-              </w:rPr>
-            </w:pPr>
-            <w:r>
-              <w:rPr>
-                <w:rFonts w:ascii="Bodoni MT" w:hAnsi="Bodoni MT"/>
-                <w:b/>
-                <w:bCs/>
+                <w:rFonts w:ascii="Arial" w:hAnsi="Arial" w:cs="Arial"/>
+                <w:sz w:val="22"/>
+                <w:szCs w:val="22"/>
+              </w:rPr>
+            </w:pPr>
+            <w:r>
+              <w:rPr>
+                <w:rFonts w:ascii="Arial" w:hAnsi="Arial" w:cs="Arial"/>
+                <w:sz w:val="22"/>
+                <w:szCs w:val="22"/>
               </w:rPr>
               <w:t xml:space="preserve">Ruolo / Funzione</w:t>
             </w:r>
@@ -549,16 +571,16 @@
           <w:p>
             <w:pPr>
               <w:rPr>
-                <w:rFonts w:ascii="Bodoni MT" w:hAnsi="Bodoni MT"/>
-                <w:b/>
-                <w:bCs/>
-              </w:rPr>
-            </w:pPr>
-            <w:r>
-              <w:rPr>
-                <w:rFonts w:ascii="Bodoni MT" w:hAnsi="Bodoni MT"/>
-                <w:b/>
-                <w:bCs/>
+                <w:rFonts w:ascii="Arial" w:hAnsi="Arial" w:cs="Arial"/>
+                <w:sz w:val="22"/>
+                <w:szCs w:val="22"/>
+              </w:rPr>
+            </w:pPr>
+            <w:r>
+              <w:rPr>
+                <w:rFonts w:ascii="Arial" w:hAnsi="Arial" w:cs="Arial"/>
+                <w:sz w:val="22"/>
+                <w:szCs w:val="22"/>
               </w:rPr>
               <w:t xml:space="preserve">E-mail</w:t>
             </w:r>
@@ -578,7 +600,9 @@
           <w:p>
             <w:pPr>
               <w:rPr>
-                <w:rFonts w:ascii="Bodoni MT" w:hAnsi="Bodoni MT"/>
+                <w:rFonts w:ascii="Arial" w:hAnsi="Arial" w:cs="Arial"/>
+                <w:sz w:val="22"/>
+                <w:szCs w:val="22"/>
               </w:rPr>
             </w:pPr>
           </w:p>
@@ -591,7 +615,9 @@
           <w:p>
             <w:pPr>
               <w:rPr>
-                <w:rFonts w:ascii="Bodoni MT" w:hAnsi="Bodoni MT"/>
+                <w:rFonts w:ascii="Arial" w:hAnsi="Arial" w:cs="Arial"/>
+                <w:sz w:val="22"/>
+                <w:szCs w:val="22"/>
               </w:rPr>
             </w:pPr>
           </w:p>
@@ -604,7 +630,9 @@
           <w:p>
             <w:pPr>
               <w:rPr>
-                <w:rFonts w:ascii="Bodoni MT" w:hAnsi="Bodoni MT"/>
+                <w:rFonts w:ascii="Arial" w:hAnsi="Arial" w:cs="Arial"/>
+                <w:sz w:val="22"/>
+                <w:szCs w:val="22"/>
               </w:rPr>
             </w:pPr>
           </w:p>
@@ -623,7 +651,9 @@
           <w:p>
             <w:pPr>
               <w:rPr>
-                <w:rFonts w:ascii="Bodoni MT" w:hAnsi="Bodoni MT"/>
+                <w:rFonts w:ascii="Arial" w:hAnsi="Arial" w:cs="Arial"/>
+                <w:sz w:val="22"/>
+                <w:szCs w:val="22"/>
               </w:rPr>
             </w:pPr>
           </w:p>
@@ -636,7 +666,9 @@
           <w:p>
             <w:pPr>
               <w:rPr>
-                <w:rFonts w:ascii="Bodoni MT" w:hAnsi="Bodoni MT"/>
+                <w:rFonts w:ascii="Arial" w:hAnsi="Arial" w:cs="Arial"/>
+                <w:sz w:val="22"/>
+                <w:szCs w:val="22"/>
               </w:rPr>
             </w:pPr>
           </w:p>
@@ -649,7 +681,9 @@
           <w:p>
             <w:pPr>
               <w:rPr>
-                <w:rFonts w:ascii="Bodoni MT" w:hAnsi="Bodoni MT"/>
+                <w:rFonts w:ascii="Arial" w:hAnsi="Arial" w:cs="Arial"/>
+                <w:sz w:val="22"/>
+                <w:szCs w:val="22"/>
               </w:rPr>
             </w:pPr>
           </w:p>
@@ -668,7 +702,9 @@
           <w:p>
             <w:pPr>
               <w:rPr>
-                <w:rFonts w:ascii="Bodoni MT" w:hAnsi="Bodoni MT"/>
+                <w:rFonts w:ascii="Arial" w:hAnsi="Arial" w:cs="Arial"/>
+                <w:sz w:val="22"/>
+                <w:szCs w:val="22"/>
               </w:rPr>
             </w:pPr>
           </w:p>
@@ -681,7 +717,9 @@
           <w:p>
             <w:pPr>
               <w:rPr>
-                <w:rFonts w:ascii="Bodoni MT" w:hAnsi="Bodoni MT"/>
+                <w:rFonts w:ascii="Arial" w:hAnsi="Arial" w:cs="Arial"/>
+                <w:sz w:val="22"/>
+                <w:szCs w:val="22"/>
               </w:rPr>
             </w:pPr>
           </w:p>
@@ -694,7 +732,9 @@
           <w:p>
             <w:pPr>
               <w:rPr>
-                <w:rFonts w:ascii="Bodoni MT" w:hAnsi="Bodoni MT"/>
+                <w:rFonts w:ascii="Arial" w:hAnsi="Arial" w:cs="Arial"/>
+                <w:sz w:val="22"/>
+                <w:szCs w:val="22"/>
               </w:rPr>
             </w:pPr>
           </w:p>
@@ -713,7 +753,9 @@
           <w:p>
             <w:pPr>
               <w:rPr>
-                <w:rFonts w:ascii="Bodoni MT" w:hAnsi="Bodoni MT"/>
+                <w:rFonts w:ascii="Arial" w:hAnsi="Arial" w:cs="Arial"/>
+                <w:sz w:val="22"/>
+                <w:szCs w:val="22"/>
               </w:rPr>
             </w:pPr>
           </w:p>
@@ -726,7 +768,9 @@
           <w:p>
             <w:pPr>
               <w:rPr>
-                <w:rFonts w:ascii="Bodoni MT" w:hAnsi="Bodoni MT"/>
+                <w:rFonts w:ascii="Arial" w:hAnsi="Arial" w:cs="Arial"/>
+                <w:sz w:val="22"/>
+                <w:szCs w:val="22"/>
               </w:rPr>
             </w:pPr>
           </w:p>
@@ -739,7 +783,9 @@
           <w:p>
             <w:pPr>
               <w:rPr>
-                <w:rFonts w:ascii="Bodoni MT" w:hAnsi="Bodoni MT"/>
+                <w:rFonts w:ascii="Arial" w:hAnsi="Arial" w:cs="Arial"/>
+                <w:sz w:val="22"/>
+                <w:szCs w:val="22"/>
               </w:rPr>
             </w:pPr>
           </w:p>
@@ -758,7 +804,9 @@
           <w:p>
             <w:pPr>
               <w:rPr>
-                <w:rFonts w:ascii="Bodoni MT" w:hAnsi="Bodoni MT"/>
+                <w:rFonts w:ascii="Arial" w:hAnsi="Arial" w:cs="Arial"/>
+                <w:sz w:val="22"/>
+                <w:szCs w:val="22"/>
               </w:rPr>
             </w:pPr>
           </w:p>
@@ -771,7 +819,9 @@
           <w:p>
             <w:pPr>
               <w:rPr>
-                <w:rFonts w:ascii="Bodoni MT" w:hAnsi="Bodoni MT"/>
+                <w:rFonts w:ascii="Arial" w:hAnsi="Arial" w:cs="Arial"/>
+                <w:sz w:val="22"/>
+                <w:szCs w:val="22"/>
               </w:rPr>
             </w:pPr>
           </w:p>
@@ -784,7 +834,9 @@
           <w:p>
             <w:pPr>
               <w:rPr>
-                <w:rFonts w:ascii="Bodoni MT" w:hAnsi="Bodoni MT"/>
+                <w:rFonts w:ascii="Arial" w:hAnsi="Arial" w:cs="Arial"/>
+                <w:sz w:val="22"/>
+                <w:szCs w:val="22"/>
               </w:rPr>
             </w:pPr>
           </w:p>
@@ -800,20 +852,20 @@
       <w:pPr>
         <w:pStyle w:val="Titolo1"/>
         <w:rPr>
-          <w:rFonts w:ascii="Bodoni MT" w:hAnsi="Bodoni MT"/>
+          <w:rFonts w:ascii="Arial" w:hAnsi="Arial" w:cs="Arial"/>
           <w:i/>
           <w:iCs/>
-          <w:sz w:val="24"/>
-          <w:szCs w:val="24"/>
+          <w:sz w:val="22"/>
+          <w:szCs w:val="22"/>
         </w:rPr>
       </w:pPr>
       <w:r>
         <w:rPr>
-          <w:rFonts w:ascii="Bodoni MT" w:hAnsi="Bodoni MT"/>
+          <w:rFonts w:ascii="Arial" w:hAnsi="Arial" w:cs="Arial"/>
           <w:i/>
           <w:iCs/>
-          <w:sz w:val="24"/>
-          <w:szCs w:val="24"/>
+          <w:sz w:val="22"/>
+          <w:szCs w:val="22"/>
         </w:rPr>
         <w:t>SCOPO</w:t>
       </w:r>
@@ -822,16 +874,20 @@
       <w:pPr>
         <w:jc w:val="both"/>
         <w:rPr>
-          <w:rFonts w:ascii="Bodoni MT" w:hAnsi="Bodoni MT"/>
+          <w:rFonts w:ascii="Arial" w:hAnsi="Arial" w:cs="Arial"/>
           <w:i/>
           <w:iCs/>
+          <w:sz w:val="22"/>
+          <w:szCs w:val="22"/>
         </w:rPr>
       </w:pPr>
       <w:proofErr w:type="spellStart"/>
       <w:proofErr w:type="spellEnd"/>
       <w:r>
         <w:rPr>
-          <w:rFonts w:ascii="Bodoni MT" w:hAnsi="Bodoni MT"/>
+          <w:rFonts w:ascii="Arial" w:hAnsi="Arial" w:cs="Arial"/>
+          <w:sz w:val="22"/>
+          <w:szCs w:val="22"/>
         </w:rPr>
         <w:t xml:space="preserve">Verifica e controllo delle opere edili e strutturali dei locali che ospitano il ciclotrone Cyclone 18/9 del L.E.N.A. di Pavia, ai fini della presa in carico da parte di ITEL. Eventuali addendum e specifiche di dettaglio saranno riportati nella sezione «Note e relazioni».</w:t>
       </w:r>
@@ -840,20 +896,20 @@
       <w:pPr>
         <w:pStyle w:val="Titolo1"/>
         <w:rPr>
-          <w:rFonts w:ascii="Bodoni MT" w:hAnsi="Bodoni MT"/>
+          <w:rFonts w:ascii="Arial" w:hAnsi="Arial" w:cs="Arial"/>
           <w:i/>
           <w:iCs/>
-          <w:sz w:val="24"/>
-          <w:szCs w:val="24"/>
+          <w:sz w:val="22"/>
+          <w:szCs w:val="22"/>
         </w:rPr>
       </w:pPr>
       <w:r>
         <w:rPr>
-          <w:rFonts w:ascii="Bodoni MT" w:hAnsi="Bodoni MT"/>
+          <w:rFonts w:ascii="Arial" w:hAnsi="Arial" w:cs="Arial"/>
           <w:i/>
           <w:iCs/>
-          <w:sz w:val="24"/>
-          <w:szCs w:val="24"/>
+          <w:sz w:val="22"/>
+          <w:szCs w:val="22"/>
         </w:rPr>
         <w:t>CHECK LIST</w:t>
       </w:r>
@@ -863,40 +919,40 @@
       <w:pPr>
         <w:pStyle w:val="Titolo1"/>
         <w:rPr>
-          <w:rFonts w:ascii="Bodoni MT" w:hAnsi="Bodoni MT"/>
+          <w:rFonts w:ascii="Arial" w:hAnsi="Arial" w:cs="Arial"/>
           <w:i/>
           <w:iCs/>
-          <w:sz w:val="24"/>
-          <w:szCs w:val="24"/>
+          <w:sz w:val="22"/>
+          <w:szCs w:val="22"/>
         </w:rPr>
       </w:pPr>
       <w:r>
         <w:rPr>
-          <w:rFonts w:ascii="Bodoni MT" w:hAnsi="Bodoni MT"/>
+          <w:rFonts w:ascii="Arial" w:hAnsi="Arial" w:cs="Arial"/>
           <w:i/>
           <w:iCs/>
-          <w:sz w:val="24"/>
-          <w:szCs w:val="24"/>
+          <w:sz w:val="22"/>
+          <w:szCs w:val="22"/>
         </w:rPr>
         <w:t>Documenti da richiedere e</w:t>
       </w:r>
       <w:r>
         <w:rPr>
-          <w:rFonts w:ascii="Bodoni MT" w:hAnsi="Bodoni MT"/>
+          <w:rFonts w:ascii="Arial" w:hAnsi="Arial" w:cs="Arial"/>
           <w:i/>
           <w:iCs/>
-          <w:sz w:val="24"/>
-          <w:szCs w:val="24"/>
+          <w:sz w:val="22"/>
+          <w:szCs w:val="22"/>
         </w:rPr>
         <w:t>d</w:t>
       </w:r>
       <w:r>
         <w:rPr>
-          <w:rFonts w:ascii="Bodoni MT" w:hAnsi="Bodoni MT"/>
+          <w:rFonts w:ascii="Arial" w:hAnsi="Arial" w:cs="Arial"/>
           <w:i/>
           <w:iCs/>
-          <w:sz w:val="24"/>
-          <w:szCs w:val="24"/>
+          <w:sz w:val="22"/>
+          <w:szCs w:val="22"/>
         </w:rPr>
         <w:t xml:space="preserve"> esaminare se disponibili</w:t>
       </w:r>
@@ -930,16 +986,16 @@
             <w:pPr>
               <w:jc w:val="center"/>
               <w:rPr>
-                <w:rFonts w:ascii="Bodoni MT" w:hAnsi="Bodoni MT"/>
-                <w:b/>
-                <w:bCs/>
-              </w:rPr>
-            </w:pPr>
-            <w:r>
-              <w:rPr>
-                <w:rFonts w:ascii="Bodoni MT" w:hAnsi="Bodoni MT"/>
-                <w:b/>
-                <w:bCs/>
+                <w:rFonts w:ascii="Arial" w:hAnsi="Arial" w:cs="Arial"/>
+                <w:sz w:val="22"/>
+                <w:szCs w:val="22"/>
+              </w:rPr>
+            </w:pPr>
+            <w:r>
+              <w:rPr>
+                <w:rFonts w:ascii="Arial" w:hAnsi="Arial" w:cs="Arial"/>
+                <w:sz w:val="22"/>
+                <w:szCs w:val="22"/>
               </w:rPr>
               <w:t>Documento</w:t>
             </w:r>
@@ -955,16 +1011,16 @@
             <w:pPr>
               <w:jc w:val="center"/>
               <w:rPr>
-                <w:rFonts w:ascii="Bodoni MT" w:hAnsi="Bodoni MT"/>
-                <w:b/>
-                <w:bCs/>
-              </w:rPr>
-            </w:pPr>
-            <w:r>
-              <w:rPr>
-                <w:rFonts w:ascii="Bodoni MT" w:hAnsi="Bodoni MT"/>
-                <w:b/>
-                <w:bCs/>
+                <w:rFonts w:ascii="Arial" w:hAnsi="Arial" w:cs="Arial"/>
+                <w:sz w:val="22"/>
+                <w:szCs w:val="22"/>
+              </w:rPr>
+            </w:pPr>
+            <w:r>
+              <w:rPr>
+                <w:rFonts w:ascii="Arial" w:hAnsi="Arial" w:cs="Arial"/>
+                <w:sz w:val="22"/>
+                <w:szCs w:val="22"/>
               </w:rPr>
               <w:t>Disp.</w:t>
             </w:r>
@@ -979,16 +1035,16 @@
             <w:pPr>
               <w:jc w:val="center"/>
               <w:rPr>
-                <w:rFonts w:ascii="Bodoni MT" w:hAnsi="Bodoni MT"/>
-                <w:b/>
-                <w:bCs/>
-              </w:rPr>
-            </w:pPr>
-            <w:r>
-              <w:rPr>
-                <w:rFonts w:ascii="Bodoni MT" w:hAnsi="Bodoni MT"/>
-                <w:b/>
-                <w:bCs/>
+                <w:rFonts w:ascii="Arial" w:hAnsi="Arial" w:cs="Arial"/>
+                <w:sz w:val="22"/>
+                <w:szCs w:val="22"/>
+              </w:rPr>
+            </w:pPr>
+            <w:r>
+              <w:rPr>
+                <w:rFonts w:ascii="Arial" w:hAnsi="Arial" w:cs="Arial"/>
+                <w:sz w:val="22"/>
+                <w:szCs w:val="22"/>
               </w:rPr>
               <w:t>Note</w:t>
             </w:r>
@@ -1007,12 +1063,16 @@
           <w:p>
             <w:pPr>
               <w:rPr>
-                <w:rFonts w:ascii="Bodoni MT" w:hAnsi="Bodoni MT"/>
-              </w:rPr>
-            </w:pPr>
-            <w:r>
-              <w:rPr>
-                <w:rFonts w:ascii="Bodoni MT" w:hAnsi="Bodoni MT"/>
+                <w:rFonts w:ascii="Arial" w:hAnsi="Arial" w:cs="Arial"/>
+                <w:sz w:val="22"/>
+                <w:szCs w:val="22"/>
+              </w:rPr>
+            </w:pPr>
+            <w:r>
+              <w:rPr>
+                <w:rFonts w:ascii="Arial" w:hAnsi="Arial" w:cs="Arial"/>
+                <w:sz w:val="22"/>
+                <w:szCs w:val="22"/>
               </w:rPr>
               <w:t>Certificato agibilità</w:t>
             </w:r>
@@ -1026,16 +1086,16 @@
           <w:p>
             <w:pPr>
               <w:rPr>
-                <w:rFonts w:ascii="Bodoni MT" w:hAnsi="Bodoni MT"/>
-                <w:b/>
-                <w:bCs/>
-              </w:rPr>
-            </w:pPr>
-            <w:r>
-              <w:rPr>
-                <w:rFonts w:ascii="Bodoni MT" w:hAnsi="Bodoni MT"/>
-                <w:b/>
-                <w:bCs/>
+                <w:rFonts w:ascii="Arial" w:hAnsi="Arial" w:cs="Arial"/>
+                <w:sz w:val="22"/>
+                <w:szCs w:val="22"/>
+              </w:rPr>
+            </w:pPr>
+            <w:r>
+              <w:rPr>
+                <w:rFonts w:ascii="Arial" w:hAnsi="Arial" w:cs="Arial"/>
+                <w:sz w:val="22"/>
+                <w:szCs w:val="22"/>
               </w:rPr>
               <w:t>Y</w:t>
             </w:r>
@@ -1049,16 +1109,17 @@
           <w:p>
             <w:pPr>
               <w:rPr>
-                <w:rFonts w:ascii="Bodoni MT" w:hAnsi="Bodoni MT"/>
+                <w:rFonts w:ascii="Arial" w:hAnsi="Arial" w:cs="Arial"/>
+                <w:sz w:val="22"/>
+                <w:szCs w:val="22"/>
               </w:rPr>
             </w:pPr>
             <w:sdt>
               <w:sdtPr>
                 <w:rPr>
-                  <w:rFonts w:ascii="Bodoni MT" w:hAnsi="Bodoni MT"/>
-                  <w:b/>
-                  <w:sz w:val="28"/>
-                  <w:szCs w:val="28"/>
+                  <w:rFonts w:ascii="Arial" w:hAnsi="Arial" w:cs="Arial"/>
+                  <w:sz w:val="22"/>
+                  <w:szCs w:val="22"/>
                 </w:rPr>
                 <w:id w:val="-1048836787"/>
                 <w14:checkbox>
@@ -1071,10 +1132,9 @@
               <w:sdtContent>
                 <w:r>
                   <w:rPr>
-                    <w:rFonts w:ascii="MS Gothic" w:eastAsia="MS Gothic" w:hAnsi="MS Gothic" w:hint="eastAsia"/>
-                    <w:b/>
-                    <w:sz w:val="28"/>
-                    <w:szCs w:val="28"/>
+                    <w:rFonts w:ascii="Arial" w:eastAsia="MS Gothic" w:hAnsi="Arial" w:hint="eastAsia" w:cs="Arial"/>
+                    <w:sz w:val="22"/>
+                    <w:szCs w:val="22"/>
                   </w:rPr>
                   <w:t>☐</w:t>
                 </w:r>
@@ -1090,16 +1150,16 @@
           <w:p>
             <w:pPr>
               <w:rPr>
-                <w:rFonts w:ascii="Bodoni MT" w:hAnsi="Bodoni MT"/>
-                <w:b/>
-                <w:bCs/>
-              </w:rPr>
-            </w:pPr>
-            <w:r>
-              <w:rPr>
-                <w:rFonts w:ascii="Bodoni MT" w:hAnsi="Bodoni MT"/>
-                <w:b/>
-                <w:bCs/>
+                <w:rFonts w:ascii="Arial" w:hAnsi="Arial" w:cs="Arial"/>
+                <w:sz w:val="22"/>
+                <w:szCs w:val="22"/>
+              </w:rPr>
+            </w:pPr>
+            <w:r>
+              <w:rPr>
+                <w:rFonts w:ascii="Arial" w:hAnsi="Arial" w:cs="Arial"/>
+                <w:sz w:val="22"/>
+                <w:szCs w:val="22"/>
               </w:rPr>
               <w:t>N</w:t>
             </w:r>
@@ -1113,16 +1173,17 @@
           <w:p>
             <w:pPr>
               <w:rPr>
-                <w:rFonts w:ascii="Bodoni MT" w:hAnsi="Bodoni MT"/>
+                <w:rFonts w:ascii="Arial" w:hAnsi="Arial" w:cs="Arial"/>
+                <w:sz w:val="22"/>
+                <w:szCs w:val="22"/>
               </w:rPr>
             </w:pPr>
             <w:sdt>
               <w:sdtPr>
                 <w:rPr>
-                  <w:rFonts w:ascii="Bodoni MT" w:hAnsi="Bodoni MT"/>
-                  <w:b/>
-                  <w:sz w:val="28"/>
-                  <w:szCs w:val="28"/>
+                  <w:rFonts w:ascii="Arial" w:hAnsi="Arial" w:cs="Arial"/>
+                  <w:sz w:val="22"/>
+                  <w:szCs w:val="22"/>
                 </w:rPr>
                 <w:id w:val="-123384334"/>
                 <w14:checkbox>
@@ -1135,10 +1196,9 @@
               <w:sdtContent>
                 <w:r>
                   <w:rPr>
-                    <w:rFonts w:ascii="MS Gothic" w:eastAsia="MS Gothic" w:hAnsi="MS Gothic" w:hint="eastAsia"/>
-                    <w:b/>
-                    <w:sz w:val="28"/>
-                    <w:szCs w:val="28"/>
+                    <w:rFonts w:ascii="Arial" w:eastAsia="MS Gothic" w:hAnsi="Arial" w:hint="eastAsia" w:cs="Arial"/>
+                    <w:sz w:val="22"/>
+                    <w:szCs w:val="22"/>
                   </w:rPr>
                   <w:t>☐</w:t>
                 </w:r>
@@ -1154,7 +1214,9 @@
           <w:p>
             <w:pPr>
               <w:rPr>
-                <w:rFonts w:ascii="Bodoni MT" w:hAnsi="Bodoni MT"/>
+                <w:rFonts w:ascii="Arial" w:hAnsi="Arial" w:cs="Arial"/>
+                <w:sz w:val="22"/>
+                <w:szCs w:val="22"/>
               </w:rPr>
             </w:pPr>
           </w:p>
@@ -1172,12 +1234,16 @@
           <w:p>
             <w:pPr>
               <w:rPr>
-                <w:rFonts w:ascii="Bodoni MT" w:hAnsi="Bodoni MT"/>
-              </w:rPr>
-            </w:pPr>
-            <w:r>
-              <w:rPr>
-                <w:rFonts w:ascii="Bodoni MT" w:hAnsi="Bodoni MT"/>
+                <w:rFonts w:ascii="Arial" w:hAnsi="Arial" w:cs="Arial"/>
+                <w:sz w:val="22"/>
+                <w:szCs w:val="22"/>
+              </w:rPr>
+            </w:pPr>
+            <w:r>
+              <w:rPr>
+                <w:rFonts w:ascii="Arial" w:hAnsi="Arial" w:cs="Arial"/>
+                <w:sz w:val="22"/>
+                <w:szCs w:val="22"/>
               </w:rPr>
               <w:t>Certificato Prevenzione Incendi</w:t>
             </w:r>
@@ -1191,16 +1257,16 @@
           <w:p>
             <w:pPr>
               <w:rPr>
-                <w:rFonts w:ascii="Bodoni MT" w:hAnsi="Bodoni MT"/>
-                <w:b/>
-                <w:bCs/>
-              </w:rPr>
-            </w:pPr>
-            <w:r>
-              <w:rPr>
-                <w:rFonts w:ascii="Bodoni MT" w:hAnsi="Bodoni MT"/>
-                <w:b/>
-                <w:bCs/>
+                <w:rFonts w:ascii="Arial" w:hAnsi="Arial" w:cs="Arial"/>
+                <w:sz w:val="22"/>
+                <w:szCs w:val="22"/>
+              </w:rPr>
+            </w:pPr>
+            <w:r>
+              <w:rPr>
+                <w:rFonts w:ascii="Arial" w:hAnsi="Arial" w:cs="Arial"/>
+                <w:sz w:val="22"/>
+                <w:szCs w:val="22"/>
               </w:rPr>
               <w:t>Y</w:t>
             </w:r>
@@ -1214,19 +1280,17 @@
           <w:p>
             <w:pPr>
               <w:rPr>
-                <w:rFonts w:ascii="Bodoni MT" w:hAnsi="Bodoni MT"/>
-                <w:b/>
-                <w:sz w:val="28"/>
-                <w:szCs w:val="28"/>
+                <w:rFonts w:ascii="Arial" w:hAnsi="Arial" w:cs="Arial"/>
+                <w:sz w:val="22"/>
+                <w:szCs w:val="22"/>
               </w:rPr>
             </w:pPr>
             <w:sdt>
               <w:sdtPr>
                 <w:rPr>
-                  <w:rFonts w:ascii="Bodoni MT" w:hAnsi="Bodoni MT"/>
-                  <w:b/>
-                  <w:sz w:val="28"/>
-                  <w:szCs w:val="28"/>
+                  <w:rFonts w:ascii="Arial" w:hAnsi="Arial" w:cs="Arial"/>
+                  <w:sz w:val="22"/>
+                  <w:szCs w:val="22"/>
                 </w:rPr>
                 <w:id w:val="1021516315"/>
                 <w14:checkbox>
@@ -1239,10 +1303,9 @@
               <w:sdtContent>
                 <w:r>
                   <w:rPr>
-                    <w:rFonts w:ascii="MS Gothic" w:eastAsia="MS Gothic" w:hAnsi="MS Gothic" w:hint="eastAsia"/>
-                    <w:b/>
-                    <w:sz w:val="28"/>
-                    <w:szCs w:val="28"/>
+                    <w:rFonts w:ascii="Arial" w:eastAsia="MS Gothic" w:hAnsi="Arial" w:hint="eastAsia" w:cs="Arial"/>
+                    <w:sz w:val="22"/>
+                    <w:szCs w:val="22"/>
                   </w:rPr>
                   <w:t>☐</w:t>
                 </w:r>
@@ -1258,16 +1321,16 @@
           <w:p>
             <w:pPr>
               <w:rPr>
-                <w:rFonts w:ascii="Bodoni MT" w:hAnsi="Bodoni MT"/>
-                <w:b/>
-                <w:bCs/>
-              </w:rPr>
-            </w:pPr>
-            <w:r>
-              <w:rPr>
-                <w:rFonts w:ascii="Bodoni MT" w:hAnsi="Bodoni MT"/>
-                <w:b/>
-                <w:bCs/>
+                <w:rFonts w:ascii="Arial" w:hAnsi="Arial" w:cs="Arial"/>
+                <w:sz w:val="22"/>
+                <w:szCs w:val="22"/>
+              </w:rPr>
+            </w:pPr>
+            <w:r>
+              <w:rPr>
+                <w:rFonts w:ascii="Arial" w:hAnsi="Arial" w:cs="Arial"/>
+                <w:sz w:val="22"/>
+                <w:szCs w:val="22"/>
               </w:rPr>
               <w:t>N</w:t>
             </w:r>
@@ -1281,19 +1344,17 @@
           <w:p>
             <w:pPr>
               <w:rPr>
-                <w:rFonts w:ascii="Bodoni MT" w:hAnsi="Bodoni MT"/>
-                <w:b/>
-                <w:sz w:val="28"/>
-                <w:szCs w:val="28"/>
+                <w:rFonts w:ascii="Arial" w:hAnsi="Arial" w:cs="Arial"/>
+                <w:sz w:val="22"/>
+                <w:szCs w:val="22"/>
               </w:rPr>
             </w:pPr>
             <w:sdt>
               <w:sdtPr>
                 <w:rPr>
-                  <w:rFonts w:ascii="Bodoni MT" w:hAnsi="Bodoni MT"/>
-                  <w:b/>
-                  <w:sz w:val="28"/>
-                  <w:szCs w:val="28"/>
+                  <w:rFonts w:ascii="Arial" w:hAnsi="Arial" w:cs="Arial"/>
+                  <w:sz w:val="22"/>
+                  <w:szCs w:val="22"/>
                 </w:rPr>
                 <w:id w:val="-696381677"/>
                 <w14:checkbox>
@@ -1306,10 +1367,9 @@
               <w:sdtContent>
                 <w:r>
                   <w:rPr>
-                    <w:rFonts w:ascii="MS Gothic" w:eastAsia="MS Gothic" w:hAnsi="MS Gothic" w:hint="eastAsia"/>
-                    <w:b/>
-                    <w:sz w:val="28"/>
-                    <w:szCs w:val="28"/>
+                    <w:rFonts w:ascii="Arial" w:eastAsia="MS Gothic" w:hAnsi="Arial" w:hint="eastAsia" w:cs="Arial"/>
+                    <w:sz w:val="22"/>
+                    <w:szCs w:val="22"/>
                   </w:rPr>
                   <w:t>☐</w:t>
                 </w:r>
@@ -1325,7 +1385,9 @@
           <w:p>
             <w:pPr>
               <w:rPr>
-                <w:rFonts w:ascii="Bodoni MT" w:hAnsi="Bodoni MT"/>
+                <w:rFonts w:ascii="Arial" w:hAnsi="Arial" w:cs="Arial"/>
+                <w:sz w:val="22"/>
+                <w:szCs w:val="22"/>
               </w:rPr>
             </w:pPr>
           </w:p>
@@ -1343,12 +1405,16 @@
           <w:p>
             <w:pPr>
               <w:rPr>
-                <w:rFonts w:ascii="Bodoni MT" w:hAnsi="Bodoni MT"/>
-              </w:rPr>
-            </w:pPr>
-            <w:r>
-              <w:rPr>
-                <w:rFonts w:ascii="Bodoni MT" w:hAnsi="Bodoni MT"/>
+                <w:rFonts w:ascii="Arial" w:hAnsi="Arial" w:cs="Arial"/>
+                <w:sz w:val="22"/>
+                <w:szCs w:val="22"/>
+              </w:rPr>
+            </w:pPr>
+            <w:r>
+              <w:rPr>
+                <w:rFonts w:ascii="Arial" w:hAnsi="Arial" w:cs="Arial"/>
+                <w:sz w:val="22"/>
+                <w:szCs w:val="22"/>
               </w:rPr>
               <w:t>Fascicolo fabbricato</w:t>
             </w:r>
@@ -1362,16 +1428,16 @@
           <w:p>
             <w:pPr>
               <w:rPr>
-                <w:rFonts w:ascii="Bodoni MT" w:hAnsi="Bodoni MT"/>
-                <w:b/>
-                <w:bCs/>
-              </w:rPr>
-            </w:pPr>
-            <w:r>
-              <w:rPr>
-                <w:rFonts w:ascii="Bodoni MT" w:hAnsi="Bodoni MT"/>
-                <w:b/>
-                <w:bCs/>
+                <w:rFonts w:ascii="Arial" w:hAnsi="Arial" w:cs="Arial"/>
+                <w:sz w:val="22"/>
+                <w:szCs w:val="22"/>
+              </w:rPr>
+            </w:pPr>
+            <w:r>
+              <w:rPr>
+                <w:rFonts w:ascii="Arial" w:hAnsi="Arial" w:cs="Arial"/>
+                <w:sz w:val="22"/>
+                <w:szCs w:val="22"/>
               </w:rPr>
               <w:t>Y</w:t>
             </w:r>
@@ -1385,19 +1451,17 @@
           <w:p>
             <w:pPr>
               <w:rPr>
-                <w:rFonts w:ascii="Bodoni MT" w:hAnsi="Bodoni MT"/>
-                <w:b/>
-                <w:sz w:val="28"/>
-                <w:szCs w:val="28"/>
+                <w:rFonts w:ascii="Arial" w:hAnsi="Arial" w:cs="Arial"/>
+                <w:sz w:val="22"/>
+                <w:szCs w:val="22"/>
               </w:rPr>
             </w:pPr>
             <w:sdt>
               <w:sdtPr>
                 <w:rPr>
-                  <w:rFonts w:ascii="Bodoni MT" w:hAnsi="Bodoni MT"/>
-                  <w:b/>
-                  <w:sz w:val="28"/>
-                  <w:szCs w:val="28"/>
+                  <w:rFonts w:ascii="Arial" w:hAnsi="Arial" w:cs="Arial"/>
+                  <w:sz w:val="22"/>
+                  <w:szCs w:val="22"/>
                 </w:rPr>
                 <w:id w:val="1795714910"/>
                 <w14:checkbox>
@@ -1410,10 +1474,9 @@
               <w:sdtContent>
                 <w:r>
                   <w:rPr>
-                    <w:rFonts w:ascii="MS Gothic" w:eastAsia="MS Gothic" w:hAnsi="MS Gothic" w:hint="eastAsia"/>
-                    <w:b/>
-                    <w:sz w:val="28"/>
-                    <w:szCs w:val="28"/>
+                    <w:rFonts w:ascii="Arial" w:eastAsia="MS Gothic" w:hAnsi="Arial" w:hint="eastAsia" w:cs="Arial"/>
+                    <w:sz w:val="22"/>
+                    <w:szCs w:val="22"/>
                   </w:rPr>
                   <w:t>☐</w:t>
                 </w:r>
@@ -1429,16 +1492,16 @@
           <w:p>
             <w:pPr>
               <w:rPr>
-                <w:rFonts w:ascii="Bodoni MT" w:hAnsi="Bodoni MT"/>
-                <w:b/>
-                <w:bCs/>
-              </w:rPr>
-            </w:pPr>
-            <w:r>
-              <w:rPr>
-                <w:rFonts w:ascii="Bodoni MT" w:hAnsi="Bodoni MT"/>
-                <w:b/>
-                <w:bCs/>
+                <w:rFonts w:ascii="Arial" w:hAnsi="Arial" w:cs="Arial"/>
+                <w:sz w:val="22"/>
+                <w:szCs w:val="22"/>
+              </w:rPr>
+            </w:pPr>
+            <w:r>
+              <w:rPr>
+                <w:rFonts w:ascii="Arial" w:hAnsi="Arial" w:cs="Arial"/>
+                <w:sz w:val="22"/>
+                <w:szCs w:val="22"/>
               </w:rPr>
               <w:t>N</w:t>
             </w:r>
@@ -1452,19 +1515,17 @@
           <w:p>
             <w:pPr>
               <w:rPr>
-                <w:rFonts w:ascii="Bodoni MT" w:hAnsi="Bodoni MT"/>
-                <w:b/>
-                <w:sz w:val="28"/>
-                <w:szCs w:val="28"/>
+                <w:rFonts w:ascii="Arial" w:hAnsi="Arial" w:cs="Arial"/>
+                <w:sz w:val="22"/>
+                <w:szCs w:val="22"/>
               </w:rPr>
             </w:pPr>
             <w:sdt>
               <w:sdtPr>
                 <w:rPr>
-                  <w:rFonts w:ascii="Bodoni MT" w:hAnsi="Bodoni MT"/>
-                  <w:b/>
-                  <w:sz w:val="28"/>
-                  <w:szCs w:val="28"/>
+                  <w:rFonts w:ascii="Arial" w:hAnsi="Arial" w:cs="Arial"/>
+                  <w:sz w:val="22"/>
+                  <w:szCs w:val="22"/>
                 </w:rPr>
                 <w:id w:val="-1137947703"/>
                 <w14:checkbox>
@@ -1477,10 +1538,9 @@
               <w:sdtContent>
                 <w:r>
                   <w:rPr>
-                    <w:rFonts w:ascii="MS Gothic" w:eastAsia="MS Gothic" w:hAnsi="MS Gothic" w:hint="eastAsia"/>
-                    <w:b/>
-                    <w:sz w:val="28"/>
-                    <w:szCs w:val="28"/>
+                    <w:rFonts w:ascii="Arial" w:eastAsia="MS Gothic" w:hAnsi="Arial" w:hint="eastAsia" w:cs="Arial"/>
+                    <w:sz w:val="22"/>
+                    <w:szCs w:val="22"/>
                   </w:rPr>
                   <w:t>☐</w:t>
                 </w:r>
@@ -1496,7 +1556,9 @@
           <w:p>
             <w:pPr>
               <w:rPr>
-                <w:rFonts w:ascii="Bodoni MT" w:hAnsi="Bodoni MT"/>
+                <w:rFonts w:ascii="Arial" w:hAnsi="Arial" w:cs="Arial"/>
+                <w:sz w:val="22"/>
+                <w:szCs w:val="22"/>
               </w:rPr>
             </w:pPr>
           </w:p>
@@ -1507,30 +1569,30 @@
       <w:pPr>
         <w:pStyle w:val="Titolo1"/>
         <w:rPr>
-          <w:rFonts w:ascii="Bodoni MT" w:hAnsi="Bodoni MT"/>
+          <w:rFonts w:ascii="Arial" w:hAnsi="Arial" w:cs="Arial"/>
           <w:i/>
           <w:iCs/>
-          <w:sz w:val="24"/>
-          <w:szCs w:val="24"/>
+          <w:sz w:val="22"/>
+          <w:szCs w:val="22"/>
         </w:rPr>
       </w:pPr>
       <w:r>
         <w:rPr>
-          <w:rFonts w:ascii="Bodoni MT" w:hAnsi="Bodoni MT"/>
+          <w:rFonts w:ascii="Arial" w:hAnsi="Arial" w:cs="Arial"/>
           <w:i/>
           <w:iCs/>
-          <w:sz w:val="24"/>
-          <w:szCs w:val="24"/>
+          <w:sz w:val="22"/>
+          <w:szCs w:val="22"/>
         </w:rPr>
         <w:t>Caratteristiche struttura</w:t>
       </w:r>
       <w:r>
         <w:rPr>
-          <w:rFonts w:ascii="Bodoni MT" w:hAnsi="Bodoni MT"/>
+          <w:rFonts w:ascii="Arial" w:hAnsi="Arial" w:cs="Arial"/>
           <w:i/>
           <w:iCs/>
-          <w:sz w:val="24"/>
-          <w:szCs w:val="24"/>
+          <w:sz w:val="22"/>
+          <w:szCs w:val="22"/>
         </w:rPr>
         <w:t xml:space="preserve"> </w:t>
       </w:r>
@@ -1561,16 +1623,16 @@
             <w:pPr>
               <w:jc w:val="center"/>
               <w:rPr>
-                <w:rFonts w:ascii="Bodoni MT" w:hAnsi="Bodoni MT"/>
-                <w:b/>
-                <w:bCs/>
-              </w:rPr>
-            </w:pPr>
-            <w:r>
-              <w:rPr>
-                <w:rFonts w:ascii="Bodoni MT" w:hAnsi="Bodoni MT"/>
-                <w:b/>
-                <w:bCs/>
+                <w:rFonts w:ascii="Arial" w:hAnsi="Arial" w:cs="Arial"/>
+                <w:sz w:val="22"/>
+                <w:szCs w:val="22"/>
+              </w:rPr>
+            </w:pPr>
+            <w:r>
+              <w:rPr>
+                <w:rFonts w:ascii="Arial" w:hAnsi="Arial" w:cs="Arial"/>
+                <w:sz w:val="22"/>
+                <w:szCs w:val="22"/>
               </w:rPr>
               <w:t>Check</w:t>
             </w:r>
@@ -1585,16 +1647,16 @@
             <w:pPr>
               <w:jc w:val="center"/>
               <w:rPr>
-                <w:rFonts w:ascii="Bodoni MT" w:hAnsi="Bodoni MT"/>
-                <w:b/>
-                <w:bCs/>
-              </w:rPr>
-            </w:pPr>
-            <w:r>
-              <w:rPr>
-                <w:rFonts w:ascii="Bodoni MT" w:hAnsi="Bodoni MT"/>
-                <w:b/>
-                <w:bCs/>
+                <w:rFonts w:ascii="Arial" w:hAnsi="Arial" w:cs="Arial"/>
+                <w:sz w:val="22"/>
+                <w:szCs w:val="22"/>
+              </w:rPr>
+            </w:pPr>
+            <w:r>
+              <w:rPr>
+                <w:rFonts w:ascii="Arial" w:hAnsi="Arial" w:cs="Arial"/>
+                <w:sz w:val="22"/>
+                <w:szCs w:val="22"/>
               </w:rPr>
               <w:t>Disp.</w:t>
             </w:r>
@@ -1609,16 +1671,16 @@
             <w:pPr>
               <w:jc w:val="center"/>
               <w:rPr>
-                <w:rFonts w:ascii="Bodoni MT" w:hAnsi="Bodoni MT"/>
-                <w:b/>
-                <w:bCs/>
-              </w:rPr>
-            </w:pPr>
-            <w:r>
-              <w:rPr>
-                <w:rFonts w:ascii="Bodoni MT" w:hAnsi="Bodoni MT"/>
-                <w:b/>
-                <w:bCs/>
+                <w:rFonts w:ascii="Arial" w:hAnsi="Arial" w:cs="Arial"/>
+                <w:sz w:val="22"/>
+                <w:szCs w:val="22"/>
+              </w:rPr>
+            </w:pPr>
+            <w:r>
+              <w:rPr>
+                <w:rFonts w:ascii="Arial" w:hAnsi="Arial" w:cs="Arial"/>
+                <w:sz w:val="22"/>
+                <w:szCs w:val="22"/>
               </w:rPr>
               <w:t>Note</w:t>
             </w:r>
@@ -1637,12 +1699,16 @@
           <w:p>
             <w:pPr>
               <w:rPr>
-                <w:rFonts w:ascii="Bodoni MT" w:hAnsi="Bodoni MT"/>
-              </w:rPr>
-            </w:pPr>
-            <w:r>
-              <w:rPr>
-                <w:rFonts w:ascii="Bodoni MT" w:hAnsi="Bodoni MT"/>
+                <w:rFonts w:ascii="Arial" w:hAnsi="Arial" w:cs="Arial"/>
+                <w:sz w:val="22"/>
+                <w:szCs w:val="22"/>
+              </w:rPr>
+            </w:pPr>
+            <w:r>
+              <w:rPr>
+                <w:rFonts w:ascii="Arial" w:hAnsi="Arial" w:cs="Arial"/>
+                <w:sz w:val="22"/>
+                <w:szCs w:val="22"/>
               </w:rPr>
               <w:t>Pavimenti – Tipologia e Stato</w:t>
             </w:r>
@@ -1656,17 +1722,16 @@
           <w:p>
             <w:pPr>
               <w:rPr>
-                <w:rFonts w:ascii="Bodoni MT" w:hAnsi="Bodoni MT"/>
-                <w:b/>
-                <w:sz w:val="28"/>
-                <w:szCs w:val="28"/>
-              </w:rPr>
-            </w:pPr>
-            <w:r>
-              <w:rPr>
-                <w:rFonts w:ascii="Bodoni MT" w:hAnsi="Bodoni MT"/>
-                <w:b/>
-                <w:bCs/>
+                <w:rFonts w:ascii="Arial" w:hAnsi="Arial" w:cs="Arial"/>
+                <w:sz w:val="22"/>
+                <w:szCs w:val="22"/>
+              </w:rPr>
+            </w:pPr>
+            <w:r>
+              <w:rPr>
+                <w:rFonts w:ascii="Arial" w:hAnsi="Arial" w:cs="Arial"/>
+                <w:sz w:val="22"/>
+                <w:szCs w:val="22"/>
               </w:rPr>
               <w:t>1    2    3    4</w:t>
             </w:r>
@@ -1680,7 +1745,9 @@
           <w:p>
             <w:pPr>
               <w:rPr>
-                <w:rFonts w:ascii="Bodoni MT" w:hAnsi="Bodoni MT"/>
+                <w:rFonts w:ascii="Arial" w:hAnsi="Arial" w:cs="Arial"/>
+                <w:sz w:val="22"/>
+                <w:szCs w:val="22"/>
               </w:rPr>
             </w:pPr>
           </w:p>
@@ -1698,18 +1765,24 @@
           <w:p>
             <w:pPr>
               <w:rPr>
-                <w:rFonts w:ascii="Bodoni MT" w:hAnsi="Bodoni MT"/>
-              </w:rPr>
-            </w:pPr>
-            <w:r>
-              <w:rPr>
-                <w:rFonts w:ascii="Bodoni MT" w:hAnsi="Bodoni MT"/>
+                <w:rFonts w:ascii="Arial" w:hAnsi="Arial" w:cs="Arial"/>
+                <w:sz w:val="22"/>
+                <w:szCs w:val="22"/>
+              </w:rPr>
+            </w:pPr>
+            <w:r>
+              <w:rPr>
+                <w:rFonts w:ascii="Arial" w:hAnsi="Arial" w:cs="Arial"/>
+                <w:sz w:val="22"/>
+                <w:szCs w:val="22"/>
               </w:rPr>
               <w:t>Pareti</w:t>
             </w:r>
             <w:r>
               <w:rPr>
-                <w:rFonts w:ascii="Bodoni MT" w:hAnsi="Bodoni MT"/>
+                <w:rFonts w:ascii="Arial" w:hAnsi="Arial" w:cs="Arial"/>
+                <w:sz w:val="22"/>
+                <w:szCs w:val="22"/>
               </w:rPr>
               <w:t xml:space="preserve"> – Tipologia e Stato</w:t>
             </w:r>
@@ -1723,17 +1796,16 @@
           <w:p>
             <w:pPr>
               <w:rPr>
-                <w:rFonts w:ascii="Bodoni MT" w:hAnsi="Bodoni MT"/>
-                <w:b/>
-                <w:sz w:val="28"/>
-                <w:szCs w:val="28"/>
-              </w:rPr>
-            </w:pPr>
-            <w:r>
-              <w:rPr>
-                <w:rFonts w:ascii="Bodoni MT" w:hAnsi="Bodoni MT"/>
-                <w:b/>
-                <w:bCs/>
+                <w:rFonts w:ascii="Arial" w:hAnsi="Arial" w:cs="Arial"/>
+                <w:sz w:val="22"/>
+                <w:szCs w:val="22"/>
+              </w:rPr>
+            </w:pPr>
+            <w:r>
+              <w:rPr>
+                <w:rFonts w:ascii="Arial" w:hAnsi="Arial" w:cs="Arial"/>
+                <w:sz w:val="22"/>
+                <w:szCs w:val="22"/>
               </w:rPr>
               <w:t>1    2    3    4</w:t>
             </w:r>
@@ -1747,7 +1819,9 @@
           <w:p>
             <w:pPr>
               <w:rPr>
-                <w:rFonts w:ascii="Bodoni MT" w:hAnsi="Bodoni MT"/>
+                <w:rFonts w:ascii="Arial" w:hAnsi="Arial" w:cs="Arial"/>
+                <w:sz w:val="22"/>
+                <w:szCs w:val="22"/>
               </w:rPr>
             </w:pPr>
           </w:p>
@@ -1765,18 +1839,24 @@
           <w:p>
             <w:pPr>
               <w:rPr>
-                <w:rFonts w:ascii="Bodoni MT" w:hAnsi="Bodoni MT"/>
-              </w:rPr>
-            </w:pPr>
-            <w:r>
-              <w:rPr>
-                <w:rFonts w:ascii="Bodoni MT" w:hAnsi="Bodoni MT"/>
+                <w:rFonts w:ascii="Arial" w:hAnsi="Arial" w:cs="Arial"/>
+                <w:sz w:val="22"/>
+                <w:szCs w:val="22"/>
+              </w:rPr>
+            </w:pPr>
+            <w:r>
+              <w:rPr>
+                <w:rFonts w:ascii="Arial" w:hAnsi="Arial" w:cs="Arial"/>
+                <w:sz w:val="22"/>
+                <w:szCs w:val="22"/>
               </w:rPr>
               <w:t xml:space="preserve">Infissi Interni - </w:t>
             </w:r>
             <w:r>
               <w:rPr>
-                <w:rFonts w:ascii="Bodoni MT" w:hAnsi="Bodoni MT"/>
+                <w:rFonts w:ascii="Arial" w:hAnsi="Arial" w:cs="Arial"/>
+                <w:sz w:val="22"/>
+                <w:szCs w:val="22"/>
               </w:rPr>
               <w:t>Tipologia e Stato</w:t>
             </w:r>
@@ -1790,17 +1870,16 @@
           <w:p>
             <w:pPr>
               <w:rPr>
-                <w:rFonts w:ascii="Bodoni MT" w:hAnsi="Bodoni MT"/>
-                <w:b/>
-                <w:sz w:val="28"/>
-                <w:szCs w:val="28"/>
-              </w:rPr>
-            </w:pPr>
-            <w:r>
-              <w:rPr>
-                <w:rFonts w:ascii="Bodoni MT" w:hAnsi="Bodoni MT"/>
-                <w:b/>
-                <w:bCs/>
+                <w:rFonts w:ascii="Arial" w:hAnsi="Arial" w:cs="Arial"/>
+                <w:sz w:val="22"/>
+                <w:szCs w:val="22"/>
+              </w:rPr>
+            </w:pPr>
+            <w:r>
+              <w:rPr>
+                <w:rFonts w:ascii="Arial" w:hAnsi="Arial" w:cs="Arial"/>
+                <w:sz w:val="22"/>
+                <w:szCs w:val="22"/>
               </w:rPr>
               <w:t>1    2    3    4</w:t>
             </w:r>
@@ -1814,7 +1893,9 @@
           <w:p>
             <w:pPr>
               <w:rPr>
-                <w:rFonts w:ascii="Bodoni MT" w:hAnsi="Bodoni MT"/>
+                <w:rFonts w:ascii="Arial" w:hAnsi="Arial" w:cs="Arial"/>
+                <w:sz w:val="22"/>
+                <w:szCs w:val="22"/>
               </w:rPr>
             </w:pPr>
           </w:p>
@@ -1832,24 +1913,32 @@
           <w:p>
             <w:pPr>
               <w:rPr>
-                <w:rFonts w:ascii="Bodoni MT" w:hAnsi="Bodoni MT"/>
-              </w:rPr>
-            </w:pPr>
-            <w:r>
-              <w:rPr>
-                <w:rFonts w:ascii="Bodoni MT" w:hAnsi="Bodoni MT"/>
+                <w:rFonts w:ascii="Arial" w:hAnsi="Arial" w:cs="Arial"/>
+                <w:sz w:val="22"/>
+                <w:szCs w:val="22"/>
+              </w:rPr>
+            </w:pPr>
+            <w:r>
+              <w:rPr>
+                <w:rFonts w:ascii="Arial" w:hAnsi="Arial" w:cs="Arial"/>
+                <w:sz w:val="22"/>
+                <w:szCs w:val="22"/>
               </w:rPr>
               <w:t xml:space="preserve">Infissi </w:t>
             </w:r>
             <w:r>
               <w:rPr>
-                <w:rFonts w:ascii="Bodoni MT" w:hAnsi="Bodoni MT"/>
+                <w:rFonts w:ascii="Arial" w:hAnsi="Arial" w:cs="Arial"/>
+                <w:sz w:val="22"/>
+                <w:szCs w:val="22"/>
               </w:rPr>
               <w:t>Esterni</w:t>
             </w:r>
             <w:r>
               <w:rPr>
-                <w:rFonts w:ascii="Bodoni MT" w:hAnsi="Bodoni MT"/>
+                <w:rFonts w:ascii="Arial" w:hAnsi="Arial" w:cs="Arial"/>
+                <w:sz w:val="22"/>
+                <w:szCs w:val="22"/>
               </w:rPr>
               <w:t xml:space="preserve"> - Tipologia e Stato</w:t>
             </w:r>
@@ -1863,14 +1952,16 @@
           <w:p>
             <w:pPr>
               <w:rPr>
-                <w:rFonts w:ascii="Bodoni MT" w:hAnsi="Bodoni MT"/>
-              </w:rPr>
-            </w:pPr>
-            <w:r>
-              <w:rPr>
-                <w:rFonts w:ascii="Bodoni MT" w:hAnsi="Bodoni MT"/>
-                <w:b/>
-                <w:bCs/>
+                <w:rFonts w:ascii="Arial" w:hAnsi="Arial" w:cs="Arial"/>
+                <w:sz w:val="22"/>
+                <w:szCs w:val="22"/>
+              </w:rPr>
+            </w:pPr>
+            <w:r>
+              <w:rPr>
+                <w:rFonts w:ascii="Arial" w:hAnsi="Arial" w:cs="Arial"/>
+                <w:sz w:val="22"/>
+                <w:szCs w:val="22"/>
               </w:rPr>
               <w:t>1    2    3    4</w:t>
             </w:r>
@@ -1884,7 +1975,9 @@
           <w:p>
             <w:pPr>
               <w:rPr>
-                <w:rFonts w:ascii="Bodoni MT" w:hAnsi="Bodoni MT"/>
+                <w:rFonts w:ascii="Arial" w:hAnsi="Arial" w:cs="Arial"/>
+                <w:sz w:val="22"/>
+                <w:szCs w:val="22"/>
               </w:rPr>
             </w:pPr>
           </w:p>
@@ -1902,18 +1995,24 @@
           <w:p>
             <w:pPr>
               <w:rPr>
-                <w:rFonts w:ascii="Bodoni MT" w:hAnsi="Bodoni MT"/>
-              </w:rPr>
-            </w:pPr>
-            <w:r>
-              <w:rPr>
-                <w:rFonts w:ascii="Bodoni MT" w:hAnsi="Bodoni MT"/>
+                <w:rFonts w:ascii="Arial" w:hAnsi="Arial" w:cs="Arial"/>
+                <w:sz w:val="22"/>
+                <w:szCs w:val="22"/>
+              </w:rPr>
+            </w:pPr>
+            <w:r>
+              <w:rPr>
+                <w:rFonts w:ascii="Arial" w:hAnsi="Arial" w:cs="Arial"/>
+                <w:sz w:val="22"/>
+                <w:szCs w:val="22"/>
               </w:rPr>
               <w:t xml:space="preserve">Solaio di copertura - </w:t>
             </w:r>
             <w:r>
               <w:rPr>
-                <w:rFonts w:ascii="Bodoni MT" w:hAnsi="Bodoni MT"/>
+                <w:rFonts w:ascii="Arial" w:hAnsi="Arial" w:cs="Arial"/>
+                <w:sz w:val="22"/>
+                <w:szCs w:val="22"/>
               </w:rPr>
               <w:t>- Tipologia e Stato</w:t>
             </w:r>
@@ -1927,17 +2026,16 @@
           <w:p>
             <w:pPr>
               <w:rPr>
-                <w:rFonts w:ascii="Bodoni MT" w:hAnsi="Bodoni MT"/>
-                <w:b/>
-                <w:sz w:val="28"/>
-                <w:szCs w:val="28"/>
-              </w:rPr>
-            </w:pPr>
-            <w:r>
-              <w:rPr>
-                <w:rFonts w:ascii="Bodoni MT" w:hAnsi="Bodoni MT"/>
-                <w:b/>
-                <w:bCs/>
+                <w:rFonts w:ascii="Arial" w:hAnsi="Arial" w:cs="Arial"/>
+                <w:sz w:val="22"/>
+                <w:szCs w:val="22"/>
+              </w:rPr>
+            </w:pPr>
+            <w:r>
+              <w:rPr>
+                <w:rFonts w:ascii="Arial" w:hAnsi="Arial" w:cs="Arial"/>
+                <w:sz w:val="22"/>
+                <w:szCs w:val="22"/>
               </w:rPr>
               <w:t>1    2    3    4</w:t>
             </w:r>
@@ -1951,7 +2049,9 @@
           <w:p>
             <w:pPr>
               <w:rPr>
-                <w:rFonts w:ascii="Bodoni MT" w:hAnsi="Bodoni MT"/>
+                <w:rFonts w:ascii="Arial" w:hAnsi="Arial" w:cs="Arial"/>
+                <w:sz w:val="22"/>
+                <w:szCs w:val="22"/>
               </w:rPr>
             </w:pPr>
           </w:p>
@@ -1969,18 +2069,24 @@
           <w:p>
             <w:pPr>
               <w:rPr>
-                <w:rFonts w:ascii="Bodoni MT" w:hAnsi="Bodoni MT"/>
-              </w:rPr>
-            </w:pPr>
-            <w:r>
-              <w:rPr>
-                <w:rFonts w:ascii="Bodoni MT" w:hAnsi="Bodoni MT"/>
+                <w:rFonts w:ascii="Arial" w:hAnsi="Arial" w:cs="Arial"/>
+                <w:sz w:val="22"/>
+                <w:szCs w:val="22"/>
+              </w:rPr>
+            </w:pPr>
+            <w:r>
+              <w:rPr>
+                <w:rFonts w:ascii="Arial" w:hAnsi="Arial" w:cs="Arial"/>
+                <w:sz w:val="22"/>
+                <w:szCs w:val="22"/>
               </w:rPr>
               <w:t xml:space="preserve">Controsoffitto </w:t>
             </w:r>
             <w:r>
               <w:rPr>
-                <w:rFonts w:ascii="Bodoni MT" w:hAnsi="Bodoni MT"/>
+                <w:rFonts w:ascii="Arial" w:hAnsi="Arial" w:cs="Arial"/>
+                <w:sz w:val="22"/>
+                <w:szCs w:val="22"/>
               </w:rPr>
               <w:t>- Tipologia e Stato</w:t>
             </w:r>
@@ -1994,14 +2100,16 @@
           <w:p>
             <w:pPr>
               <w:rPr>
-                <w:rFonts w:ascii="Bodoni MT" w:hAnsi="Bodoni MT"/>
-              </w:rPr>
-            </w:pPr>
-            <w:r>
-              <w:rPr>
-                <w:rFonts w:ascii="Bodoni MT" w:hAnsi="Bodoni MT"/>
-                <w:b/>
-                <w:bCs/>
+                <w:rFonts w:ascii="Arial" w:hAnsi="Arial" w:cs="Arial"/>
+                <w:sz w:val="22"/>
+                <w:szCs w:val="22"/>
+              </w:rPr>
+            </w:pPr>
+            <w:r>
+              <w:rPr>
+                <w:rFonts w:ascii="Arial" w:hAnsi="Arial" w:cs="Arial"/>
+                <w:sz w:val="22"/>
+                <w:szCs w:val="22"/>
               </w:rPr>
               <w:t>1    2    3    4</w:t>
             </w:r>
@@ -2015,7 +2123,9 @@
           <w:p>
             <w:pPr>
               <w:rPr>
-                <w:rFonts w:ascii="Bodoni MT" w:hAnsi="Bodoni MT"/>
+                <w:rFonts w:ascii="Arial" w:hAnsi="Arial" w:cs="Arial"/>
+                <w:sz w:val="22"/>
+                <w:szCs w:val="22"/>
               </w:rPr>
             </w:pPr>
           </w:p>
@@ -2033,18 +2143,24 @@
           <w:p>
             <w:pPr>
               <w:rPr>
-                <w:rFonts w:ascii="Bodoni MT" w:hAnsi="Bodoni MT"/>
-              </w:rPr>
-            </w:pPr>
-            <w:r>
-              <w:rPr>
-                <w:rFonts w:ascii="Bodoni MT" w:hAnsi="Bodoni MT"/>
+                <w:rFonts w:ascii="Arial" w:hAnsi="Arial" w:cs="Arial"/>
+                <w:sz w:val="22"/>
+                <w:szCs w:val="22"/>
+              </w:rPr>
+            </w:pPr>
+            <w:r>
+              <w:rPr>
+                <w:rFonts w:ascii="Arial" w:hAnsi="Arial" w:cs="Arial"/>
+                <w:sz w:val="22"/>
+                <w:szCs w:val="22"/>
               </w:rPr>
               <w:t>Pitturazione</w:t>
             </w:r>
             <w:r>
               <w:rPr>
-                <w:rFonts w:ascii="Bodoni MT" w:hAnsi="Bodoni MT"/>
+                <w:rFonts w:ascii="Arial" w:hAnsi="Arial" w:cs="Arial"/>
+                <w:sz w:val="22"/>
+                <w:szCs w:val="22"/>
               </w:rPr>
               <w:t xml:space="preserve"> - Tipologia e Stato</w:t>
             </w:r>
@@ -2058,14 +2174,16 @@
           <w:p>
             <w:pPr>
               <w:rPr>
-                <w:rFonts w:ascii="Bodoni MT" w:hAnsi="Bodoni MT"/>
-              </w:rPr>
-            </w:pPr>
-            <w:r>
-              <w:rPr>
-                <w:rFonts w:ascii="Bodoni MT" w:hAnsi="Bodoni MT"/>
-                <w:b/>
-                <w:bCs/>
+                <w:rFonts w:ascii="Arial" w:hAnsi="Arial" w:cs="Arial"/>
+                <w:sz w:val="22"/>
+                <w:szCs w:val="22"/>
+              </w:rPr>
+            </w:pPr>
+            <w:r>
+              <w:rPr>
+                <w:rFonts w:ascii="Arial" w:hAnsi="Arial" w:cs="Arial"/>
+                <w:sz w:val="22"/>
+                <w:szCs w:val="22"/>
               </w:rPr>
               <w:t>1    2    3    4</w:t>
             </w:r>
@@ -2079,7 +2197,9 @@
           <w:p>
             <w:pPr>
               <w:rPr>
-                <w:rFonts w:ascii="Bodoni MT" w:hAnsi="Bodoni MT"/>
+                <w:rFonts w:ascii="Arial" w:hAnsi="Arial" w:cs="Arial"/>
+                <w:sz w:val="22"/>
+                <w:szCs w:val="22"/>
               </w:rPr>
             </w:pPr>
           </w:p>
@@ -2090,34 +2210,34 @@
       <w:pPr>
         <w:spacing w:after="0" w:line="240" w:lineRule="auto"/>
         <w:rPr>
-          <w:rFonts w:ascii="Bodoni MT" w:hAnsi="Bodoni MT"/>
-          <w:b/>
-          <w:bCs/>
+          <w:rFonts w:ascii="Arial" w:hAnsi="Arial" w:cs="Arial"/>
+          <w:sz w:val="22"/>
+          <w:szCs w:val="22"/>
         </w:rPr>
       </w:pPr>
       <w:r>
         <w:rPr>
-          <w:rFonts w:ascii="Bodoni MT" w:hAnsi="Bodoni MT"/>
-          <w:b/>
-          <w:bCs/>
+          <w:rFonts w:ascii="Arial" w:hAnsi="Arial" w:cs="Arial"/>
+          <w:sz w:val="22"/>
+          <w:szCs w:val="22"/>
         </w:rPr>
         <w:t>1 - Buono stato di conservazione…</w:t>
       </w:r>
       <w:proofErr w:type="gramStart"/>
       <w:r>
         <w:rPr>
-          <w:rFonts w:ascii="Bodoni MT" w:hAnsi="Bodoni MT"/>
-          <w:b/>
-          <w:bCs/>
+          <w:rFonts w:ascii="Arial" w:hAnsi="Arial" w:cs="Arial"/>
+          <w:sz w:val="22"/>
+          <w:szCs w:val="22"/>
         </w:rPr>
         <w:t>…….</w:t>
       </w:r>
       <w:proofErr w:type="gramEnd"/>
       <w:r>
         <w:rPr>
-          <w:rFonts w:ascii="Bodoni MT" w:hAnsi="Bodoni MT"/>
-          <w:b/>
-          <w:bCs/>
+          <w:rFonts w:ascii="Arial" w:hAnsi="Arial" w:cs="Arial"/>
+          <w:sz w:val="22"/>
+          <w:szCs w:val="22"/>
         </w:rPr>
         <w:t>4 - Cattivo stato di conservazione</w:t>
       </w:r>
@@ -2126,40 +2246,40 @@
       <w:pPr>
         <w:pStyle w:val="Titolo1"/>
         <w:rPr>
-          <w:rFonts w:ascii="Bodoni MT" w:hAnsi="Bodoni MT"/>
+          <w:rFonts w:ascii="Arial" w:hAnsi="Arial" w:cs="Arial"/>
           <w:i/>
           <w:iCs/>
-          <w:sz w:val="24"/>
-          <w:szCs w:val="24"/>
+          <w:sz w:val="22"/>
+          <w:szCs w:val="22"/>
         </w:rPr>
       </w:pPr>
       <w:r>
         <w:rPr>
-          <w:rFonts w:ascii="Bodoni MT" w:hAnsi="Bodoni MT"/>
+          <w:rFonts w:ascii="Arial" w:hAnsi="Arial" w:cs="Arial"/>
           <w:i/>
           <w:iCs/>
-          <w:sz w:val="24"/>
-          <w:szCs w:val="24"/>
+          <w:sz w:val="22"/>
+          <w:szCs w:val="22"/>
         </w:rPr>
         <w:t xml:space="preserve">Stato </w:t>
       </w:r>
       <w:r>
         <w:rPr>
-          <w:rFonts w:ascii="Bodoni MT" w:hAnsi="Bodoni MT"/>
+          <w:rFonts w:ascii="Arial" w:hAnsi="Arial" w:cs="Arial"/>
           <w:i/>
           <w:iCs/>
-          <w:sz w:val="24"/>
-          <w:szCs w:val="24"/>
+          <w:sz w:val="22"/>
+          <w:szCs w:val="22"/>
         </w:rPr>
         <w:t>strutture</w:t>
       </w:r>
       <w:r>
         <w:rPr>
-          <w:rFonts w:ascii="Bodoni MT" w:hAnsi="Bodoni MT"/>
+          <w:rFonts w:ascii="Arial" w:hAnsi="Arial" w:cs="Arial"/>
           <w:i/>
           <w:iCs/>
-          <w:sz w:val="24"/>
-          <w:szCs w:val="24"/>
+          <w:sz w:val="22"/>
+          <w:szCs w:val="22"/>
         </w:rPr>
         <w:t xml:space="preserve"> e verifica visiva</w:t>
       </w:r>
@@ -2193,16 +2313,16 @@
             <w:pPr>
               <w:jc w:val="center"/>
               <w:rPr>
-                <w:rFonts w:ascii="Bodoni MT" w:hAnsi="Bodoni MT"/>
-                <w:b/>
-                <w:bCs/>
-              </w:rPr>
-            </w:pPr>
-            <w:r>
-              <w:rPr>
-                <w:rFonts w:ascii="Bodoni MT" w:hAnsi="Bodoni MT"/>
-                <w:b/>
-                <w:bCs/>
+                <w:rFonts w:ascii="Arial" w:hAnsi="Arial" w:cs="Arial"/>
+                <w:sz w:val="22"/>
+                <w:szCs w:val="22"/>
+              </w:rPr>
+            </w:pPr>
+            <w:r>
+              <w:rPr>
+                <w:rFonts w:ascii="Arial" w:hAnsi="Arial" w:cs="Arial"/>
+                <w:sz w:val="22"/>
+                <w:szCs w:val="22"/>
               </w:rPr>
               <w:t>Check</w:t>
             </w:r>
@@ -2218,16 +2338,16 @@
             <w:pPr>
               <w:jc w:val="center"/>
               <w:rPr>
-                <w:rFonts w:ascii="Bodoni MT" w:hAnsi="Bodoni MT"/>
-                <w:b/>
-                <w:bCs/>
-              </w:rPr>
-            </w:pPr>
-            <w:r>
-              <w:rPr>
-                <w:rFonts w:ascii="Bodoni MT" w:hAnsi="Bodoni MT"/>
-                <w:b/>
-                <w:bCs/>
+                <w:rFonts w:ascii="Arial" w:hAnsi="Arial" w:cs="Arial"/>
+                <w:sz w:val="22"/>
+                <w:szCs w:val="22"/>
+              </w:rPr>
+            </w:pPr>
+            <w:r>
+              <w:rPr>
+                <w:rFonts w:ascii="Arial" w:hAnsi="Arial" w:cs="Arial"/>
+                <w:sz w:val="22"/>
+                <w:szCs w:val="22"/>
               </w:rPr>
               <w:t>Disp.</w:t>
             </w:r>
@@ -2242,16 +2362,16 @@
             <w:pPr>
               <w:jc w:val="center"/>
               <w:rPr>
-                <w:rFonts w:ascii="Bodoni MT" w:hAnsi="Bodoni MT"/>
-                <w:b/>
-                <w:bCs/>
-              </w:rPr>
-            </w:pPr>
-            <w:r>
-              <w:rPr>
-                <w:rFonts w:ascii="Bodoni MT" w:hAnsi="Bodoni MT"/>
-                <w:b/>
-                <w:bCs/>
+                <w:rFonts w:ascii="Arial" w:hAnsi="Arial" w:cs="Arial"/>
+                <w:sz w:val="22"/>
+                <w:szCs w:val="22"/>
+              </w:rPr>
+            </w:pPr>
+            <w:r>
+              <w:rPr>
+                <w:rFonts w:ascii="Arial" w:hAnsi="Arial" w:cs="Arial"/>
+                <w:sz w:val="22"/>
+                <w:szCs w:val="22"/>
               </w:rPr>
               <w:t>Note</w:t>
             </w:r>
@@ -2270,26 +2390,34 @@
           <w:p>
             <w:pPr>
               <w:rPr>
-                <w:rFonts w:ascii="Bodoni MT" w:hAnsi="Bodoni MT"/>
-              </w:rPr>
-            </w:pPr>
-            <w:r>
-              <w:rPr>
-                <w:rFonts w:ascii="Bodoni MT" w:hAnsi="Bodoni MT"/>
+                <w:rFonts w:ascii="Arial" w:hAnsi="Arial" w:cs="Arial"/>
+                <w:sz w:val="22"/>
+                <w:szCs w:val="22"/>
+              </w:rPr>
+            </w:pPr>
+            <w:r>
+              <w:rPr>
+                <w:rFonts w:ascii="Arial" w:hAnsi="Arial" w:cs="Arial"/>
+                <w:sz w:val="22"/>
+                <w:szCs w:val="22"/>
               </w:rPr>
               <w:t xml:space="preserve">Verifica della presenza di umidità, infiltrazioni, </w:t>
             </w:r>
             <w:proofErr w:type="spellStart"/>
             <w:r>
               <w:rPr>
-                <w:rFonts w:ascii="Bodoni MT" w:hAnsi="Bodoni MT"/>
+                <w:rFonts w:ascii="Arial" w:hAnsi="Arial" w:cs="Arial"/>
+                <w:sz w:val="22"/>
+                <w:szCs w:val="22"/>
               </w:rPr>
               <w:t>ecc</w:t>
             </w:r>
             <w:proofErr w:type="spellEnd"/>
             <w:r>
               <w:rPr>
-                <w:rFonts w:ascii="Bodoni MT" w:hAnsi="Bodoni MT"/>
+                <w:rFonts w:ascii="Arial" w:hAnsi="Arial" w:cs="Arial"/>
+                <w:sz w:val="22"/>
+                <w:szCs w:val="22"/>
               </w:rPr>
               <w:t>…</w:t>
             </w:r>
@@ -2303,16 +2431,16 @@
           <w:p>
             <w:pPr>
               <w:rPr>
-                <w:rFonts w:ascii="Bodoni MT" w:hAnsi="Bodoni MT"/>
-                <w:b/>
-                <w:bCs/>
-              </w:rPr>
-            </w:pPr>
-            <w:r>
-              <w:rPr>
-                <w:rFonts w:ascii="Bodoni MT" w:hAnsi="Bodoni MT"/>
-                <w:b/>
-                <w:bCs/>
+                <w:rFonts w:ascii="Arial" w:hAnsi="Arial" w:cs="Arial"/>
+                <w:sz w:val="22"/>
+                <w:szCs w:val="22"/>
+              </w:rPr>
+            </w:pPr>
+            <w:r>
+              <w:rPr>
+                <w:rFonts w:ascii="Arial" w:hAnsi="Arial" w:cs="Arial"/>
+                <w:sz w:val="22"/>
+                <w:szCs w:val="22"/>
               </w:rPr>
               <w:t>Y</w:t>
             </w:r>
@@ -2326,19 +2454,17 @@
           <w:p>
             <w:pPr>
               <w:rPr>
-                <w:rFonts w:ascii="Bodoni MT" w:hAnsi="Bodoni MT"/>
-                <w:b/>
-                <w:sz w:val="28"/>
-                <w:szCs w:val="28"/>
+                <w:rFonts w:ascii="Arial" w:hAnsi="Arial" w:cs="Arial"/>
+                <w:sz w:val="22"/>
+                <w:szCs w:val="22"/>
               </w:rPr>
             </w:pPr>
             <w:sdt>
               <w:sdtPr>
                 <w:rPr>
-                  <w:rFonts w:ascii="Bodoni MT" w:hAnsi="Bodoni MT"/>
-                  <w:b/>
-                  <w:sz w:val="28"/>
-                  <w:szCs w:val="28"/>
+                  <w:rFonts w:ascii="Arial" w:hAnsi="Arial" w:cs="Arial"/>
+                  <w:sz w:val="22"/>
+                  <w:szCs w:val="22"/>
                 </w:rPr>
                 <w:id w:val="1926303597"/>
                 <w14:checkbox>
@@ -2351,10 +2477,9 @@
               <w:sdtContent>
                 <w:r>
                   <w:rPr>
-                    <w:rFonts w:ascii="MS Gothic" w:eastAsia="MS Gothic" w:hAnsi="MS Gothic" w:hint="eastAsia"/>
-                    <w:b/>
-                    <w:sz w:val="28"/>
-                    <w:szCs w:val="28"/>
+                    <w:rFonts w:ascii="Arial" w:eastAsia="MS Gothic" w:hAnsi="Arial" w:hint="eastAsia" w:cs="Arial"/>
+                    <w:sz w:val="22"/>
+                    <w:szCs w:val="22"/>
                   </w:rPr>
                   <w:t>☐</w:t>
                 </w:r>
@@ -2370,16 +2495,16 @@
           <w:p>
             <w:pPr>
               <w:rPr>
-                <w:rFonts w:ascii="Bodoni MT" w:hAnsi="Bodoni MT"/>
-                <w:b/>
-                <w:bCs/>
-              </w:rPr>
-            </w:pPr>
-            <w:r>
-              <w:rPr>
-                <w:rFonts w:ascii="Bodoni MT" w:hAnsi="Bodoni MT"/>
-                <w:b/>
-                <w:bCs/>
+                <w:rFonts w:ascii="Arial" w:hAnsi="Arial" w:cs="Arial"/>
+                <w:sz w:val="22"/>
+                <w:szCs w:val="22"/>
+              </w:rPr>
+            </w:pPr>
+            <w:r>
+              <w:rPr>
+                <w:rFonts w:ascii="Arial" w:hAnsi="Arial" w:cs="Arial"/>
+                <w:sz w:val="22"/>
+                <w:szCs w:val="22"/>
               </w:rPr>
               <w:t>N</w:t>
             </w:r>
@@ -2393,19 +2518,17 @@
           <w:p>
             <w:pPr>
               <w:rPr>
-                <w:rFonts w:ascii="Bodoni MT" w:hAnsi="Bodoni MT"/>
-                <w:b/>
-                <w:sz w:val="28"/>
-                <w:szCs w:val="28"/>
+                <w:rFonts w:ascii="Arial" w:hAnsi="Arial" w:cs="Arial"/>
+                <w:sz w:val="22"/>
+                <w:szCs w:val="22"/>
               </w:rPr>
             </w:pPr>
             <w:sdt>
               <w:sdtPr>
                 <w:rPr>
-                  <w:rFonts w:ascii="Bodoni MT" w:hAnsi="Bodoni MT"/>
-                  <w:b/>
-                  <w:sz w:val="28"/>
-                  <w:szCs w:val="28"/>
+                  <w:rFonts w:ascii="Arial" w:hAnsi="Arial" w:cs="Arial"/>
+                  <w:sz w:val="22"/>
+                  <w:szCs w:val="22"/>
                 </w:rPr>
                 <w:id w:val="203299786"/>
                 <w14:checkbox>
@@ -2418,10 +2541,9 @@
               <w:sdtContent>
                 <w:r>
                   <w:rPr>
-                    <w:rFonts w:ascii="MS Gothic" w:eastAsia="MS Gothic" w:hAnsi="MS Gothic" w:hint="eastAsia"/>
-                    <w:b/>
-                    <w:sz w:val="28"/>
-                    <w:szCs w:val="28"/>
+                    <w:rFonts w:ascii="Arial" w:eastAsia="MS Gothic" w:hAnsi="Arial" w:hint="eastAsia" w:cs="Arial"/>
+                    <w:sz w:val="22"/>
+                    <w:szCs w:val="22"/>
                   </w:rPr>
                   <w:t>☐</w:t>
                 </w:r>
@@ -2437,7 +2559,9 @@
           <w:p>
             <w:pPr>
               <w:rPr>
-                <w:rFonts w:ascii="Bodoni MT" w:hAnsi="Bodoni MT"/>
+                <w:rFonts w:ascii="Arial" w:hAnsi="Arial" w:cs="Arial"/>
+                <w:sz w:val="22"/>
+                <w:szCs w:val="22"/>
               </w:rPr>
             </w:pPr>
           </w:p>
@@ -2447,7 +2571,9 @@
     <w:p>
       <w:pPr>
         <w:rPr>
-          <w:rFonts w:ascii="Bodoni MT" w:hAnsi="Bodoni MT"/>
+          <w:rFonts w:ascii="Arial" w:hAnsi="Arial" w:cs="Arial"/>
+          <w:sz w:val="22"/>
+          <w:szCs w:val="22"/>
         </w:rPr>
       </w:pPr>
     </w:p>
@@ -2461,20 +2587,20 @@
         <w:pStyle w:val="Titolo1"/>
         <w:keepNext/>
         <w:rPr>
-          <w:rFonts w:ascii="Bodoni MT" w:hAnsi="Bodoni MT"/>
+          <w:rFonts w:ascii="Arial" w:hAnsi="Arial" w:cs="Arial"/>
           <w:i/>
           <w:iCs/>
-          <w:sz w:val="24"/>
-          <w:szCs w:val="24"/>
+          <w:sz w:val="22"/>
+          <w:szCs w:val="22"/>
         </w:rPr>
       </w:pPr>
       <w:r>
         <w:rPr>
-          <w:rFonts w:ascii="Bodoni MT" w:hAnsi="Bodoni MT"/>
+          <w:rFonts w:ascii="Arial" w:hAnsi="Arial" w:cs="Arial"/>
           <w:i/>
           <w:iCs/>
-          <w:sz w:val="24"/>
-          <w:szCs w:val="24"/>
+          <w:sz w:val="22"/>
+          <w:szCs w:val="22"/>
         </w:rPr>
         <w:t xml:space="preserve">NOTE E RELAZIONI</w:t>
       </w:r>
@@ -2483,7 +2609,7 @@
       <w:pPr>
         <w:spacing w:after="160"/>
         <w:rPr>
-          <w:rFonts w:ascii="Bodoni MT" w:hAnsi="Bodoni MT"/>
+          <w:rFonts w:ascii="Arial" w:hAnsi="Arial" w:cs="Arial"/>
           <w:i/>
           <w:iCs/>
           <w:sz w:val="22"/>
@@ -2492,7 +2618,7 @@
       </w:pPr>
       <w:r>
         <w:rPr>
-          <w:rFonts w:ascii="Bodoni MT" w:hAnsi="Bodoni MT"/>
+          <w:rFonts w:ascii="Arial" w:hAnsi="Arial" w:cs="Arial"/>
           <w:i/>
           <w:iCs/>
           <w:sz w:val="22"/>
@@ -2508,7 +2634,9 @@
           <w:bottom w:val="single" w:sz="6" w:space="1" w:color="808080"/>
         </w:pBdr>
         <w:rPr>
-          <w:rFonts w:ascii="Bodoni MT" w:hAnsi="Bodoni MT"/>
+          <w:rFonts w:ascii="Arial" w:hAnsi="Arial" w:cs="Arial"/>
+          <w:sz w:val="22"/>
+          <w:szCs w:val="22"/>
         </w:rPr>
       </w:pPr>
     </w:p>
@@ -2519,7 +2647,9 @@
           <w:bottom w:val="single" w:sz="6" w:space="1" w:color="808080"/>
         </w:pBdr>
         <w:rPr>
-          <w:rFonts w:ascii="Bodoni MT" w:hAnsi="Bodoni MT"/>
+          <w:rFonts w:ascii="Arial" w:hAnsi="Arial" w:cs="Arial"/>
+          <w:sz w:val="22"/>
+          <w:szCs w:val="22"/>
         </w:rPr>
       </w:pPr>
     </w:p>
@@ -2530,7 +2660,9 @@
           <w:bottom w:val="single" w:sz="6" w:space="1" w:color="808080"/>
         </w:pBdr>
         <w:rPr>
-          <w:rFonts w:ascii="Bodoni MT" w:hAnsi="Bodoni MT"/>
+          <w:rFonts w:ascii="Arial" w:hAnsi="Arial" w:cs="Arial"/>
+          <w:sz w:val="22"/>
+          <w:szCs w:val="22"/>
         </w:rPr>
       </w:pPr>
     </w:p>
@@ -2541,7 +2673,9 @@
           <w:bottom w:val="single" w:sz="6" w:space="1" w:color="808080"/>
         </w:pBdr>
         <w:rPr>
-          <w:rFonts w:ascii="Bodoni MT" w:hAnsi="Bodoni MT"/>
+          <w:rFonts w:ascii="Arial" w:hAnsi="Arial" w:cs="Arial"/>
+          <w:sz w:val="22"/>
+          <w:szCs w:val="22"/>
         </w:rPr>
       </w:pPr>
     </w:p>
@@ -2552,7 +2686,9 @@
           <w:bottom w:val="single" w:sz="6" w:space="1" w:color="808080"/>
         </w:pBdr>
         <w:rPr>
-          <w:rFonts w:ascii="Bodoni MT" w:hAnsi="Bodoni MT"/>
+          <w:rFonts w:ascii="Arial" w:hAnsi="Arial" w:cs="Arial"/>
+          <w:sz w:val="22"/>
+          <w:szCs w:val="22"/>
         </w:rPr>
       </w:pPr>
     </w:p>
@@ -2563,7 +2699,9 @@
           <w:bottom w:val="single" w:sz="6" w:space="1" w:color="808080"/>
         </w:pBdr>
         <w:rPr>
-          <w:rFonts w:ascii="Bodoni MT" w:hAnsi="Bodoni MT"/>
+          <w:rFonts w:ascii="Arial" w:hAnsi="Arial" w:cs="Arial"/>
+          <w:sz w:val="22"/>
+          <w:szCs w:val="22"/>
         </w:rPr>
       </w:pPr>
     </w:p>
@@ -2574,7 +2712,9 @@
           <w:bottom w:val="single" w:sz="6" w:space="1" w:color="808080"/>
         </w:pBdr>
         <w:rPr>
-          <w:rFonts w:ascii="Bodoni MT" w:hAnsi="Bodoni MT"/>
+          <w:rFonts w:ascii="Arial" w:hAnsi="Arial" w:cs="Arial"/>
+          <w:sz w:val="22"/>
+          <w:szCs w:val="22"/>
         </w:rPr>
       </w:pPr>
     </w:p>
@@ -2585,7 +2725,9 @@
           <w:bottom w:val="single" w:sz="6" w:space="1" w:color="808080"/>
         </w:pBdr>
         <w:rPr>
-          <w:rFonts w:ascii="Bodoni MT" w:hAnsi="Bodoni MT"/>
+          <w:rFonts w:ascii="Arial" w:hAnsi="Arial" w:cs="Arial"/>
+          <w:sz w:val="22"/>
+          <w:szCs w:val="22"/>
         </w:rPr>
       </w:pPr>
     </w:p>
@@ -2596,7 +2738,9 @@
           <w:bottom w:val="single" w:sz="6" w:space="1" w:color="808080"/>
         </w:pBdr>
         <w:rPr>
-          <w:rFonts w:ascii="Bodoni MT" w:hAnsi="Bodoni MT"/>
+          <w:rFonts w:ascii="Arial" w:hAnsi="Arial" w:cs="Arial"/>
+          <w:sz w:val="22"/>
+          <w:szCs w:val="22"/>
         </w:rPr>
       </w:pPr>
     </w:p>
@@ -2607,7 +2751,9 @@
           <w:bottom w:val="single" w:sz="6" w:space="1" w:color="808080"/>
         </w:pBdr>
         <w:rPr>
-          <w:rFonts w:ascii="Bodoni MT" w:hAnsi="Bodoni MT"/>
+          <w:rFonts w:ascii="Arial" w:hAnsi="Arial" w:cs="Arial"/>
+          <w:sz w:val="22"/>
+          <w:szCs w:val="22"/>
         </w:rPr>
       </w:pPr>
     </w:p>
@@ -2618,7 +2764,9 @@
           <w:bottom w:val="single" w:sz="6" w:space="1" w:color="808080"/>
         </w:pBdr>
         <w:rPr>
-          <w:rFonts w:ascii="Bodoni MT" w:hAnsi="Bodoni MT"/>
+          <w:rFonts w:ascii="Arial" w:hAnsi="Arial" w:cs="Arial"/>
+          <w:sz w:val="22"/>
+          <w:szCs w:val="22"/>
         </w:rPr>
       </w:pPr>
     </w:p>
@@ -2629,7 +2777,9 @@
           <w:bottom w:val="single" w:sz="6" w:space="1" w:color="808080"/>
         </w:pBdr>
         <w:rPr>
-          <w:rFonts w:ascii="Bodoni MT" w:hAnsi="Bodoni MT"/>
+          <w:rFonts w:ascii="Arial" w:hAnsi="Arial" w:cs="Arial"/>
+          <w:sz w:val="22"/>
+          <w:szCs w:val="22"/>
         </w:rPr>
       </w:pPr>
     </w:p>
@@ -2640,7 +2790,9 @@
           <w:bottom w:val="single" w:sz="6" w:space="1" w:color="808080"/>
         </w:pBdr>
         <w:rPr>
-          <w:rFonts w:ascii="Bodoni MT" w:hAnsi="Bodoni MT"/>
+          <w:rFonts w:ascii="Arial" w:hAnsi="Arial" w:cs="Arial"/>
+          <w:sz w:val="22"/>
+          <w:szCs w:val="22"/>
         </w:rPr>
       </w:pPr>
     </w:p>
@@ -2651,7 +2803,9 @@
           <w:bottom w:val="single" w:sz="6" w:space="1" w:color="808080"/>
         </w:pBdr>
         <w:rPr>
-          <w:rFonts w:ascii="Bodoni MT" w:hAnsi="Bodoni MT"/>
+          <w:rFonts w:ascii="Arial" w:hAnsi="Arial" w:cs="Arial"/>
+          <w:sz w:val="22"/>
+          <w:szCs w:val="22"/>
         </w:rPr>
       </w:pPr>
     </w:p>
@@ -2660,20 +2814,20 @@
         <w:pStyle w:val="Titolo1"/>
         <w:keepNext/>
         <w:rPr>
-          <w:rFonts w:ascii="Bodoni MT" w:hAnsi="Bodoni MT"/>
+          <w:rFonts w:ascii="Arial" w:hAnsi="Arial" w:cs="Arial"/>
           <w:i/>
           <w:iCs/>
-          <w:sz w:val="24"/>
-          <w:szCs w:val="24"/>
+          <w:sz w:val="22"/>
+          <w:szCs w:val="22"/>
         </w:rPr>
       </w:pPr>
       <w:r>
         <w:rPr>
-          <w:rFonts w:ascii="Bodoni MT" w:hAnsi="Bodoni MT"/>
+          <w:rFonts w:ascii="Arial" w:hAnsi="Arial" w:cs="Arial"/>
           <w:i/>
           <w:iCs/>
-          <w:sz w:val="24"/>
-          <w:szCs w:val="24"/>
+          <w:sz w:val="22"/>
+          <w:szCs w:val="22"/>
         </w:rPr>
         <w:t xml:space="preserve">VERBALE DI PRESENZA, DATA E FIRMA</w:t>
       </w:r>
@@ -2681,14 +2835,14 @@
     <w:p>
       <w:pPr>
         <w:rPr>
-          <w:rFonts w:ascii="Bodoni MT" w:hAnsi="Bodoni MT"/>
+          <w:rFonts w:ascii="Arial" w:hAnsi="Arial" w:cs="Arial"/>
           <w:sz w:val="22"/>
           <w:szCs w:val="22"/>
         </w:rPr>
       </w:pPr>
       <w:r>
         <w:rPr>
-          <w:rFonts w:ascii="Bodoni MT" w:hAnsi="Bodoni MT"/>
+          <w:rFonts w:ascii="Arial" w:hAnsi="Arial" w:cs="Arial"/>
           <w:sz w:val="22"/>
           <w:szCs w:val="22"/>
         </w:rPr>
@@ -2699,7 +2853,7 @@
       <w:pPr>
         <w:spacing w:before="80" w:after="120"/>
         <w:rPr>
-          <w:rFonts w:ascii="Bodoni MT" w:hAnsi="Bodoni MT"/>
+          <w:rFonts w:ascii="Arial" w:hAnsi="Arial" w:cs="Arial"/>
           <w:i/>
           <w:iCs/>
           <w:sz w:val="22"/>
@@ -2708,7 +2862,7 @@
       </w:pPr>
       <w:r>
         <w:rPr>
-          <w:rFonts w:ascii="Bodoni MT" w:hAnsi="Bodoni MT"/>
+          <w:rFonts w:ascii="Arial" w:hAnsi="Arial" w:cs="Arial"/>
           <w:i/>
           <w:iCs/>
           <w:sz w:val="22"/>
@@ -2744,16 +2898,16 @@
           <w:p>
             <w:pPr>
               <w:rPr>
-                <w:rFonts w:ascii="Bodoni MT" w:hAnsi="Bodoni MT"/>
-                <w:b/>
-                <w:bCs/>
-              </w:rPr>
-            </w:pPr>
-            <w:r>
-              <w:rPr>
-                <w:rFonts w:ascii="Bodoni MT" w:hAnsi="Bodoni MT"/>
-                <w:b/>
-                <w:bCs/>
+                <w:rFonts w:ascii="Arial" w:hAnsi="Arial" w:cs="Arial"/>
+                <w:sz w:val="22"/>
+                <w:szCs w:val="22"/>
+              </w:rPr>
+            </w:pPr>
+            <w:r>
+              <w:rPr>
+                <w:rFonts w:ascii="Arial" w:hAnsi="Arial" w:cs="Arial"/>
+                <w:sz w:val="22"/>
+                <w:szCs w:val="22"/>
               </w:rPr>
               <w:t xml:space="preserve">Nome e Cognome</w:t>
             </w:r>
@@ -2768,16 +2922,16 @@
           <w:p>
             <w:pPr>
               <w:rPr>
-                <w:rFonts w:ascii="Bodoni MT" w:hAnsi="Bodoni MT"/>
-                <w:b/>
-                <w:bCs/>
-              </w:rPr>
-            </w:pPr>
-            <w:r>
-              <w:rPr>
-                <w:rFonts w:ascii="Bodoni MT" w:hAnsi="Bodoni MT"/>
-                <w:b/>
-                <w:bCs/>
+                <w:rFonts w:ascii="Arial" w:hAnsi="Arial" w:cs="Arial"/>
+                <w:sz w:val="22"/>
+                <w:szCs w:val="22"/>
+              </w:rPr>
+            </w:pPr>
+            <w:r>
+              <w:rPr>
+                <w:rFonts w:ascii="Arial" w:hAnsi="Arial" w:cs="Arial"/>
+                <w:sz w:val="22"/>
+                <w:szCs w:val="22"/>
               </w:rPr>
               <w:t xml:space="preserve">Parte (Concedente / Concessionario)</w:t>
             </w:r>
@@ -2792,16 +2946,16 @@
           <w:p>
             <w:pPr>
               <w:rPr>
-                <w:rFonts w:ascii="Bodoni MT" w:hAnsi="Bodoni MT"/>
-                <w:b/>
-                <w:bCs/>
-              </w:rPr>
-            </w:pPr>
-            <w:r>
-              <w:rPr>
-                <w:rFonts w:ascii="Bodoni MT" w:hAnsi="Bodoni MT"/>
-                <w:b/>
-                <w:bCs/>
+                <w:rFonts w:ascii="Arial" w:hAnsi="Arial" w:cs="Arial"/>
+                <w:sz w:val="22"/>
+                <w:szCs w:val="22"/>
+              </w:rPr>
+            </w:pPr>
+            <w:r>
+              <w:rPr>
+                <w:rFonts w:ascii="Arial" w:hAnsi="Arial" w:cs="Arial"/>
+                <w:sz w:val="22"/>
+                <w:szCs w:val="22"/>
               </w:rPr>
               <w:t xml:space="preserve">Data</w:t>
             </w:r>
@@ -2816,16 +2970,16 @@
           <w:p>
             <w:pPr>
               <w:rPr>
-                <w:rFonts w:ascii="Bodoni MT" w:hAnsi="Bodoni MT"/>
-                <w:b/>
-                <w:bCs/>
-              </w:rPr>
-            </w:pPr>
-            <w:r>
-              <w:rPr>
-                <w:rFonts w:ascii="Bodoni MT" w:hAnsi="Bodoni MT"/>
-                <w:b/>
-                <w:bCs/>
+                <w:rFonts w:ascii="Arial" w:hAnsi="Arial" w:cs="Arial"/>
+                <w:sz w:val="22"/>
+                <w:szCs w:val="22"/>
+              </w:rPr>
+            </w:pPr>
+            <w:r>
+              <w:rPr>
+                <w:rFonts w:ascii="Arial" w:hAnsi="Arial" w:cs="Arial"/>
+                <w:sz w:val="22"/>
+                <w:szCs w:val="22"/>
               </w:rPr>
               <w:t xml:space="preserve">Firma</w:t>
             </w:r>
@@ -2845,7 +2999,9 @@
           <w:p>
             <w:pPr>
               <w:rPr>
-                <w:rFonts w:ascii="Bodoni MT" w:hAnsi="Bodoni MT"/>
+                <w:rFonts w:ascii="Arial" w:hAnsi="Arial" w:cs="Arial"/>
+                <w:sz w:val="22"/>
+                <w:szCs w:val="22"/>
               </w:rPr>
             </w:pPr>
           </w:p>
@@ -2858,7 +3014,9 @@
           <w:p>
             <w:pPr>
               <w:rPr>
-                <w:rFonts w:ascii="Bodoni MT" w:hAnsi="Bodoni MT"/>
+                <w:rFonts w:ascii="Arial" w:hAnsi="Arial" w:cs="Arial"/>
+                <w:sz w:val="22"/>
+                <w:szCs w:val="22"/>
               </w:rPr>
             </w:pPr>
           </w:p>
@@ -2871,7 +3029,9 @@
           <w:p>
             <w:pPr>
               <w:rPr>
-                <w:rFonts w:ascii="Bodoni MT" w:hAnsi="Bodoni MT"/>
+                <w:rFonts w:ascii="Arial" w:hAnsi="Arial" w:cs="Arial"/>
+                <w:sz w:val="22"/>
+                <w:szCs w:val="22"/>
               </w:rPr>
             </w:pPr>
           </w:p>
@@ -2884,7 +3044,9 @@
           <w:p>
             <w:pPr>
               <w:rPr>
-                <w:rFonts w:ascii="Bodoni MT" w:hAnsi="Bodoni MT"/>
+                <w:rFonts w:ascii="Arial" w:hAnsi="Arial" w:cs="Arial"/>
+                <w:sz w:val="22"/>
+                <w:szCs w:val="22"/>
               </w:rPr>
             </w:pPr>
           </w:p>
@@ -2903,7 +3065,9 @@
           <w:p>
             <w:pPr>
               <w:rPr>
-                <w:rFonts w:ascii="Bodoni MT" w:hAnsi="Bodoni MT"/>
+                <w:rFonts w:ascii="Arial" w:hAnsi="Arial" w:cs="Arial"/>
+                <w:sz w:val="22"/>
+                <w:szCs w:val="22"/>
               </w:rPr>
             </w:pPr>
           </w:p>
@@ -2916,7 +3080,9 @@
           <w:p>
             <w:pPr>
               <w:rPr>
-                <w:rFonts w:ascii="Bodoni MT" w:hAnsi="Bodoni MT"/>
+                <w:rFonts w:ascii="Arial" w:hAnsi="Arial" w:cs="Arial"/>
+                <w:sz w:val="22"/>
+                <w:szCs w:val="22"/>
               </w:rPr>
             </w:pPr>
           </w:p>
@@ -2929,7 +3095,9 @@
           <w:p>
             <w:pPr>
               <w:rPr>
-                <w:rFonts w:ascii="Bodoni MT" w:hAnsi="Bodoni MT"/>
+                <w:rFonts w:ascii="Arial" w:hAnsi="Arial" w:cs="Arial"/>
+                <w:sz w:val="22"/>
+                <w:szCs w:val="22"/>
               </w:rPr>
             </w:pPr>
           </w:p>
@@ -2942,7 +3110,9 @@
           <w:p>
             <w:pPr>
               <w:rPr>
-                <w:rFonts w:ascii="Bodoni MT" w:hAnsi="Bodoni MT"/>
+                <w:rFonts w:ascii="Arial" w:hAnsi="Arial" w:cs="Arial"/>
+                <w:sz w:val="22"/>
+                <w:szCs w:val="22"/>
               </w:rPr>
             </w:pPr>
           </w:p>
@@ -2961,7 +3131,9 @@
           <w:p>
             <w:pPr>
               <w:rPr>
-                <w:rFonts w:ascii="Bodoni MT" w:hAnsi="Bodoni MT"/>
+                <w:rFonts w:ascii="Arial" w:hAnsi="Arial" w:cs="Arial"/>
+                <w:sz w:val="22"/>
+                <w:szCs w:val="22"/>
               </w:rPr>
             </w:pPr>
           </w:p>
@@ -2974,7 +3146,9 @@
           <w:p>
             <w:pPr>
               <w:rPr>
-                <w:rFonts w:ascii="Bodoni MT" w:hAnsi="Bodoni MT"/>
+                <w:rFonts w:ascii="Arial" w:hAnsi="Arial" w:cs="Arial"/>
+                <w:sz w:val="22"/>
+                <w:szCs w:val="22"/>
               </w:rPr>
             </w:pPr>
           </w:p>
@@ -2987,7 +3161,9 @@
           <w:p>
             <w:pPr>
               <w:rPr>
-                <w:rFonts w:ascii="Bodoni MT" w:hAnsi="Bodoni MT"/>
+                <w:rFonts w:ascii="Arial" w:hAnsi="Arial" w:cs="Arial"/>
+                <w:sz w:val="22"/>
+                <w:szCs w:val="22"/>
               </w:rPr>
             </w:pPr>
           </w:p>
@@ -3000,7 +3176,9 @@
           <w:p>
             <w:pPr>
               <w:rPr>
-                <w:rFonts w:ascii="Bodoni MT" w:hAnsi="Bodoni MT"/>
+                <w:rFonts w:ascii="Arial" w:hAnsi="Arial" w:cs="Arial"/>
+                <w:sz w:val="22"/>
+                <w:szCs w:val="22"/>
               </w:rPr>
             </w:pPr>
           </w:p>
@@ -3019,7 +3197,9 @@
           <w:p>
             <w:pPr>
               <w:rPr>
-                <w:rFonts w:ascii="Bodoni MT" w:hAnsi="Bodoni MT"/>
+                <w:rFonts w:ascii="Arial" w:hAnsi="Arial" w:cs="Arial"/>
+                <w:sz w:val="22"/>
+                <w:szCs w:val="22"/>
               </w:rPr>
             </w:pPr>
           </w:p>
@@ -3032,7 +3212,9 @@
           <w:p>
             <w:pPr>
               <w:rPr>
-                <w:rFonts w:ascii="Bodoni MT" w:hAnsi="Bodoni MT"/>
+                <w:rFonts w:ascii="Arial" w:hAnsi="Arial" w:cs="Arial"/>
+                <w:sz w:val="22"/>
+                <w:szCs w:val="22"/>
               </w:rPr>
             </w:pPr>
           </w:p>
@@ -3045,7 +3227,9 @@
           <w:p>
             <w:pPr>
               <w:rPr>
-                <w:rFonts w:ascii="Bodoni MT" w:hAnsi="Bodoni MT"/>
+                <w:rFonts w:ascii="Arial" w:hAnsi="Arial" w:cs="Arial"/>
+                <w:sz w:val="22"/>
+                <w:szCs w:val="22"/>
               </w:rPr>
             </w:pPr>
           </w:p>
@@ -3058,7 +3242,9 @@
           <w:p>
             <w:pPr>
               <w:rPr>
-                <w:rFonts w:ascii="Bodoni MT" w:hAnsi="Bodoni MT"/>
+                <w:rFonts w:ascii="Arial" w:hAnsi="Arial" w:cs="Arial"/>
+                <w:sz w:val="22"/>
+                <w:szCs w:val="22"/>
               </w:rPr>
             </w:pPr>
           </w:p>
@@ -3077,7 +3263,9 @@
           <w:p>
             <w:pPr>
               <w:rPr>
-                <w:rFonts w:ascii="Bodoni MT" w:hAnsi="Bodoni MT"/>
+                <w:rFonts w:ascii="Arial" w:hAnsi="Arial" w:cs="Arial"/>
+                <w:sz w:val="22"/>
+                <w:szCs w:val="22"/>
               </w:rPr>
             </w:pPr>
           </w:p>
@@ -3090,7 +3278,9 @@
           <w:p>
             <w:pPr>
               <w:rPr>
-                <w:rFonts w:ascii="Bodoni MT" w:hAnsi="Bodoni MT"/>
+                <w:rFonts w:ascii="Arial" w:hAnsi="Arial" w:cs="Arial"/>
+                <w:sz w:val="22"/>
+                <w:szCs w:val="22"/>
               </w:rPr>
             </w:pPr>
           </w:p>
@@ -3103,7 +3293,9 @@
           <w:p>
             <w:pPr>
               <w:rPr>
-                <w:rFonts w:ascii="Bodoni MT" w:hAnsi="Bodoni MT"/>
+                <w:rFonts w:ascii="Arial" w:hAnsi="Arial" w:cs="Arial"/>
+                <w:sz w:val="22"/>
+                <w:szCs w:val="22"/>
               </w:rPr>
             </w:pPr>
           </w:p>
@@ -3116,7 +3308,9 @@
           <w:p>
             <w:pPr>
               <w:rPr>
-                <w:rFonts w:ascii="Bodoni MT" w:hAnsi="Bodoni MT"/>
+                <w:rFonts w:ascii="Arial" w:hAnsi="Arial" w:cs="Arial"/>
+                <w:sz w:val="22"/>
+                <w:szCs w:val="22"/>
               </w:rPr>
             </w:pPr>
           </w:p>
@@ -3135,7 +3329,9 @@
           <w:p>
             <w:pPr>
               <w:rPr>
-                <w:rFonts w:ascii="Bodoni MT" w:hAnsi="Bodoni MT"/>
+                <w:rFonts w:ascii="Arial" w:hAnsi="Arial" w:cs="Arial"/>
+                <w:sz w:val="22"/>
+                <w:szCs w:val="22"/>
               </w:rPr>
             </w:pPr>
           </w:p>
@@ -3148,7 +3344,9 @@
           <w:p>
             <w:pPr>
               <w:rPr>
-                <w:rFonts w:ascii="Bodoni MT" w:hAnsi="Bodoni MT"/>
+                <w:rFonts w:ascii="Arial" w:hAnsi="Arial" w:cs="Arial"/>
+                <w:sz w:val="22"/>
+                <w:szCs w:val="22"/>
               </w:rPr>
             </w:pPr>
           </w:p>
@@ -3161,7 +3359,9 @@
           <w:p>
             <w:pPr>
               <w:rPr>
-                <w:rFonts w:ascii="Bodoni MT" w:hAnsi="Bodoni MT"/>
+                <w:rFonts w:ascii="Arial" w:hAnsi="Arial" w:cs="Arial"/>
+                <w:sz w:val="22"/>
+                <w:szCs w:val="22"/>
               </w:rPr>
             </w:pPr>
           </w:p>
@@ -3174,7 +3374,9 @@
           <w:p>
             <w:pPr>
               <w:rPr>
-                <w:rFonts w:ascii="Bodoni MT" w:hAnsi="Bodoni MT"/>
+                <w:rFonts w:ascii="Arial" w:hAnsi="Arial" w:cs="Arial"/>
+                <w:sz w:val="22"/>
+                <w:szCs w:val="22"/>
               </w:rPr>
             </w:pPr>
           </w:p>
@@ -3193,7 +3395,9 @@
           <w:p>
             <w:pPr>
               <w:rPr>
-                <w:rFonts w:ascii="Bodoni MT" w:hAnsi="Bodoni MT"/>
+                <w:rFonts w:ascii="Arial" w:hAnsi="Arial" w:cs="Arial"/>
+                <w:sz w:val="22"/>
+                <w:szCs w:val="22"/>
               </w:rPr>
             </w:pPr>
           </w:p>
@@ -3206,7 +3410,9 @@
           <w:p>
             <w:pPr>
               <w:rPr>
-                <w:rFonts w:ascii="Bodoni MT" w:hAnsi="Bodoni MT"/>
+                <w:rFonts w:ascii="Arial" w:hAnsi="Arial" w:cs="Arial"/>
+                <w:sz w:val="22"/>
+                <w:szCs w:val="22"/>
               </w:rPr>
             </w:pPr>
           </w:p>
@@ -3219,7 +3425,9 @@
           <w:p>
             <w:pPr>
               <w:rPr>
-                <w:rFonts w:ascii="Bodoni MT" w:hAnsi="Bodoni MT"/>
+                <w:rFonts w:ascii="Arial" w:hAnsi="Arial" w:cs="Arial"/>
+                <w:sz w:val="22"/>
+                <w:szCs w:val="22"/>
               </w:rPr>
             </w:pPr>
           </w:p>
@@ -3232,7 +3440,9 @@
           <w:p>
             <w:pPr>
               <w:rPr>
-                <w:rFonts w:ascii="Bodoni MT" w:hAnsi="Bodoni MT"/>
+                <w:rFonts w:ascii="Arial" w:hAnsi="Arial" w:cs="Arial"/>
+                <w:sz w:val="22"/>
+                <w:szCs w:val="22"/>
               </w:rPr>
             </w:pPr>
           </w:p>
@@ -3251,7 +3461,9 @@
           <w:p>
             <w:pPr>
               <w:rPr>
-                <w:rFonts w:ascii="Bodoni MT" w:hAnsi="Bodoni MT"/>
+                <w:rFonts w:ascii="Arial" w:hAnsi="Arial" w:cs="Arial"/>
+                <w:sz w:val="22"/>
+                <w:szCs w:val="22"/>
               </w:rPr>
             </w:pPr>
           </w:p>
@@ -3264,7 +3476,9 @@
           <w:p>
             <w:pPr>
               <w:rPr>
-                <w:rFonts w:ascii="Bodoni MT" w:hAnsi="Bodoni MT"/>
+                <w:rFonts w:ascii="Arial" w:hAnsi="Arial" w:cs="Arial"/>
+                <w:sz w:val="22"/>
+                <w:szCs w:val="22"/>
               </w:rPr>
             </w:pPr>
           </w:p>
@@ -3277,7 +3491,9 @@
           <w:p>
             <w:pPr>
               <w:rPr>
-                <w:rFonts w:ascii="Bodoni MT" w:hAnsi="Bodoni MT"/>
+                <w:rFonts w:ascii="Arial" w:hAnsi="Arial" w:cs="Arial"/>
+                <w:sz w:val="22"/>
+                <w:szCs w:val="22"/>
               </w:rPr>
             </w:pPr>
           </w:p>
@@ -3290,7 +3506,9 @@
           <w:p>
             <w:pPr>
               <w:rPr>
-                <w:rFonts w:ascii="Bodoni MT" w:hAnsi="Bodoni MT"/>
+                <w:rFonts w:ascii="Arial" w:hAnsi="Arial" w:cs="Arial"/>
+                <w:sz w:val="22"/>
+                <w:szCs w:val="22"/>
               </w:rPr>
             </w:pPr>
           </w:p>
@@ -3309,7 +3527,9 @@
           <w:p>
             <w:pPr>
               <w:rPr>
-                <w:rFonts w:ascii="Bodoni MT" w:hAnsi="Bodoni MT"/>
+                <w:rFonts w:ascii="Arial" w:hAnsi="Arial" w:cs="Arial"/>
+                <w:sz w:val="22"/>
+                <w:szCs w:val="22"/>
               </w:rPr>
             </w:pPr>
           </w:p>
@@ -3322,7 +3542,9 @@
           <w:p>
             <w:pPr>
               <w:rPr>
-                <w:rFonts w:ascii="Bodoni MT" w:hAnsi="Bodoni MT"/>
+                <w:rFonts w:ascii="Arial" w:hAnsi="Arial" w:cs="Arial"/>
+                <w:sz w:val="22"/>
+                <w:szCs w:val="22"/>
               </w:rPr>
             </w:pPr>
           </w:p>
@@ -3335,7 +3557,9 @@
           <w:p>
             <w:pPr>
               <w:rPr>
-                <w:rFonts w:ascii="Bodoni MT" w:hAnsi="Bodoni MT"/>
+                <w:rFonts w:ascii="Arial" w:hAnsi="Arial" w:cs="Arial"/>
+                <w:sz w:val="22"/>
+                <w:szCs w:val="22"/>
               </w:rPr>
             </w:pPr>
           </w:p>
@@ -3348,7 +3572,9 @@
           <w:p>
             <w:pPr>
               <w:rPr>
-                <w:rFonts w:ascii="Bodoni MT" w:hAnsi="Bodoni MT"/>
+                <w:rFonts w:ascii="Arial" w:hAnsi="Arial" w:cs="Arial"/>
+                <w:sz w:val="22"/>
+                <w:szCs w:val="22"/>
               </w:rPr>
             </w:pPr>
           </w:p>
@@ -3367,7 +3593,9 @@
           <w:p>
             <w:pPr>
               <w:rPr>
-                <w:rFonts w:ascii="Bodoni MT" w:hAnsi="Bodoni MT"/>
+                <w:rFonts w:ascii="Arial" w:hAnsi="Arial" w:cs="Arial"/>
+                <w:sz w:val="22"/>
+                <w:szCs w:val="22"/>
               </w:rPr>
             </w:pPr>
           </w:p>
@@ -3380,7 +3608,9 @@
           <w:p>
             <w:pPr>
               <w:rPr>
-                <w:rFonts w:ascii="Bodoni MT" w:hAnsi="Bodoni MT"/>
+                <w:rFonts w:ascii="Arial" w:hAnsi="Arial" w:cs="Arial"/>
+                <w:sz w:val="22"/>
+                <w:szCs w:val="22"/>
               </w:rPr>
             </w:pPr>
           </w:p>
@@ -3393,7 +3623,9 @@
           <w:p>
             <w:pPr>
               <w:rPr>
-                <w:rFonts w:ascii="Bodoni MT" w:hAnsi="Bodoni MT"/>
+                <w:rFonts w:ascii="Arial" w:hAnsi="Arial" w:cs="Arial"/>
+                <w:sz w:val="22"/>
+                <w:szCs w:val="22"/>
               </w:rPr>
             </w:pPr>
           </w:p>
@@ -3406,7 +3638,9 @@
           <w:p>
             <w:pPr>
               <w:rPr>
-                <w:rFonts w:ascii="Bodoni MT" w:hAnsi="Bodoni MT"/>
+                <w:rFonts w:ascii="Arial" w:hAnsi="Arial" w:cs="Arial"/>
+                <w:sz w:val="22"/>
+                <w:szCs w:val="22"/>
               </w:rPr>
             </w:pPr>
           </w:p>
@@ -3415,6 +3649,11 @@
     </w:tbl>
     <w:sectPr>
       <w:footerReference w:type="default" r:id="rId7"/>
+      <w:headerReference w:type="default" r:id="rId10"/>
+      <w:headerReference w:type="first" r:id="rId11"/>
+      <w:footerReference w:type="first" r:id="rId12"/>
+      <w:headerReference w:type="even" r:id="rId13"/>
+      <w:footerReference w:type="even" r:id="rId14"/>
       <w:pgSz w:w="11906" w:h="16838"/>
       <w:pgMar w:top="1417" w:right="1134" w:bottom="1134" w:left="1134" w:header="708" w:footer="708" w:gutter="0"/>
       <w:cols w:space="708"/>
@@ -3454,9 +3693,9 @@
   <w:sdt>
     <w:sdtPr>
       <w:rPr>
-        <w:rFonts w:ascii="Bodoni MT" w:hAnsi="Bodoni MT"/>
-        <w:sz w:val="20"/>
-        <w:szCs w:val="20"/>
+        <w:rFonts w:ascii="Arial" w:hAnsi="Arial" w:cs="Arial"/>
+        <w:sz w:val="22"/>
+        <w:szCs w:val="22"/>
       </w:rPr>
       <w:id w:val="1754623477"/>
       <w:docPartObj>
@@ -3469,9 +3708,9 @@
       <w:sdt>
         <w:sdtPr>
           <w:rPr>
-            <w:rFonts w:ascii="Bodoni MT" w:hAnsi="Bodoni MT"/>
-            <w:sz w:val="20"/>
-            <w:szCs w:val="20"/>
+            <w:rFonts w:ascii="Arial" w:hAnsi="Arial" w:cs="Arial"/>
+            <w:sz w:val="22"/>
+            <w:szCs w:val="22"/>
           </w:rPr>
           <w:id w:val="-1769616900"/>
           <w:docPartObj>
@@ -3486,124 +3725,104 @@
               <w:pStyle w:val="Pidipagina"/>
               <w:jc w:val="right"/>
               <w:rPr>
-                <w:rFonts w:ascii="Bodoni MT" w:hAnsi="Bodoni MT"/>
-                <w:sz w:val="20"/>
-                <w:szCs w:val="20"/>
-              </w:rPr>
-            </w:pPr>
-            <w:r>
-              <w:rPr>
-                <w:rFonts w:ascii="Bodoni MT" w:hAnsi="Bodoni MT"/>
-                <w:sz w:val="20"/>
-                <w:szCs w:val="20"/>
+                <w:rFonts w:ascii="Arial" w:hAnsi="Arial" w:cs="Arial"/>
+                <w:sz w:val="22"/>
+                <w:szCs w:val="22"/>
+              </w:rPr>
+            </w:pPr>
+            <w:r>
+              <w:rPr>
+                <w:rFonts w:ascii="Arial" w:hAnsi="Arial" w:cs="Arial"/>
+                <w:sz w:val="22"/>
+                <w:szCs w:val="22"/>
               </w:rPr>
               <w:t xml:space="preserve">Pag. </w:t>
             </w:r>
             <w:r>
               <w:rPr>
-                <w:rFonts w:ascii="Bodoni MT" w:hAnsi="Bodoni MT"/>
-                <w:b/>
-                <w:bCs/>
-                <w:sz w:val="20"/>
-                <w:szCs w:val="20"/>
+                <w:rFonts w:ascii="Arial" w:hAnsi="Arial" w:cs="Arial"/>
+                <w:sz w:val="22"/>
+                <w:szCs w:val="22"/>
               </w:rPr>
               <w:fldChar w:fldCharType="begin"/>
             </w:r>
             <w:r>
               <w:rPr>
-                <w:rFonts w:ascii="Bodoni MT" w:hAnsi="Bodoni MT"/>
-                <w:b/>
-                <w:bCs/>
-                <w:sz w:val="20"/>
-                <w:szCs w:val="20"/>
+                <w:rFonts w:ascii="Arial" w:hAnsi="Arial" w:cs="Arial"/>
+                <w:sz w:val="22"/>
+                <w:szCs w:val="22"/>
               </w:rPr>
               <w:instrText>PAGE</w:instrText>
             </w:r>
             <w:r>
               <w:rPr>
-                <w:rFonts w:ascii="Bodoni MT" w:hAnsi="Bodoni MT"/>
-                <w:b/>
-                <w:bCs/>
-                <w:sz w:val="20"/>
-                <w:szCs w:val="20"/>
+                <w:rFonts w:ascii="Arial" w:hAnsi="Arial" w:cs="Arial"/>
+                <w:sz w:val="22"/>
+                <w:szCs w:val="22"/>
               </w:rPr>
               <w:fldChar w:fldCharType="separate"/>
             </w:r>
             <w:r>
               <w:rPr>
-                <w:rFonts w:ascii="Bodoni MT" w:hAnsi="Bodoni MT"/>
-                <w:b/>
-                <w:bCs/>
-                <w:sz w:val="20"/>
-                <w:szCs w:val="20"/>
+                <w:rFonts w:ascii="Arial" w:hAnsi="Arial" w:cs="Arial"/>
+                <w:sz w:val="22"/>
+                <w:szCs w:val="22"/>
               </w:rPr>
               <w:t>2</w:t>
             </w:r>
             <w:r>
               <w:rPr>
-                <w:rFonts w:ascii="Bodoni MT" w:hAnsi="Bodoni MT"/>
-                <w:b/>
-                <w:bCs/>
-                <w:sz w:val="20"/>
-                <w:szCs w:val="20"/>
+                <w:rFonts w:ascii="Arial" w:hAnsi="Arial" w:cs="Arial"/>
+                <w:sz w:val="22"/>
+                <w:szCs w:val="22"/>
               </w:rPr>
               <w:fldChar w:fldCharType="end"/>
             </w:r>
             <w:r>
               <w:rPr>
-                <w:rFonts w:ascii="Bodoni MT" w:hAnsi="Bodoni MT"/>
-                <w:sz w:val="20"/>
-                <w:szCs w:val="20"/>
+                <w:rFonts w:ascii="Arial" w:hAnsi="Arial" w:cs="Arial"/>
+                <w:sz w:val="22"/>
+                <w:szCs w:val="22"/>
               </w:rPr>
               <w:t xml:space="preserve"> a </w:t>
             </w:r>
             <w:r>
               <w:rPr>
-                <w:rFonts w:ascii="Bodoni MT" w:hAnsi="Bodoni MT"/>
-                <w:b/>
-                <w:bCs/>
-                <w:sz w:val="20"/>
-                <w:szCs w:val="20"/>
+                <w:rFonts w:ascii="Arial" w:hAnsi="Arial" w:cs="Arial"/>
+                <w:sz w:val="22"/>
+                <w:szCs w:val="22"/>
               </w:rPr>
               <w:fldChar w:fldCharType="begin"/>
             </w:r>
             <w:r>
               <w:rPr>
-                <w:rFonts w:ascii="Bodoni MT" w:hAnsi="Bodoni MT"/>
-                <w:b/>
-                <w:bCs/>
-                <w:sz w:val="20"/>
-                <w:szCs w:val="20"/>
+                <w:rFonts w:ascii="Arial" w:hAnsi="Arial" w:cs="Arial"/>
+                <w:sz w:val="22"/>
+                <w:szCs w:val="22"/>
               </w:rPr>
               <w:instrText>NUMPAGES</w:instrText>
             </w:r>
             <w:r>
               <w:rPr>
-                <w:rFonts w:ascii="Bodoni MT" w:hAnsi="Bodoni MT"/>
-                <w:b/>
-                <w:bCs/>
-                <w:sz w:val="20"/>
-                <w:szCs w:val="20"/>
+                <w:rFonts w:ascii="Arial" w:hAnsi="Arial" w:cs="Arial"/>
+                <w:sz w:val="22"/>
+                <w:szCs w:val="22"/>
               </w:rPr>
               <w:fldChar w:fldCharType="separate"/>
             </w:r>
             <w:r>
               <w:rPr>
-                <w:rFonts w:ascii="Bodoni MT" w:hAnsi="Bodoni MT"/>
-                <w:b/>
-                <w:bCs/>
-                <w:sz w:val="20"/>
-                <w:szCs w:val="20"/>
+                <w:rFonts w:ascii="Arial" w:hAnsi="Arial" w:cs="Arial"/>
+                <w:sz w:val="22"/>
+                <w:szCs w:val="22"/>
               </w:rPr>
               <w:t>2</w:t>
             </w:r>
             <w:r>
               <w:rPr>
-                <w:rFonts w:ascii="Bodoni MT" w:hAnsi="Bodoni MT"/>
-                <w:b/>
-                <w:bCs/>
-                <w:sz w:val="20"/>
-                <w:szCs w:val="20"/>
+                <w:rFonts w:ascii="Arial" w:hAnsi="Arial" w:cs="Arial"/>
+                <w:sz w:val="22"/>
+                <w:szCs w:val="22"/>
               </w:rPr>
               <w:fldChar w:fldCharType="end"/>
             </w:r>
@@ -3620,6 +3839,26 @@
 </w:ftr>
 </file>
 
+<file path=word/footer2.xml><?xml version="1.0" encoding="utf-8"?>
+<w:ftr xmlns:m="http://schemas.openxmlformats.org/officeDocument/2006/math" xmlns:mc="http://schemas.openxmlformats.org/markup-compatibility/2006" xmlns:mo="http://schemas.microsoft.com/office/mac/office/2008/main" xmlns:mv="urn:schemas-microsoft-com:mac:vml" xmlns:o="urn:schemas-microsoft-com:office:office" xmlns:r="http://schemas.openxmlformats.org/officeDocument/2006/relationships" xmlns:v="urn:schemas-microsoft-com:vml" xmlns:w10="urn:schemas-microsoft-com:office:word" xmlns:w14="http://schemas.microsoft.com/office/word/2010/wordml" xmlns:w="http://schemas.openxmlformats.org/wordprocessingml/2006/main" xmlns:wne="http://schemas.microsoft.com/office/word/2006/wordml" xmlns:wp14="http://schemas.microsoft.com/office/word/2010/wordprocessingDrawing" xmlns:wp="http://schemas.openxmlformats.org/drawingml/2006/wordprocessingDrawing" xmlns:wpc="http://schemas.microsoft.com/office/word/2010/wordprocessingCanvas" xmlns:wpg="http://schemas.microsoft.com/office/word/2010/wordprocessingGroup" xmlns:wpi="http://schemas.microsoft.com/office/word/2010/wordprocessingInk" xmlns:wps="http://schemas.microsoft.com/office/word/2010/wordprocessingShape" mc:Ignorable="w14 wp14">
+  <w:p>
+    <w:pPr>
+      <w:pStyle w:val="Footer"/>
+    </w:pPr>
+  </w:p>
+</w:ftr>
+</file>
+
+<file path=word/footer3.xml><?xml version="1.0" encoding="utf-8"?>
+<w:ftr xmlns:m="http://schemas.openxmlformats.org/officeDocument/2006/math" xmlns:mc="http://schemas.openxmlformats.org/markup-compatibility/2006" xmlns:mo="http://schemas.microsoft.com/office/mac/office/2008/main" xmlns:mv="urn:schemas-microsoft-com:mac:vml" xmlns:o="urn:schemas-microsoft-com:office:office" xmlns:r="http://schemas.openxmlformats.org/officeDocument/2006/relationships" xmlns:v="urn:schemas-microsoft-com:vml" xmlns:w10="urn:schemas-microsoft-com:office:word" xmlns:w14="http://schemas.microsoft.com/office/word/2010/wordml" xmlns:w="http://schemas.openxmlformats.org/wordprocessingml/2006/main" xmlns:wne="http://schemas.microsoft.com/office/word/2006/wordml" xmlns:wp14="http://schemas.microsoft.com/office/word/2010/wordprocessingDrawing" xmlns:wp="http://schemas.openxmlformats.org/drawingml/2006/wordprocessingDrawing" xmlns:wpc="http://schemas.microsoft.com/office/word/2010/wordprocessingCanvas" xmlns:wpg="http://schemas.microsoft.com/office/word/2010/wordprocessingGroup" xmlns:wpi="http://schemas.microsoft.com/office/word/2010/wordprocessingInk" xmlns:wps="http://schemas.microsoft.com/office/word/2010/wordprocessingShape" mc:Ignorable="w14 wp14">
+  <w:p>
+    <w:pPr>
+      <w:pStyle w:val="Footer"/>
+    </w:pPr>
+  </w:p>
+</w:ftr>
+</file>
+
 <file path=word/footnotes.xml><?xml version="1.0" encoding="utf-8"?>
 <w:footnotes xmlns:wpc="http://schemas.microsoft.com/office/word/2010/wordprocessingCanvas" xmlns:cx="http://schemas.microsoft.com/office/drawing/2014/chartex" xmlns:cx1="http://schemas.microsoft.com/office/drawing/2015/9/8/chartex" xmlns:cx2="http://schemas.microsoft.com/office/drawing/2015/10/21/chartex" xmlns:cx3="http://schemas.microsoft.com/office/drawing/2016/5/9/chartex" xmlns:cx4="http://schemas.microsoft.com/office/drawing/2016/5/10/chartex" xmlns:cx5="http://schemas.microsoft.com/office/drawing/2016/5/11/chartex" xmlns:cx6="http://schemas.microsoft.com/office/drawing/2016/5/12/chartex" xmlns:cx7="http://schemas.microsoft.com/office/drawing/2016/5/13/chartex" xmlns:cx8="http://schemas.microsoft.com/office/drawing/2016/5/14/chartex" xmlns:mc="http://schemas.openxmlformats.org/markup-compatibility/2006" xmlns:aink="http://schemas.microsoft.com/office/drawing/2016/ink" xmlns:am3d="http://schemas.microsoft.com/office/drawing/2017/model3d" xmlns:o="urn:schemas-microsoft-com:office:office" xmlns:oel="http://schemas.microsoft.com/office/2019/extlst" xmlns:r="http://schemas.openxmlformats.org/officeDocument/2006/relationships" xmlns:m="http://schemas.openxmlformats.org/officeDocument/2006/math" xmlns:v="urn:schemas-microsoft-com:vml" xmlns:wp14="http://schemas.microsoft.com/office/word/2010/wordprocessingDrawing" xmlns:wp="http://schemas.openxmlformats.org/drawingml/2006/wordprocessingDrawing" xmlns:w10="urn:schemas-microsoft-com:office:word" xmlns:w="http://schemas.openxmlformats.org/wordprocessingml/2006/main" xmlns:w14="http://schemas.microsoft.com/office/word/2010/wordml" xmlns:w15="http://schemas.microsoft.com/office/word/2012/wordml" xmlns:w16cex="http://schemas.microsoft.com/office/word/2018/wordml/cex" xmlns:w16cid="http://schemas.microsoft.com/office/word/2016/wordml/cid" xmlns:w16="http://schemas.microsoft.com/office/word/2018/wordml" xmlns:w16du="http://schemas.microsoft.com/office/word/2023/wordml/word16du" xmlns:w16sdtdh="http://schemas.microsoft.com/office/word/2020/wordml/sdtdatahash" xmlns:w16sdtfl="http://schemas.microsoft.com/office/word/2024/wordml/sdtformatlock" xmlns:w16se="http://schemas.microsoft.com/office/word/2015/wordml/symex" xmlns:wpg="http://schemas.microsoft.com/office/word/2010/wordprocessingGroup" xmlns:wpi="http://schemas.microsoft.com/office/word/2010/wordprocessingInk" xmlns:wne="http://schemas.microsoft.com/office/word/2006/wordml" xmlns:wps="http://schemas.microsoft.com/office/word/2010/wordprocessingShape" mc:Ignorable="w14 w15 w16se w16cid w16 w16cex w16sdtdh w16sdtfl w16du wp14">
   <w:footnote w:type="separator" w:id="-1">
@@ -3643,6 +3882,36 @@
     </w:p>
   </w:footnote>
 </w:footnotes>
+</file>
+
+<file path=word/header1.xml><?xml version="1.0" encoding="utf-8"?>
+<w:hdr xmlns:m="http://schemas.openxmlformats.org/officeDocument/2006/math" xmlns:mc="http://schemas.openxmlformats.org/markup-compatibility/2006" xmlns:mo="http://schemas.microsoft.com/office/mac/office/2008/main" xmlns:mv="urn:schemas-microsoft-com:mac:vml" xmlns:o="urn:schemas-microsoft-com:office:office" xmlns:r="http://schemas.openxmlformats.org/officeDocument/2006/relationships" xmlns:v="urn:schemas-microsoft-com:vml" xmlns:w10="urn:schemas-microsoft-com:office:word" xmlns:w14="http://schemas.microsoft.com/office/word/2010/wordml" xmlns:w="http://schemas.openxmlformats.org/wordprocessingml/2006/main" xmlns:wne="http://schemas.microsoft.com/office/word/2006/wordml" xmlns:wp14="http://schemas.microsoft.com/office/word/2010/wordprocessingDrawing" xmlns:wp="http://schemas.openxmlformats.org/drawingml/2006/wordprocessingDrawing" xmlns:wpc="http://schemas.microsoft.com/office/word/2010/wordprocessingCanvas" xmlns:wpg="http://schemas.microsoft.com/office/word/2010/wordprocessingGroup" xmlns:wpi="http://schemas.microsoft.com/office/word/2010/wordprocessingInk" xmlns:wps="http://schemas.microsoft.com/office/word/2010/wordprocessingShape" mc:Ignorable="w14 wp14">
+  <w:p>
+    <w:pPr>
+      <w:pStyle w:val="Header"/>
+    </w:pPr>
+  </w:p>
+</w:hdr>
+</file>
+
+<file path=word/header2.xml><?xml version="1.0" encoding="utf-8"?>
+<w:hdr xmlns:m="http://schemas.openxmlformats.org/officeDocument/2006/math" xmlns:mc="http://schemas.openxmlformats.org/markup-compatibility/2006" xmlns:mo="http://schemas.microsoft.com/office/mac/office/2008/main" xmlns:mv="urn:schemas-microsoft-com:mac:vml" xmlns:o="urn:schemas-microsoft-com:office:office" xmlns:r="http://schemas.openxmlformats.org/officeDocument/2006/relationships" xmlns:v="urn:schemas-microsoft-com:vml" xmlns:w10="urn:schemas-microsoft-com:office:word" xmlns:w14="http://schemas.microsoft.com/office/word/2010/wordml" xmlns:w="http://schemas.openxmlformats.org/wordprocessingml/2006/main" xmlns:wne="http://schemas.microsoft.com/office/word/2006/wordml" xmlns:wp14="http://schemas.microsoft.com/office/word/2010/wordprocessingDrawing" xmlns:wp="http://schemas.openxmlformats.org/drawingml/2006/wordprocessingDrawing" xmlns:wpc="http://schemas.microsoft.com/office/word/2010/wordprocessingCanvas" xmlns:wpg="http://schemas.microsoft.com/office/word/2010/wordprocessingGroup" xmlns:wpi="http://schemas.microsoft.com/office/word/2010/wordprocessingInk" xmlns:wps="http://schemas.microsoft.com/office/word/2010/wordprocessingShape" mc:Ignorable="w14 wp14">
+  <w:p>
+    <w:pPr>
+      <w:pStyle w:val="Header"/>
+    </w:pPr>
+  </w:p>
+</w:hdr>
+</file>
+
+<file path=word/header3.xml><?xml version="1.0" encoding="utf-8"?>
+<w:hdr xmlns:m="http://schemas.openxmlformats.org/officeDocument/2006/math" xmlns:mc="http://schemas.openxmlformats.org/markup-compatibility/2006" xmlns:mo="http://schemas.microsoft.com/office/mac/office/2008/main" xmlns:mv="urn:schemas-microsoft-com:mac:vml" xmlns:o="urn:schemas-microsoft-com:office:office" xmlns:r="http://schemas.openxmlformats.org/officeDocument/2006/relationships" xmlns:v="urn:schemas-microsoft-com:vml" xmlns:w10="urn:schemas-microsoft-com:office:word" xmlns:w14="http://schemas.microsoft.com/office/word/2010/wordml" xmlns:w="http://schemas.openxmlformats.org/wordprocessingml/2006/main" xmlns:wne="http://schemas.microsoft.com/office/word/2006/wordml" xmlns:wp14="http://schemas.microsoft.com/office/word/2010/wordprocessingDrawing" xmlns:wp="http://schemas.openxmlformats.org/drawingml/2006/wordprocessingDrawing" xmlns:wpc="http://schemas.microsoft.com/office/word/2010/wordprocessingCanvas" xmlns:wpg="http://schemas.microsoft.com/office/word/2010/wordprocessingGroup" xmlns:wpi="http://schemas.microsoft.com/office/word/2010/wordprocessingInk" xmlns:wps="http://schemas.microsoft.com/office/word/2010/wordprocessingShape" mc:Ignorable="w14 wp14">
+  <w:p>
+    <w:pPr>
+      <w:pStyle w:val="Header"/>
+    </w:pPr>
+  </w:p>
+</w:hdr>
 </file>
 
 <file path=word/numbering.xml><?xml version="1.0" encoding="utf-8"?>
@@ -4095,10 +4364,10 @@
   <w:docDefaults>
     <w:rPrDefault>
       <w:rPr>
-        <w:rFonts w:asciiTheme="minorHAnsi" w:eastAsiaTheme="minorHAnsi" w:hAnsiTheme="minorHAnsi" w:cstheme="minorBidi"/>
+        <w:rFonts w:eastAsiaTheme="minorHAnsi" w:ascii="Arial" w:hAnsi="Arial" w:cs="Arial"/>
         <w:kern w:val="2"/>
-        <w:sz w:val="24"/>
-        <w:szCs w:val="24"/>
+        <w:sz w:val="22"/>
+        <w:szCs w:val="22"/>
         <w:lang w:val="it-IT" w:eastAsia="en-US" w:bidi="ar-SA"/>
         <w14:ligatures w14:val="standardContextual"/>
       </w:rPr>
@@ -4506,10 +4775,10 @@
       <w:outlineLvl w:val="0"/>
     </w:pPr>
     <w:rPr>
-      <w:rFonts w:asciiTheme="majorHAnsi" w:eastAsiaTheme="majorEastAsia" w:hAnsiTheme="majorHAnsi" w:cstheme="majorBidi"/>
+      <w:rFonts w:eastAsiaTheme="majorEastAsia" w:ascii="Arial" w:hAnsi="Arial" w:cs="Arial"/>
       <w:color w:val="2F5496" w:themeColor="accent1" w:themeShade="BF"/>
-      <w:sz w:val="40"/>
-      <w:szCs w:val="40"/>
+      <w:sz w:val="22"/>
+      <w:szCs w:val="22"/>
     </w:rPr>
   </w:style>
   <w:style w:type="paragraph" w:styleId="Titolo2">
@@ -4529,10 +4798,10 @@
       <w:outlineLvl w:val="1"/>
     </w:pPr>
     <w:rPr>
-      <w:rFonts w:asciiTheme="majorHAnsi" w:eastAsiaTheme="majorEastAsia" w:hAnsiTheme="majorHAnsi" w:cstheme="majorBidi"/>
+      <w:rFonts w:eastAsiaTheme="majorEastAsia" w:ascii="Arial" w:hAnsi="Arial" w:cs="Arial"/>
       <w:color w:val="2F5496" w:themeColor="accent1" w:themeShade="BF"/>
-      <w:sz w:val="32"/>
-      <w:szCs w:val="32"/>
+      <w:sz w:val="22"/>
+      <w:szCs w:val="22"/>
     </w:rPr>
   </w:style>
   <w:style w:type="paragraph" w:styleId="Titolo3">
@@ -4552,10 +4821,10 @@
       <w:outlineLvl w:val="2"/>
     </w:pPr>
     <w:rPr>
-      <w:rFonts w:eastAsiaTheme="majorEastAsia" w:cstheme="majorBidi"/>
+      <w:rFonts w:eastAsiaTheme="majorEastAsia" w:ascii="Arial" w:hAnsi="Arial" w:cs="Arial"/>
       <w:color w:val="2F5496" w:themeColor="accent1" w:themeShade="BF"/>
-      <w:sz w:val="28"/>
-      <w:szCs w:val="28"/>
+      <w:sz w:val="22"/>
+      <w:szCs w:val="22"/>
     </w:rPr>
   </w:style>
   <w:style w:type="paragraph" w:styleId="Titolo4">
@@ -4575,10 +4844,12 @@
       <w:outlineLvl w:val="3"/>
     </w:pPr>
     <w:rPr>
-      <w:rFonts w:eastAsiaTheme="majorEastAsia" w:cstheme="majorBidi"/>
+      <w:rFonts w:eastAsiaTheme="majorEastAsia" w:ascii="Arial" w:hAnsi="Arial" w:cs="Arial"/>
       <w:i/>
       <w:iCs/>
       <w:color w:val="2F5496" w:themeColor="accent1" w:themeShade="BF"/>
+      <w:sz w:val="22"/>
+      <w:szCs w:val="22"/>
     </w:rPr>
   </w:style>
   <w:style w:type="paragraph" w:styleId="Titolo5">
@@ -4598,8 +4869,10 @@
       <w:outlineLvl w:val="4"/>
     </w:pPr>
     <w:rPr>
-      <w:rFonts w:eastAsiaTheme="majorEastAsia" w:cstheme="majorBidi"/>
+      <w:rFonts w:eastAsiaTheme="majorEastAsia" w:ascii="Arial" w:hAnsi="Arial" w:cs="Arial"/>
       <w:color w:val="2F5496" w:themeColor="accent1" w:themeShade="BF"/>
+      <w:sz w:val="22"/>
+      <w:szCs w:val="22"/>
     </w:rPr>
   </w:style>
   <w:style w:type="paragraph" w:styleId="Titolo6">
@@ -4619,10 +4892,12 @@
       <w:outlineLvl w:val="5"/>
     </w:pPr>
     <w:rPr>
-      <w:rFonts w:eastAsiaTheme="majorEastAsia" w:cstheme="majorBidi"/>
+      <w:rFonts w:eastAsiaTheme="majorEastAsia" w:ascii="Arial" w:hAnsi="Arial" w:cs="Arial"/>
       <w:i/>
       <w:iCs/>
       <w:color w:val="595959" w:themeColor="text1" w:themeTint="A6"/>
+      <w:sz w:val="22"/>
+      <w:szCs w:val="22"/>
     </w:rPr>
   </w:style>
   <w:style w:type="paragraph" w:styleId="Titolo7">
@@ -4642,8 +4917,10 @@
       <w:outlineLvl w:val="6"/>
     </w:pPr>
     <w:rPr>
-      <w:rFonts w:eastAsiaTheme="majorEastAsia" w:cstheme="majorBidi"/>
+      <w:rFonts w:eastAsiaTheme="majorEastAsia" w:ascii="Arial" w:hAnsi="Arial" w:cs="Arial"/>
       <w:color w:val="595959" w:themeColor="text1" w:themeTint="A6"/>
+      <w:sz w:val="22"/>
+      <w:szCs w:val="22"/>
     </w:rPr>
   </w:style>
   <w:style w:type="paragraph" w:styleId="Titolo8">
@@ -4663,10 +4940,12 @@
       <w:outlineLvl w:val="7"/>
     </w:pPr>
     <w:rPr>
-      <w:rFonts w:eastAsiaTheme="majorEastAsia" w:cstheme="majorBidi"/>
+      <w:rFonts w:eastAsiaTheme="majorEastAsia" w:ascii="Arial" w:hAnsi="Arial" w:cs="Arial"/>
       <w:i/>
       <w:iCs/>
       <w:color w:val="272727" w:themeColor="text1" w:themeTint="D8"/>
+      <w:sz w:val="22"/>
+      <w:szCs w:val="22"/>
     </w:rPr>
   </w:style>
   <w:style w:type="paragraph" w:styleId="Titolo9">
@@ -4686,8 +4965,10 @@
       <w:outlineLvl w:val="8"/>
     </w:pPr>
     <w:rPr>
-      <w:rFonts w:eastAsiaTheme="majorEastAsia" w:cstheme="majorBidi"/>
+      <w:rFonts w:eastAsiaTheme="majorEastAsia" w:ascii="Arial" w:hAnsi="Arial" w:cs="Arial"/>
       <w:color w:val="272727" w:themeColor="text1" w:themeTint="D8"/>
+      <w:sz w:val="22"/>
+      <w:szCs w:val="22"/>
     </w:rPr>
   </w:style>
   <w:style w:type="character" w:default="1" w:styleId="Carpredefinitoparagrafo">
@@ -4724,10 +5005,10 @@
     <w:uiPriority w:val="9"/>
     <w:rsid w:val="00314FE8"/>
     <w:rPr>
-      <w:rFonts w:asciiTheme="majorHAnsi" w:eastAsiaTheme="majorEastAsia" w:hAnsiTheme="majorHAnsi" w:cstheme="majorBidi"/>
+      <w:rFonts w:eastAsiaTheme="majorEastAsia" w:ascii="Arial" w:hAnsi="Arial" w:cs="Arial"/>
       <w:color w:val="2F5496" w:themeColor="accent1" w:themeShade="BF"/>
-      <w:sz w:val="40"/>
-      <w:szCs w:val="40"/>
+      <w:sz w:val="22"/>
+      <w:szCs w:val="22"/>
     </w:rPr>
   </w:style>
   <w:style w:type="character" w:customStyle="1" w:styleId="Titolo2Carattere">
@@ -4738,10 +5019,10 @@
     <w:semiHidden/>
     <w:rsid w:val="00314FE8"/>
     <w:rPr>
-      <w:rFonts w:asciiTheme="majorHAnsi" w:eastAsiaTheme="majorEastAsia" w:hAnsiTheme="majorHAnsi" w:cstheme="majorBidi"/>
+      <w:rFonts w:eastAsiaTheme="majorEastAsia" w:ascii="Arial" w:hAnsi="Arial" w:cs="Arial"/>
       <w:color w:val="2F5496" w:themeColor="accent1" w:themeShade="BF"/>
-      <w:sz w:val="32"/>
-      <w:szCs w:val="32"/>
+      <w:sz w:val="22"/>
+      <w:szCs w:val="22"/>
     </w:rPr>
   </w:style>
   <w:style w:type="character" w:customStyle="1" w:styleId="Titolo3Carattere">
@@ -4752,10 +5033,10 @@
     <w:semiHidden/>
     <w:rsid w:val="00314FE8"/>
     <w:rPr>
-      <w:rFonts w:eastAsiaTheme="majorEastAsia" w:cstheme="majorBidi"/>
+      <w:rFonts w:eastAsiaTheme="majorEastAsia" w:ascii="Arial" w:hAnsi="Arial" w:cs="Arial"/>
       <w:color w:val="2F5496" w:themeColor="accent1" w:themeShade="BF"/>
-      <w:sz w:val="28"/>
-      <w:szCs w:val="28"/>
+      <w:sz w:val="22"/>
+      <w:szCs w:val="22"/>
     </w:rPr>
   </w:style>
   <w:style w:type="character" w:customStyle="1" w:styleId="Titolo4Carattere">
@@ -4766,10 +5047,12 @@
     <w:semiHidden/>
     <w:rsid w:val="00314FE8"/>
     <w:rPr>
-      <w:rFonts w:eastAsiaTheme="majorEastAsia" w:cstheme="majorBidi"/>
+      <w:rFonts w:eastAsiaTheme="majorEastAsia" w:ascii="Arial" w:hAnsi="Arial" w:cs="Arial"/>
       <w:i/>
       <w:iCs/>
       <w:color w:val="2F5496" w:themeColor="accent1" w:themeShade="BF"/>
+      <w:sz w:val="22"/>
+      <w:szCs w:val="22"/>
     </w:rPr>
   </w:style>
   <w:style w:type="character" w:customStyle="1" w:styleId="Titolo5Carattere">
@@ -4780,8 +5063,10 @@
     <w:semiHidden/>
     <w:rsid w:val="00314FE8"/>
     <w:rPr>
-      <w:rFonts w:eastAsiaTheme="majorEastAsia" w:cstheme="majorBidi"/>
+      <w:rFonts w:eastAsiaTheme="majorEastAsia" w:ascii="Arial" w:hAnsi="Arial" w:cs="Arial"/>
       <w:color w:val="2F5496" w:themeColor="accent1" w:themeShade="BF"/>
+      <w:sz w:val="22"/>
+      <w:szCs w:val="22"/>
     </w:rPr>
   </w:style>
   <w:style w:type="character" w:customStyle="1" w:styleId="Titolo6Carattere">
@@ -4792,10 +5077,12 @@
     <w:semiHidden/>
     <w:rsid w:val="00314FE8"/>
     <w:rPr>
-      <w:rFonts w:eastAsiaTheme="majorEastAsia" w:cstheme="majorBidi"/>
+      <w:rFonts w:eastAsiaTheme="majorEastAsia" w:ascii="Arial" w:hAnsi="Arial" w:cs="Arial"/>
       <w:i/>
       <w:iCs/>
       <w:color w:val="595959" w:themeColor="text1" w:themeTint="A6"/>
+      <w:sz w:val="22"/>
+      <w:szCs w:val="22"/>
     </w:rPr>
   </w:style>
   <w:style w:type="character" w:customStyle="1" w:styleId="Titolo7Carattere">
@@ -4806,8 +5093,10 @@
     <w:semiHidden/>
     <w:rsid w:val="00314FE8"/>
     <w:rPr>
-      <w:rFonts w:eastAsiaTheme="majorEastAsia" w:cstheme="majorBidi"/>
+      <w:rFonts w:eastAsiaTheme="majorEastAsia" w:ascii="Arial" w:hAnsi="Arial" w:cs="Arial"/>
       <w:color w:val="595959" w:themeColor="text1" w:themeTint="A6"/>
+      <w:sz w:val="22"/>
+      <w:szCs w:val="22"/>
     </w:rPr>
   </w:style>
   <w:style w:type="character" w:customStyle="1" w:styleId="Titolo8Carattere">
@@ -4818,10 +5107,12 @@
     <w:semiHidden/>
     <w:rsid w:val="00314FE8"/>
     <w:rPr>
-      <w:rFonts w:eastAsiaTheme="majorEastAsia" w:cstheme="majorBidi"/>
+      <w:rFonts w:eastAsiaTheme="majorEastAsia" w:ascii="Arial" w:hAnsi="Arial" w:cs="Arial"/>
       <w:i/>
       <w:iCs/>
       <w:color w:val="272727" w:themeColor="text1" w:themeTint="D8"/>
+      <w:sz w:val="22"/>
+      <w:szCs w:val="22"/>
     </w:rPr>
   </w:style>
   <w:style w:type="character" w:customStyle="1" w:styleId="Titolo9Carattere">
@@ -4832,8 +5123,10 @@
     <w:semiHidden/>
     <w:rsid w:val="00314FE8"/>
     <w:rPr>
-      <w:rFonts w:eastAsiaTheme="majorEastAsia" w:cstheme="majorBidi"/>
+      <w:rFonts w:eastAsiaTheme="majorEastAsia" w:ascii="Arial" w:hAnsi="Arial" w:cs="Arial"/>
       <w:color w:val="272727" w:themeColor="text1" w:themeTint="D8"/>
+      <w:sz w:val="22"/>
+      <w:szCs w:val="22"/>
     </w:rPr>
   </w:style>
   <w:style w:type="paragraph" w:styleId="Titolo">
@@ -4849,11 +5142,11 @@
       <w:contextualSpacing/>
     </w:pPr>
     <w:rPr>
-      <w:rFonts w:asciiTheme="majorHAnsi" w:eastAsiaTheme="majorEastAsia" w:hAnsiTheme="majorHAnsi" w:cstheme="majorBidi"/>
+      <w:rFonts w:eastAsiaTheme="majorEastAsia" w:ascii="Arial" w:hAnsi="Arial" w:cs="Arial"/>
       <w:spacing w:val="-10"/>
       <w:kern w:val="28"/>
-      <w:sz w:val="56"/>
-      <w:szCs w:val="56"/>
+      <w:sz w:val="22"/>
+      <w:szCs w:val="22"/>
     </w:rPr>
   </w:style>
   <w:style w:type="character" w:customStyle="1" w:styleId="TitoloCarattere">
@@ -4863,11 +5156,11 @@
     <w:uiPriority w:val="10"/>
     <w:rsid w:val="00314FE8"/>
     <w:rPr>
-      <w:rFonts w:asciiTheme="majorHAnsi" w:eastAsiaTheme="majorEastAsia" w:hAnsiTheme="majorHAnsi" w:cstheme="majorBidi"/>
+      <w:rFonts w:eastAsiaTheme="majorEastAsia" w:ascii="Arial" w:hAnsi="Arial" w:cs="Arial"/>
       <w:spacing w:val="-10"/>
       <w:kern w:val="28"/>
-      <w:sz w:val="56"/>
-      <w:szCs w:val="56"/>
+      <w:sz w:val="22"/>
+      <w:szCs w:val="22"/>
     </w:rPr>
   </w:style>
   <w:style w:type="paragraph" w:styleId="Sottotitolo">
@@ -4884,11 +5177,11 @@
       </w:numPr>
     </w:pPr>
     <w:rPr>
-      <w:rFonts w:eastAsiaTheme="majorEastAsia" w:cstheme="majorBidi"/>
+      <w:rFonts w:eastAsiaTheme="majorEastAsia" w:ascii="Arial" w:hAnsi="Arial" w:cs="Arial"/>
       <w:color w:val="595959" w:themeColor="text1" w:themeTint="A6"/>
       <w:spacing w:val="15"/>
-      <w:sz w:val="28"/>
-      <w:szCs w:val="28"/>
+      <w:sz w:val="22"/>
+      <w:szCs w:val="22"/>
     </w:rPr>
   </w:style>
   <w:style w:type="character" w:customStyle="1" w:styleId="SottotitoloCarattere">
@@ -4898,11 +5191,11 @@
     <w:link w:val="Sottotitolo"/>
     <w:rsid w:val="00314FE8"/>
     <w:rPr>
-      <w:rFonts w:eastAsiaTheme="majorEastAsia" w:cstheme="majorBidi"/>
+      <w:rFonts w:eastAsiaTheme="majorEastAsia" w:ascii="Arial" w:hAnsi="Arial" w:cs="Arial"/>
       <w:color w:val="595959" w:themeColor="text1" w:themeTint="A6"/>
       <w:spacing w:val="15"/>
-      <w:sz w:val="28"/>
-      <w:szCs w:val="28"/>
+      <w:sz w:val="22"/>
+      <w:szCs w:val="22"/>
     </w:rPr>
   </w:style>
   <w:style w:type="paragraph" w:styleId="Citazione">
@@ -4918,9 +5211,12 @@
       <w:jc w:val="center"/>
     </w:pPr>
     <w:rPr>
+      <w:rFonts w:ascii="Arial" w:hAnsi="Arial" w:cs="Arial"/>
       <w:i/>
       <w:iCs/>
       <w:color w:val="404040" w:themeColor="text1" w:themeTint="BF"/>
+      <w:sz w:val="22"/>
+      <w:szCs w:val="22"/>
     </w:rPr>
   </w:style>
   <w:style w:type="character" w:customStyle="1" w:styleId="CitazioneCarattere">
@@ -4930,9 +5226,12 @@
     <w:uiPriority w:val="29"/>
     <w:rsid w:val="00314FE8"/>
     <w:rPr>
+      <w:rFonts w:ascii="Arial" w:hAnsi="Arial" w:cs="Arial"/>
       <w:i/>
       <w:iCs/>
       <w:color w:val="404040" w:themeColor="text1" w:themeTint="BF"/>
+      <w:sz w:val="22"/>
+      <w:szCs w:val="22"/>
     </w:rPr>
   </w:style>
   <w:style w:type="paragraph" w:styleId="Paragrafoelenco">
@@ -4953,9 +5252,12 @@
     <w:qFormat/>
     <w:rsid w:val="00314FE8"/>
     <w:rPr>
+      <w:rFonts w:ascii="Arial" w:hAnsi="Arial" w:cs="Arial"/>
       <w:i/>
       <w:iCs/>
       <w:color w:val="2F5496" w:themeColor="accent1" w:themeShade="BF"/>
+      <w:sz w:val="22"/>
+      <w:szCs w:val="22"/>
     </w:rPr>
   </w:style>
   <w:style w:type="paragraph" w:styleId="Citazioneintensa">
@@ -4976,9 +5278,12 @@
       <w:jc w:val="center"/>
     </w:pPr>
     <w:rPr>
+      <w:rFonts w:ascii="Arial" w:hAnsi="Arial" w:cs="Arial"/>
       <w:i/>
       <w:iCs/>
       <w:color w:val="2F5496" w:themeColor="accent1" w:themeShade="BF"/>
+      <w:sz w:val="22"/>
+      <w:szCs w:val="22"/>
     </w:rPr>
   </w:style>
   <w:style w:type="character" w:customStyle="1" w:styleId="CitazioneintensaCarattere">
@@ -4988,9 +5293,12 @@
     <w:uiPriority w:val="30"/>
     <w:rsid w:val="00314FE8"/>
     <w:rPr>
+      <w:rFonts w:ascii="Arial" w:hAnsi="Arial" w:cs="Arial"/>
       <w:i/>
       <w:iCs/>
       <w:color w:val="2F5496" w:themeColor="accent1" w:themeShade="BF"/>
+      <w:sz w:val="22"/>
+      <w:szCs w:val="22"/>
     </w:rPr>
   </w:style>
   <w:style w:type="character" w:styleId="Riferimentointenso">
@@ -5000,11 +5308,12 @@
     <w:qFormat/>
     <w:rsid w:val="00314FE8"/>
     <w:rPr>
-      <w:b/>
-      <w:bCs/>
+      <w:rFonts w:ascii="Arial" w:hAnsi="Arial" w:cs="Arial"/>
       <w:smallCaps/>
       <w:color w:val="2F5496" w:themeColor="accent1" w:themeShade="BF"/>
       <w:spacing w:val="5"/>
+      <w:sz w:val="22"/>
+      <w:szCs w:val="22"/>
     </w:rPr>
   </w:style>
   <w:style w:type="paragraph" w:customStyle="1" w:styleId="Default">
@@ -5019,11 +5328,13 @@
       <w:spacing w:after="0" w:line="240" w:lineRule="auto"/>
     </w:pPr>
     <w:rPr>
-      <w:rFonts w:ascii="Times New Roman" w:eastAsia="Times New Roman" w:hAnsi="Times New Roman" w:cs="Times New Roman"/>
+      <w:rFonts w:ascii="Arial" w:eastAsia="Times New Roman" w:hAnsi="Arial" w:cs="Arial"/>
       <w:color w:val="000000"/>
       <w:kern w:val="0"/>
       <w:lang w:val="en-US"/>
       <w14:ligatures w14:val="none"/>
+      <w:sz w:val="22"/>
+      <w:szCs w:val="22"/>
     </w:rPr>
   </w:style>
   <w:style w:type="paragraph" w:customStyle="1" w:styleId="Titolo10">
@@ -5040,12 +5351,12 @@
       <w:ind w:left="1560" w:hanging="567"/>
     </w:pPr>
     <w:rPr>
-      <w:rFonts w:ascii="Times New Roman" w:eastAsia="Times New Roman" w:hAnsi="Times New Roman" w:cs="Times New Roman"/>
-      <w:b/>
-      <w:bCs/>
+      <w:rFonts w:ascii="Arial" w:eastAsia="Times New Roman" w:hAnsi="Arial" w:cs="Arial"/>
       <w:kern w:val="0"/>
       <w:lang w:val="en-GB"/>
       <w14:ligatures w14:val="none"/>
+      <w:sz w:val="22"/>
+      <w:szCs w:val="22"/>
     </w:rPr>
   </w:style>
   <w:style w:type="paragraph" w:styleId="Nessunaspaziatura">
@@ -5059,12 +5370,12 @@
       <w:ind w:left="2592" w:hanging="432"/>
     </w:pPr>
     <w:rPr>
-      <w:rFonts w:ascii="Times New Roman" w:eastAsia="Times New Roman" w:hAnsi="Times New Roman" w:cs="Times New Roman"/>
-      <w:b/>
+      <w:rFonts w:ascii="Arial" w:eastAsia="Times New Roman" w:hAnsi="Arial" w:cs="Arial"/>
       <w:kern w:val="0"/>
       <w:sz w:val="22"/>
       <w:lang w:val="en-GB" w:eastAsia="it-IT"/>
       <w14:ligatures w14:val="none"/>
+      <w:szCs w:val="22"/>
     </w:rPr>
   </w:style>
   <w:style w:type="character" w:customStyle="1" w:styleId="DefaultCarattere">
@@ -5073,11 +5384,13 @@
     <w:link w:val="Default"/>
     <w:rsid w:val="002C76BD"/>
     <w:rPr>
-      <w:rFonts w:ascii="Times New Roman" w:eastAsia="Times New Roman" w:hAnsi="Times New Roman" w:cs="Times New Roman"/>
+      <w:rFonts w:ascii="Arial" w:eastAsia="Times New Roman" w:hAnsi="Arial" w:cs="Arial"/>
       <w:color w:val="000000"/>
       <w:kern w:val="0"/>
       <w:lang w:val="en-US"/>
       <w14:ligatures w14:val="none"/>
+      <w:sz w:val="22"/>
+      <w:szCs w:val="22"/>
     </w:rPr>
   </w:style>
   <w:style w:type="table" w:styleId="Grigliatabella">
@@ -5109,12 +5422,10 @@
       <w:spacing w:after="0" w:line="240" w:lineRule="auto"/>
     </w:pPr>
     <w:rPr>
-      <w:rFonts w:ascii="Univers" w:eastAsia="Times New Roman" w:hAnsi="Univers" w:cs="Times New Roman"/>
-      <w:b/>
-      <w:bCs/>
+      <w:rFonts w:ascii="Arial" w:eastAsia="Times New Roman" w:hAnsi="Arial" w:cs="Arial"/>
       <w:kern w:val="0"/>
-      <w:sz w:val="20"/>
-      <w:szCs w:val="20"/>
+      <w:sz w:val="22"/>
+      <w:szCs w:val="22"/>
       <w:lang w:eastAsia="zh-CN"/>
       <w14:ligatures w14:val="none"/>
     </w:rPr>
@@ -5126,8 +5437,11 @@
     <w:unhideWhenUsed/>
     <w:rsid w:val="0087278A"/>
     <w:rPr>
+      <w:rFonts w:ascii="Arial" w:hAnsi="Arial" w:cs="Arial"/>
       <w:color w:val="0563C1" w:themeColor="hyperlink"/>
       <w:u w:val="single"/>
+      <w:sz w:val="22"/>
+      <w:szCs w:val="22"/>
     </w:rPr>
   </w:style>
   <w:style w:type="character" w:styleId="Menzionenonrisolta">
@@ -5138,8 +5452,11 @@
     <w:unhideWhenUsed/>
     <w:rsid w:val="0087278A"/>
     <w:rPr>
+      <w:rFonts w:ascii="Arial" w:hAnsi="Arial" w:cs="Arial"/>
       <w:color w:val="605E5C"/>
       <w:shd w:val="clear" w:color="auto" w:fill="E1DFDD"/>
+      <w:sz w:val="22"/>
+      <w:szCs w:val="22"/>
     </w:rPr>
   </w:style>
   <w:style w:type="paragraph" w:styleId="Intestazione">

</xml_diff>